<commit_message>
Informe Relativo a Comités: texto nuevo subrayado en la versión final
Co-Authored-By: Claude Opus 5.5 <noreply@anthropic.com>
Claude-Session: https://claude.ai/code/session_01TjsTNehkj163qWYSaVVmAn
</commit_message>
<xml_diff>
--- a/Informe_Relativo_a_Comites_2024_Version_Final.docx
+++ b/Informe_Relativo_a_Comites_2024_Version_Final.docx
@@ -26,6 +26,7 @@
       <w:r>
         <w:rPr>
           <w:noProof/>
+          <w:u w:val="none"/>
           <w:lang w:val="es-SV" w:eastAsia="es-SV"/>
         </w:rPr>
         <w:drawing>
@@ -223,6 +224,7 @@
           <w:rFonts w:ascii="Century Gothic" w:hAnsi="Century Gothic"/>
           <w:sz w:val="24"/>
           <w:szCs w:val="24"/>
+          <w:u w:val="none"/>
         </w:rPr>
         <w:tab/>
       </w:r>
@@ -295,6 +297,7 @@
           <w:noProof/>
           <w:sz w:val="24"/>
           <w:szCs w:val="24"/>
+          <w:u w:val="none"/>
           <w:lang w:val="es-SV" w:eastAsia="es-SV"/>
         </w:rPr>
         <mc:AlternateContent>
@@ -792,6 +795,7 @@
             <w:rPr>
               <w:sz w:val="24"/>
               <w:szCs w:val="24"/>
+              <w:u w:val="none"/>
             </w:rPr>
             <w:fldChar w:fldCharType="begin"/>
             <w:instrText xml:space="preserve"> TOC \o "1-3" \h \z \u </w:instrText>
@@ -802,12 +806,14 @@
               <w:rPr>
                 <w:rStyle w:val="Hipervnculo"/>
                 <w:rFonts w:eastAsia="Times New Roman"/>
+                <w:u w:val="none"/>
               </w:rPr>
               <w:t>INTRODUCCION</w:t>
             </w:r>
             <w:r>
               <w:rPr>
                 <w:webHidden/>
+                <w:u w:val="none"/>
               </w:rPr>
               <w:tab/>
               <w:fldChar w:fldCharType="begin"/>
@@ -831,6 +837,7 @@
               <w:rPr>
                 <w:rStyle w:val="Hipervnculo"/>
                 <w:b w:val="0"/>
+                <w:u w:val="none"/>
                 <w:lang w:val="es-ES_tradnl"/>
               </w:rPr>
               <w:t>1.</w:t>
@@ -838,6 +845,7 @@
             <w:r>
               <w:rPr>
                 <w:rFonts w:eastAsiaTheme="minorEastAsia"/>
+                <w:u w:val="none"/>
                 <w:lang w:val="es-SV" w:eastAsia="es-SV"/>
               </w:rPr>
               <w:tab/>
@@ -845,6 +853,7 @@
             <w:r>
               <w:rPr>
                 <w:rStyle w:val="Hipervnculo"/>
+                <w:u w:val="none"/>
                 <w:shd w:val="clear" w:color="auto" w:fill="FFFEFF"/>
                 <w:lang w:val="es-ES_tradnl"/>
               </w:rPr>
@@ -853,6 +862,7 @@
             <w:r>
               <w:rPr>
                 <w:webHidden/>
+                <w:u w:val="none"/>
               </w:rPr>
               <w:tab/>
               <w:fldChar w:fldCharType="begin"/>
@@ -882,6 +892,7 @@
                 <w:b w:val="0"/>
                 <w:sz w:val="23"/>
                 <w:szCs w:val="23"/>
+                <w:u w:val="none"/>
               </w:rPr>
               <w:t>1.1</w:t>
             </w:r>
@@ -892,6 +903,7 @@
                 <w:bCs w:val="0"/>
                 <w:sz w:val="23"/>
                 <w:szCs w:val="23"/>
+                <w:u w:val="none"/>
                 <w:lang w:val="es-SV" w:eastAsia="es-SV"/>
               </w:rPr>
               <w:tab/>
@@ -902,6 +914,7 @@
                 <w:b w:val="0"/>
                 <w:sz w:val="23"/>
                 <w:szCs w:val="23"/>
+                <w:u w:val="none"/>
               </w:rPr>
               <w:t>Objetivos</w:t>
             </w:r>
@@ -911,6 +924,7 @@
                 <w:webHidden/>
                 <w:sz w:val="23"/>
                 <w:szCs w:val="23"/>
+                <w:u w:val="none"/>
               </w:rPr>
               <w:tab/>
               <w:fldChar w:fldCharType="begin"/>
@@ -941,6 +955,7 @@
                 <w:b w:val="0"/>
                 <w:sz w:val="23"/>
                 <w:szCs w:val="23"/>
+                <w:u w:val="none"/>
               </w:rPr>
               <w:t>1.2</w:t>
             </w:r>
@@ -951,6 +966,7 @@
                 <w:bCs w:val="0"/>
                 <w:sz w:val="23"/>
                 <w:szCs w:val="23"/>
+                <w:u w:val="none"/>
                 <w:lang w:val="es-SV" w:eastAsia="es-SV"/>
               </w:rPr>
               <w:tab/>
@@ -962,6 +978,7 @@
                 <w:b w:val="0"/>
                 <w:sz w:val="23"/>
                 <w:szCs w:val="23"/>
+                <w:u w:val="none"/>
               </w:rPr>
               <w:t>Responsabilidades</w:t>
             </w:r>
@@ -971,6 +988,7 @@
                 <w:webHidden/>
                 <w:sz w:val="23"/>
                 <w:szCs w:val="23"/>
+                <w:u w:val="none"/>
               </w:rPr>
               <w:tab/>
               <w:fldChar w:fldCharType="begin"/>
@@ -1001,6 +1019,7 @@
                 <w:b w:val="0"/>
                 <w:sz w:val="23"/>
                 <w:szCs w:val="23"/>
+                <w:u w:val="none"/>
               </w:rPr>
               <w:t>1.3</w:t>
             </w:r>
@@ -1011,6 +1030,7 @@
                 <w:bCs w:val="0"/>
                 <w:sz w:val="23"/>
                 <w:szCs w:val="23"/>
+                <w:u w:val="none"/>
                 <w:lang w:val="es-SV" w:eastAsia="es-SV"/>
               </w:rPr>
               <w:tab/>
@@ -1022,6 +1042,7 @@
                 <w:b w:val="0"/>
                 <w:sz w:val="23"/>
                 <w:szCs w:val="23"/>
+                <w:u w:val="none"/>
               </w:rPr>
               <w:t>Conformación del Comité</w:t>
             </w:r>
@@ -1031,6 +1052,7 @@
                 <w:webHidden/>
                 <w:sz w:val="23"/>
                 <w:szCs w:val="23"/>
+                <w:u w:val="none"/>
               </w:rPr>
               <w:tab/>
               <w:fldChar w:fldCharType="begin"/>
@@ -1061,6 +1083,7 @@
                 <w:b w:val="0"/>
                 <w:sz w:val="23"/>
                 <w:szCs w:val="23"/>
+                <w:u w:val="none"/>
               </w:rPr>
               <w:t>1.4</w:t>
             </w:r>
@@ -1071,6 +1094,7 @@
                 <w:bCs w:val="0"/>
                 <w:sz w:val="23"/>
                 <w:szCs w:val="23"/>
+                <w:u w:val="none"/>
                 <w:lang w:val="es-SV" w:eastAsia="es-SV"/>
               </w:rPr>
               <w:tab/>
@@ -1082,6 +1106,7 @@
                 <w:b w:val="0"/>
                 <w:sz w:val="23"/>
                 <w:szCs w:val="23"/>
+                <w:u w:val="none"/>
               </w:rPr>
               <w:t>Frecuencia de Reuniones</w:t>
             </w:r>
@@ -1091,6 +1116,7 @@
                 <w:webHidden/>
                 <w:sz w:val="23"/>
                 <w:szCs w:val="23"/>
+                <w:u w:val="none"/>
               </w:rPr>
               <w:tab/>
               <w:t>7</w:t>
@@ -1110,6 +1136,7 @@
               <w:rPr>
                 <w:rStyle w:val="Hipervnculo"/>
                 <w:b w:val="0"/>
+                <w:u w:val="none"/>
                 <w:lang w:val="es-ES_tradnl"/>
               </w:rPr>
               <w:t>2.</w:t>
@@ -1117,6 +1144,7 @@
             <w:r>
               <w:rPr>
                 <w:rFonts w:eastAsiaTheme="minorEastAsia"/>
+                <w:u w:val="none"/>
                 <w:lang w:val="es-SV" w:eastAsia="es-SV"/>
               </w:rPr>
               <w:tab/>
@@ -1124,6 +1152,7 @@
             <w:r>
               <w:rPr>
                 <w:rStyle w:val="Hipervnculo"/>
+                <w:u w:val="none"/>
                 <w:shd w:val="clear" w:color="auto" w:fill="FFFEFF"/>
                 <w:lang w:val="es-ES_tradnl"/>
               </w:rPr>
@@ -1132,6 +1161,7 @@
             <w:r>
               <w:rPr>
                 <w:webHidden/>
+                <w:u w:val="none"/>
               </w:rPr>
               <w:tab/>
               <w:fldChar w:fldCharType="begin"/>
@@ -1162,6 +1192,7 @@
                 <w:b w:val="0"/>
                 <w:sz w:val="23"/>
                 <w:szCs w:val="23"/>
+                <w:u w:val="none"/>
               </w:rPr>
               <w:t>2.1</w:t>
             </w:r>
@@ -1172,6 +1203,7 @@
                 <w:bCs w:val="0"/>
                 <w:sz w:val="23"/>
                 <w:szCs w:val="23"/>
+                <w:u w:val="none"/>
                 <w:lang w:val="es-SV" w:eastAsia="es-SV"/>
               </w:rPr>
               <w:tab/>
@@ -1183,6 +1215,7 @@
                 <w:b w:val="0"/>
                 <w:sz w:val="23"/>
                 <w:szCs w:val="23"/>
+                <w:u w:val="none"/>
               </w:rPr>
               <w:t>Objetivos</w:t>
             </w:r>
@@ -1192,6 +1225,7 @@
                 <w:webHidden/>
                 <w:sz w:val="23"/>
                 <w:szCs w:val="23"/>
+                <w:u w:val="none"/>
               </w:rPr>
               <w:tab/>
               <w:fldChar w:fldCharType="begin"/>
@@ -1222,6 +1256,7 @@
                 <w:b w:val="0"/>
                 <w:sz w:val="23"/>
                 <w:szCs w:val="23"/>
+                <w:u w:val="none"/>
               </w:rPr>
               <w:t>2.2</w:t>
             </w:r>
@@ -1232,6 +1267,7 @@
                 <w:bCs w:val="0"/>
                 <w:sz w:val="23"/>
                 <w:szCs w:val="23"/>
+                <w:u w:val="none"/>
                 <w:lang w:val="es-SV" w:eastAsia="es-SV"/>
               </w:rPr>
               <w:tab/>
@@ -1243,6 +1279,7 @@
                 <w:b w:val="0"/>
                 <w:sz w:val="23"/>
                 <w:szCs w:val="23"/>
+                <w:u w:val="none"/>
               </w:rPr>
               <w:t>Responsabilidades</w:t>
             </w:r>
@@ -1252,6 +1289,7 @@
                 <w:webHidden/>
                 <w:sz w:val="23"/>
                 <w:szCs w:val="23"/>
+                <w:u w:val="none"/>
               </w:rPr>
               <w:tab/>
               <w:fldChar w:fldCharType="begin"/>
@@ -1282,6 +1320,7 @@
                 <w:b w:val="0"/>
                 <w:sz w:val="23"/>
                 <w:szCs w:val="23"/>
+                <w:u w:val="none"/>
               </w:rPr>
               <w:t>2.3</w:t>
             </w:r>
@@ -1292,6 +1331,7 @@
                 <w:bCs w:val="0"/>
                 <w:sz w:val="23"/>
                 <w:szCs w:val="23"/>
+                <w:u w:val="none"/>
                 <w:lang w:val="es-SV" w:eastAsia="es-SV"/>
               </w:rPr>
               <w:tab/>
@@ -1303,6 +1343,7 @@
                 <w:b w:val="0"/>
                 <w:sz w:val="23"/>
                 <w:szCs w:val="23"/>
+                <w:u w:val="none"/>
               </w:rPr>
               <w:t>Conformación del Comité</w:t>
             </w:r>
@@ -1312,6 +1353,7 @@
                 <w:webHidden/>
                 <w:sz w:val="23"/>
                 <w:szCs w:val="23"/>
+                <w:u w:val="none"/>
               </w:rPr>
               <w:tab/>
               <w:fldChar w:fldCharType="begin"/>
@@ -1335,6 +1377,7 @@
               <w:rPr>
                 <w:rStyle w:val="Hipervnculo"/>
                 <w:b w:val="0"/>
+                <w:u w:val="none"/>
                 <w:lang w:val="es-ES_tradnl"/>
               </w:rPr>
               <w:t>3.</w:t>
@@ -1342,6 +1385,7 @@
             <w:r>
               <w:rPr>
                 <w:rFonts w:eastAsiaTheme="minorEastAsia"/>
+                <w:u w:val="none"/>
                 <w:lang w:val="es-SV" w:eastAsia="es-SV"/>
               </w:rPr>
               <w:tab/>
@@ -1349,6 +1393,7 @@
             <w:r>
               <w:rPr>
                 <w:rStyle w:val="Hipervnculo"/>
+                <w:u w:val="none"/>
                 <w:shd w:val="clear" w:color="auto" w:fill="FFFEFF"/>
                 <w:lang w:val="es-ES_tradnl"/>
               </w:rPr>
@@ -1357,6 +1402,7 @@
             <w:r>
               <w:rPr>
                 <w:webHidden/>
+                <w:u w:val="none"/>
               </w:rPr>
               <w:tab/>
               <w:fldChar w:fldCharType="begin"/>
@@ -1386,6 +1432,7 @@
                 <w:b w:val="0"/>
                 <w:sz w:val="23"/>
                 <w:szCs w:val="23"/>
+                <w:u w:val="none"/>
                 <w:lang w:val="es-ES_tradnl"/>
               </w:rPr>
               <w:t>3.1</w:t>
@@ -1397,6 +1444,7 @@
                 <w:bCs w:val="0"/>
                 <w:sz w:val="23"/>
                 <w:szCs w:val="23"/>
+                <w:u w:val="none"/>
                 <w:lang w:val="es-SV" w:eastAsia="es-SV"/>
               </w:rPr>
               <w:tab/>
@@ -1407,6 +1455,7 @@
                 <w:b w:val="0"/>
                 <w:sz w:val="23"/>
                 <w:szCs w:val="23"/>
+                <w:u w:val="none"/>
                 <w:shd w:val="clear" w:color="auto" w:fill="FFFEFF"/>
                 <w:lang w:val="es-ES_tradnl"/>
               </w:rPr>
@@ -1418,6 +1467,7 @@
                 <w:webHidden/>
                 <w:sz w:val="23"/>
                 <w:szCs w:val="23"/>
+                <w:u w:val="none"/>
               </w:rPr>
               <w:tab/>
               <w:fldChar w:fldCharType="begin"/>
@@ -1448,6 +1498,7 @@
                 <w:b w:val="0"/>
                 <w:sz w:val="23"/>
                 <w:szCs w:val="23"/>
+                <w:u w:val="none"/>
               </w:rPr>
               <w:t>3.2</w:t>
             </w:r>
@@ -1458,6 +1509,7 @@
                 <w:bCs w:val="0"/>
                 <w:sz w:val="23"/>
                 <w:szCs w:val="23"/>
+                <w:u w:val="none"/>
                 <w:lang w:val="es-SV" w:eastAsia="es-SV"/>
               </w:rPr>
               <w:tab/>
@@ -1469,6 +1521,7 @@
                 <w:b w:val="0"/>
                 <w:sz w:val="23"/>
                 <w:szCs w:val="23"/>
+                <w:u w:val="none"/>
               </w:rPr>
               <w:t>Responsabilidades</w:t>
             </w:r>
@@ -1478,6 +1531,7 @@
                 <w:webHidden/>
                 <w:sz w:val="23"/>
                 <w:szCs w:val="23"/>
+                <w:u w:val="none"/>
               </w:rPr>
               <w:tab/>
               <w:fldChar w:fldCharType="begin"/>
@@ -1507,6 +1561,7 @@
                 <w:b w:val="0"/>
                 <w:sz w:val="23"/>
                 <w:szCs w:val="23"/>
+                <w:u w:val="none"/>
               </w:rPr>
               <w:t>3.3</w:t>
             </w:r>
@@ -1517,6 +1572,7 @@
                 <w:bCs w:val="0"/>
                 <w:sz w:val="23"/>
                 <w:szCs w:val="23"/>
+                <w:u w:val="none"/>
                 <w:lang w:val="es-SV" w:eastAsia="es-SV"/>
               </w:rPr>
               <w:tab/>
@@ -1527,6 +1583,7 @@
                 <w:b w:val="0"/>
                 <w:sz w:val="23"/>
                 <w:szCs w:val="23"/>
+                <w:u w:val="none"/>
               </w:rPr>
               <w:t>Conformación del Comité</w:t>
             </w:r>
@@ -1536,6 +1593,7 @@
                 <w:webHidden/>
                 <w:sz w:val="23"/>
                 <w:szCs w:val="23"/>
+                <w:u w:val="none"/>
               </w:rPr>
               <w:tab/>
               <w:fldChar w:fldCharType="begin"/>
@@ -1559,12 +1617,14 @@
               <w:rPr>
                 <w:rStyle w:val="Hipervnculo"/>
                 <w:b w:val="0"/>
+                <w:u w:val="none"/>
               </w:rPr>
               <w:t>4.</w:t>
             </w:r>
             <w:r>
               <w:rPr>
                 <w:rFonts w:eastAsiaTheme="minorEastAsia"/>
+                <w:u w:val="none"/>
                 <w:lang w:val="es-SV" w:eastAsia="es-SV"/>
               </w:rPr>
               <w:tab/>
@@ -1572,12 +1632,14 @@
             <w:r>
               <w:rPr>
                 <w:rStyle w:val="Hipervnculo"/>
+                <w:u w:val="none"/>
               </w:rPr>
               <w:t xml:space="preserve">COMITÉ DE FINANZAS</w:t>
             </w:r>
             <w:r>
               <w:rPr>
                 <w:webHidden/>
+                <w:u w:val="none"/>
               </w:rPr>
               <w:tab/>
               <w:fldChar w:fldCharType="begin"/>
@@ -1608,6 +1670,7 @@
                 <w:b w:val="0"/>
                 <w:sz w:val="23"/>
                 <w:szCs w:val="23"/>
+                <w:u w:val="none"/>
               </w:rPr>
               <w:t>4.1</w:t>
             </w:r>
@@ -1618,6 +1681,7 @@
                 <w:bCs w:val="0"/>
                 <w:sz w:val="23"/>
                 <w:szCs w:val="23"/>
+                <w:u w:val="none"/>
                 <w:lang w:val="es-SV" w:eastAsia="es-SV"/>
               </w:rPr>
               <w:tab/>
@@ -1629,6 +1693,7 @@
                 <w:b w:val="0"/>
                 <w:sz w:val="23"/>
                 <w:szCs w:val="23"/>
+                <w:u w:val="none"/>
               </w:rPr>
               <w:t>Objetivos</w:t>
             </w:r>
@@ -1638,6 +1703,7 @@
                 <w:webHidden/>
                 <w:sz w:val="23"/>
                 <w:szCs w:val="23"/>
+                <w:u w:val="none"/>
               </w:rPr>
               <w:tab/>
               <w:fldChar w:fldCharType="begin"/>
@@ -1667,6 +1733,7 @@
                 <w:b w:val="0"/>
                 <w:sz w:val="23"/>
                 <w:szCs w:val="23"/>
+                <w:u w:val="none"/>
               </w:rPr>
               <w:t>4.2</w:t>
             </w:r>
@@ -1677,6 +1744,7 @@
                 <w:bCs w:val="0"/>
                 <w:sz w:val="23"/>
                 <w:szCs w:val="23"/>
+                <w:u w:val="none"/>
                 <w:lang w:val="es-SV" w:eastAsia="es-SV"/>
               </w:rPr>
               <w:tab/>
@@ -1687,6 +1755,7 @@
                 <w:b w:val="0"/>
                 <w:sz w:val="23"/>
                 <w:szCs w:val="23"/>
+                <w:u w:val="none"/>
               </w:rPr>
               <w:t>Responsabilidades</w:t>
             </w:r>
@@ -1696,6 +1765,7 @@
                 <w:webHidden/>
                 <w:sz w:val="23"/>
                 <w:szCs w:val="23"/>
+                <w:u w:val="none"/>
               </w:rPr>
               <w:tab/>
               <w:fldChar w:fldCharType="begin"/>
@@ -1725,6 +1795,7 @@
                 <w:b w:val="0"/>
                 <w:sz w:val="23"/>
                 <w:szCs w:val="23"/>
+                <w:u w:val="none"/>
               </w:rPr>
               <w:t>4.3</w:t>
             </w:r>
@@ -1735,6 +1806,7 @@
                 <w:bCs w:val="0"/>
                 <w:sz w:val="23"/>
                 <w:szCs w:val="23"/>
+                <w:u w:val="none"/>
                 <w:lang w:val="es-SV" w:eastAsia="es-SV"/>
               </w:rPr>
               <w:tab/>
@@ -1745,6 +1817,7 @@
                 <w:b w:val="0"/>
                 <w:sz w:val="23"/>
                 <w:szCs w:val="23"/>
+                <w:u w:val="none"/>
               </w:rPr>
               <w:t>Conformación del Comité</w:t>
             </w:r>
@@ -1754,6 +1827,7 @@
                 <w:webHidden/>
                 <w:sz w:val="23"/>
                 <w:szCs w:val="23"/>
+                <w:u w:val="none"/>
               </w:rPr>
               <w:tab/>
               <w:fldChar w:fldCharType="begin"/>
@@ -1783,6 +1857,7 @@
                 <w:b w:val="0"/>
                 <w:sz w:val="23"/>
                 <w:szCs w:val="23"/>
+                <w:u w:val="none"/>
               </w:rPr>
               <w:t>4.4</w:t>
             </w:r>
@@ -1793,6 +1868,7 @@
                 <w:bCs w:val="0"/>
                 <w:sz w:val="23"/>
                 <w:szCs w:val="23"/>
+                <w:u w:val="none"/>
                 <w:lang w:val="es-SV" w:eastAsia="es-SV"/>
               </w:rPr>
               <w:tab/>
@@ -1803,6 +1879,7 @@
                 <w:b w:val="0"/>
                 <w:sz w:val="23"/>
                 <w:szCs w:val="23"/>
+                <w:u w:val="none"/>
               </w:rPr>
               <w:t>Frecuencia de Reuniones</w:t>
             </w:r>
@@ -1812,6 +1889,7 @@
                 <w:webHidden/>
                 <w:sz w:val="23"/>
                 <w:szCs w:val="23"/>
+                <w:u w:val="none"/>
               </w:rPr>
               <w:tab/>
               <w:fldChar w:fldCharType="begin"/>
@@ -1835,6 +1913,7 @@
               <w:rPr>
                 <w:rStyle w:val="Hipervnculo"/>
                 <w:b w:val="0"/>
+                <w:u w:val="none"/>
                 <w:lang w:val="es-ES_tradnl"/>
               </w:rPr>
               <w:t>5.</w:t>
@@ -1842,6 +1921,7 @@
             <w:r>
               <w:rPr>
                 <w:rFonts w:eastAsiaTheme="minorEastAsia"/>
+                <w:u w:val="none"/>
                 <w:lang w:val="es-SV" w:eastAsia="es-SV"/>
               </w:rPr>
               <w:tab/>
@@ -1849,6 +1929,7 @@
             <w:r>
               <w:rPr>
                 <w:rStyle w:val="Hipervnculo"/>
+                <w:u w:val="none"/>
                 <w:shd w:val="clear" w:color="auto" w:fill="FFFEFF"/>
                 <w:lang w:val="es-ES_tradnl"/>
               </w:rPr>
@@ -1857,6 +1938,7 @@
             <w:r>
               <w:rPr>
                 <w:webHidden/>
+                <w:u w:val="none"/>
               </w:rPr>
               <w:tab/>
               <w:fldChar w:fldCharType="begin"/>
@@ -1886,6 +1968,7 @@
                 <w:b w:val="0"/>
                 <w:sz w:val="23"/>
                 <w:szCs w:val="23"/>
+                <w:u w:val="none"/>
               </w:rPr>
               <w:t>5.1</w:t>
             </w:r>
@@ -1896,6 +1979,7 @@
                 <w:bCs w:val="0"/>
                 <w:sz w:val="23"/>
                 <w:szCs w:val="23"/>
+                <w:u w:val="none"/>
                 <w:lang w:val="es-SV" w:eastAsia="es-SV"/>
               </w:rPr>
               <w:tab/>
@@ -1906,6 +1990,7 @@
                 <w:b w:val="0"/>
                 <w:sz w:val="23"/>
                 <w:szCs w:val="23"/>
+                <w:u w:val="none"/>
               </w:rPr>
               <w:t>Objetivos</w:t>
             </w:r>
@@ -1915,6 +2000,7 @@
                 <w:webHidden/>
                 <w:sz w:val="23"/>
                 <w:szCs w:val="23"/>
+                <w:u w:val="none"/>
               </w:rPr>
               <w:tab/>
               <w:fldChar w:fldCharType="begin"/>
@@ -1953,6 +2039,7 @@
                 <w:b w:val="0"/>
                 <w:sz w:val="23"/>
                 <w:szCs w:val="23"/>
+                <w:u w:val="none"/>
               </w:rPr>
               <w:t>5.2</w:t>
             </w:r>
@@ -1963,6 +2050,7 @@
                 <w:bCs w:val="0"/>
                 <w:sz w:val="23"/>
                 <w:szCs w:val="23"/>
+                <w:u w:val="none"/>
                 <w:lang w:val="es-SV" w:eastAsia="es-SV"/>
               </w:rPr>
               <w:tab/>
@@ -1973,6 +2061,7 @@
                 <w:b w:val="0"/>
                 <w:sz w:val="23"/>
                 <w:szCs w:val="23"/>
+                <w:u w:val="none"/>
               </w:rPr>
               <w:t>Responsabilidades</w:t>
             </w:r>
@@ -1982,6 +2071,7 @@
                 <w:webHidden/>
                 <w:sz w:val="23"/>
                 <w:szCs w:val="23"/>
+                <w:u w:val="none"/>
               </w:rPr>
               <w:tab/>
               <w:fldChar w:fldCharType="begin"/>
@@ -2011,6 +2101,7 @@
                 <w:b w:val="0"/>
                 <w:sz w:val="23"/>
                 <w:szCs w:val="23"/>
+                <w:u w:val="none"/>
                 <w:lang w:val="es-ES_tradnl"/>
               </w:rPr>
               <w:t>5.3</w:t>
@@ -2022,6 +2113,7 @@
                 <w:bCs w:val="0"/>
                 <w:sz w:val="23"/>
                 <w:szCs w:val="23"/>
+                <w:u w:val="none"/>
                 <w:lang w:val="es-SV" w:eastAsia="es-SV"/>
               </w:rPr>
               <w:tab/>
@@ -2032,6 +2124,7 @@
                 <w:b w:val="0"/>
                 <w:sz w:val="23"/>
                 <w:szCs w:val="23"/>
+                <w:u w:val="none"/>
                 <w:shd w:val="clear" w:color="auto" w:fill="FFFEFF"/>
                 <w:lang w:val="es-ES_tradnl"/>
               </w:rPr>
@@ -2043,6 +2136,7 @@
                 <w:webHidden/>
                 <w:sz w:val="23"/>
                 <w:szCs w:val="23"/>
+                <w:u w:val="none"/>
               </w:rPr>
               <w:tab/>
               <w:fldChar w:fldCharType="begin"/>
@@ -2081,6 +2175,7 @@
                 <w:b w:val="0"/>
                 <w:sz w:val="23"/>
                 <w:szCs w:val="23"/>
+                <w:u w:val="none"/>
               </w:rPr>
               <w:t>5.4</w:t>
             </w:r>
@@ -2091,6 +2186,7 @@
                 <w:bCs w:val="0"/>
                 <w:sz w:val="23"/>
                 <w:szCs w:val="23"/>
+                <w:u w:val="none"/>
                 <w:lang w:val="es-SV" w:eastAsia="es-SV"/>
               </w:rPr>
               <w:tab/>
@@ -2101,6 +2197,7 @@
                 <w:b w:val="0"/>
                 <w:sz w:val="23"/>
                 <w:szCs w:val="23"/>
+                <w:u w:val="none"/>
               </w:rPr>
               <w:t>Frecuencia de Reuniones</w:t>
             </w:r>
@@ -2110,6 +2207,7 @@
                 <w:webHidden/>
                 <w:sz w:val="23"/>
                 <w:szCs w:val="23"/>
+                <w:u w:val="none"/>
               </w:rPr>
               <w:tab/>
               <w:fldChar w:fldCharType="begin"/>
@@ -2142,6 +2240,7 @@
               <w:rPr>
                 <w:rStyle w:val="Hipervnculo"/>
                 <w:b w:val="0"/>
+                <w:u w:val="none"/>
                 <w:lang w:val="es-ES_tradnl"/>
               </w:rPr>
               <w:t>6.</w:t>
@@ -2149,6 +2248,7 @@
             <w:r>
               <w:rPr>
                 <w:rFonts w:eastAsiaTheme="minorEastAsia"/>
+                <w:u w:val="none"/>
                 <w:lang w:val="es-SV" w:eastAsia="es-SV"/>
               </w:rPr>
               <w:tab/>
@@ -2156,6 +2256,7 @@
             <w:r>
               <w:rPr>
                 <w:rStyle w:val="Hipervnculo"/>
+                <w:u w:val="none"/>
                 <w:shd w:val="clear" w:color="auto" w:fill="FFFEFF"/>
                 <w:lang w:val="es-ES_tradnl"/>
               </w:rPr>
@@ -2164,6 +2265,7 @@
             <w:r>
               <w:rPr>
                 <w:rStyle w:val="Hipervnculo"/>
+                <w:u w:val="none"/>
                 <w:shd w:val="clear" w:color="auto" w:fill="FFFEFF"/>
                 <w:lang w:val="es-ES_tradnl"/>
               </w:rPr>
@@ -2172,6 +2274,7 @@
             <w:r>
               <w:rPr>
                 <w:rStyle w:val="Hipervnculo"/>
+                <w:u w:val="none"/>
                 <w:shd w:val="clear" w:color="auto" w:fill="FFFEFF"/>
                 <w:lang w:val="es-ES_tradnl"/>
               </w:rPr>
@@ -2180,6 +2283,7 @@
             <w:r>
               <w:rPr>
                 <w:webHidden/>
+                <w:u w:val="none"/>
               </w:rPr>
               <w:tab/>
               <w:fldChar w:fldCharType="begin"/>
@@ -2209,6 +2313,7 @@
                 <w:b w:val="0"/>
                 <w:sz w:val="23"/>
                 <w:szCs w:val="23"/>
+                <w:u w:val="none"/>
               </w:rPr>
               <w:t>6.1</w:t>
             </w:r>
@@ -2219,6 +2324,7 @@
                 <w:bCs w:val="0"/>
                 <w:sz w:val="23"/>
                 <w:szCs w:val="23"/>
+                <w:u w:val="none"/>
                 <w:lang w:val="es-SV" w:eastAsia="es-SV"/>
               </w:rPr>
               <w:tab/>
@@ -2229,6 +2335,7 @@
                 <w:b w:val="0"/>
                 <w:sz w:val="23"/>
                 <w:szCs w:val="23"/>
+                <w:u w:val="none"/>
               </w:rPr>
               <w:t>Objetivos</w:t>
             </w:r>
@@ -2238,6 +2345,7 @@
                 <w:webHidden/>
                 <w:sz w:val="23"/>
                 <w:szCs w:val="23"/>
+                <w:u w:val="none"/>
               </w:rPr>
               <w:tab/>
               <w:fldChar w:fldCharType="begin"/>
@@ -2267,6 +2375,7 @@
                 <w:b w:val="0"/>
                 <w:sz w:val="23"/>
                 <w:szCs w:val="23"/>
+                <w:u w:val="none"/>
               </w:rPr>
               <w:t>6.2</w:t>
             </w:r>
@@ -2277,6 +2386,7 @@
                 <w:bCs w:val="0"/>
                 <w:sz w:val="23"/>
                 <w:szCs w:val="23"/>
+                <w:u w:val="none"/>
                 <w:lang w:val="es-SV" w:eastAsia="es-SV"/>
               </w:rPr>
               <w:tab/>
@@ -2287,6 +2397,7 @@
                 <w:b w:val="0"/>
                 <w:sz w:val="23"/>
                 <w:szCs w:val="23"/>
+                <w:u w:val="none"/>
               </w:rPr>
               <w:t>Responsabilidades</w:t>
             </w:r>
@@ -2296,6 +2407,7 @@
                 <w:webHidden/>
                 <w:sz w:val="23"/>
                 <w:szCs w:val="23"/>
+                <w:u w:val="none"/>
               </w:rPr>
               <w:tab/>
               <w:fldChar w:fldCharType="begin"/>
@@ -2325,6 +2437,7 @@
                 <w:b w:val="0"/>
                 <w:sz w:val="23"/>
                 <w:szCs w:val="23"/>
+                <w:u w:val="none"/>
               </w:rPr>
               <w:t>6.3</w:t>
             </w:r>
@@ -2335,6 +2448,7 @@
                 <w:bCs w:val="0"/>
                 <w:sz w:val="23"/>
                 <w:szCs w:val="23"/>
+                <w:u w:val="none"/>
                 <w:lang w:val="es-SV" w:eastAsia="es-SV"/>
               </w:rPr>
               <w:tab/>
@@ -2345,6 +2459,7 @@
                 <w:b w:val="0"/>
                 <w:sz w:val="23"/>
                 <w:szCs w:val="23"/>
+                <w:u w:val="none"/>
               </w:rPr>
               <w:t>Conformación del Comité</w:t>
             </w:r>
@@ -2354,6 +2469,7 @@
                 <w:webHidden/>
                 <w:sz w:val="23"/>
                 <w:szCs w:val="23"/>
+                <w:u w:val="none"/>
               </w:rPr>
               <w:tab/>
               <w:fldChar w:fldCharType="begin"/>
@@ -2392,6 +2508,7 @@
                 <w:b w:val="0"/>
                 <w:sz w:val="23"/>
                 <w:szCs w:val="23"/>
+                <w:u w:val="none"/>
               </w:rPr>
               <w:t>6.4</w:t>
             </w:r>
@@ -2402,6 +2519,7 @@
                 <w:bCs w:val="0"/>
                 <w:sz w:val="23"/>
                 <w:szCs w:val="23"/>
+                <w:u w:val="none"/>
                 <w:lang w:val="es-SV" w:eastAsia="es-SV"/>
               </w:rPr>
               <w:tab/>
@@ -2412,6 +2530,7 @@
                 <w:b w:val="0"/>
                 <w:sz w:val="23"/>
                 <w:szCs w:val="23"/>
+                <w:u w:val="none"/>
               </w:rPr>
               <w:t>Frecuencia de Reuniones</w:t>
             </w:r>
@@ -2421,6 +2540,7 @@
                 <w:webHidden/>
                 <w:sz w:val="23"/>
                 <w:szCs w:val="23"/>
+                <w:u w:val="none"/>
               </w:rPr>
               <w:tab/>
               <w:fldChar w:fldCharType="begin"/>
@@ -2444,6 +2564,7 @@
               <w:rPr>
                 <w:rStyle w:val="Hipervnculo"/>
                 <w:b w:val="0"/>
+                <w:u w:val="none"/>
                 <w:lang w:val="es-SV"/>
               </w:rPr>
               <w:t>7.</w:t>
@@ -2451,6 +2572,7 @@
             <w:r>
               <w:rPr>
                 <w:rFonts w:eastAsiaTheme="minorEastAsia"/>
+                <w:u w:val="none"/>
                 <w:lang w:val="es-SV" w:eastAsia="es-SV"/>
               </w:rPr>
               <w:tab/>
@@ -2458,6 +2580,7 @@
             <w:r>
               <w:rPr>
                 <w:rStyle w:val="Hipervnculo"/>
+                <w:u w:val="none"/>
                 <w:lang w:val="es-SV"/>
               </w:rPr>
               <w:t xml:space="preserve">COMITÉ DE </w:t>
@@ -2467,6 +2590,7 @@
                 <w:color w:val="000000" w:themeColor="text1"/>
                 <w:sz w:val="24"/>
                 <w:szCs w:val="24"/>
+                <w:u w:val="none"/>
               </w:rPr>
               <w:t xml:space="preserve"/>
             </w:r>
@@ -2484,6 +2608,7 @@
                 <w:color w:val="000000" w:themeColor="text1"/>
                 <w:sz w:val="24"/>
                 <w:szCs w:val="24"/>
+                <w:u w:val="none"/>
               </w:rPr>
               <w:t xml:space="preserve"> PREVENCIÓN </w:t>
             </w:r>
@@ -2499,6 +2624,7 @@
             <w:r>
               <w:rPr>
                 <w:rStyle w:val="Hipervnculo"/>
+                <w:u w:val="none"/>
                 <w:lang w:val="es-SV"/>
               </w:rPr>
               <w:t xml:space="preserve"> </w:t>
@@ -2506,6 +2632,7 @@
             <w:r>
               <w:rPr>
                 <w:webHidden/>
+                <w:u w:val="none"/>
               </w:rPr>
               <w:tab/>
               <w:fldChar w:fldCharType="begin"/>
@@ -2535,6 +2662,7 @@
                 <w:b w:val="0"/>
                 <w:sz w:val="23"/>
                 <w:szCs w:val="23"/>
+                <w:u w:val="none"/>
               </w:rPr>
               <w:t>7.1</w:t>
             </w:r>
@@ -2545,6 +2673,7 @@
                 <w:bCs w:val="0"/>
                 <w:sz w:val="23"/>
                 <w:szCs w:val="23"/>
+                <w:u w:val="none"/>
                 <w:lang w:val="es-SV" w:eastAsia="es-SV"/>
               </w:rPr>
               <w:tab/>
@@ -2555,6 +2684,7 @@
                 <w:b w:val="0"/>
                 <w:sz w:val="23"/>
                 <w:szCs w:val="23"/>
+                <w:u w:val="none"/>
               </w:rPr>
               <w:t>Objetivos</w:t>
             </w:r>
@@ -2564,6 +2694,7 @@
                 <w:webHidden/>
                 <w:sz w:val="23"/>
                 <w:szCs w:val="23"/>
+                <w:u w:val="none"/>
               </w:rPr>
               <w:tab/>
               <w:fldChar w:fldCharType="begin"/>
@@ -2602,6 +2733,7 @@
                 <w:b w:val="0"/>
                 <w:sz w:val="23"/>
                 <w:szCs w:val="23"/>
+                <w:u w:val="none"/>
               </w:rPr>
               <w:t>7.2</w:t>
             </w:r>
@@ -2612,6 +2744,7 @@
                 <w:bCs w:val="0"/>
                 <w:sz w:val="23"/>
                 <w:szCs w:val="23"/>
+                <w:u w:val="none"/>
                 <w:lang w:val="es-SV" w:eastAsia="es-SV"/>
               </w:rPr>
               <w:tab/>
@@ -2622,6 +2755,7 @@
                 <w:b w:val="0"/>
                 <w:sz w:val="23"/>
                 <w:szCs w:val="23"/>
+                <w:u w:val="none"/>
               </w:rPr>
               <w:t>Responsabilidades</w:t>
             </w:r>
@@ -2631,6 +2765,7 @@
                 <w:webHidden/>
                 <w:sz w:val="23"/>
                 <w:szCs w:val="23"/>
+                <w:u w:val="none"/>
               </w:rPr>
               <w:tab/>
               <w:fldChar w:fldCharType="begin"/>
@@ -2670,6 +2805,7 @@
                 <w:b w:val="0"/>
                 <w:sz w:val="23"/>
                 <w:szCs w:val="23"/>
+                <w:u w:val="none"/>
               </w:rPr>
               <w:t>7.3</w:t>
             </w:r>
@@ -2680,6 +2816,7 @@
                 <w:bCs w:val="0"/>
                 <w:sz w:val="23"/>
                 <w:szCs w:val="23"/>
+                <w:u w:val="none"/>
                 <w:lang w:val="es-SV" w:eastAsia="es-SV"/>
               </w:rPr>
               <w:tab/>
@@ -2691,6 +2828,7 @@
                 <w:b w:val="0"/>
                 <w:sz w:val="23"/>
                 <w:szCs w:val="23"/>
+                <w:u w:val="none"/>
               </w:rPr>
               <w:t>Conformación del Comité</w:t>
             </w:r>
@@ -2700,6 +2838,7 @@
                 <w:webHidden/>
                 <w:sz w:val="23"/>
                 <w:szCs w:val="23"/>
+                <w:u w:val="none"/>
               </w:rPr>
               <w:tab/>
               <w:fldChar w:fldCharType="begin"/>
@@ -2730,6 +2869,7 @@
                 <w:b w:val="0"/>
                 <w:sz w:val="23"/>
                 <w:szCs w:val="23"/>
+                <w:u w:val="none"/>
               </w:rPr>
               <w:t>7.4</w:t>
             </w:r>
@@ -2740,6 +2880,7 @@
                 <w:bCs w:val="0"/>
                 <w:sz w:val="23"/>
                 <w:szCs w:val="23"/>
+                <w:u w:val="none"/>
                 <w:lang w:val="es-SV" w:eastAsia="es-SV"/>
               </w:rPr>
               <w:tab/>
@@ -2751,6 +2892,7 @@
                 <w:b w:val="0"/>
                 <w:sz w:val="23"/>
                 <w:szCs w:val="23"/>
+                <w:u w:val="none"/>
               </w:rPr>
               <w:t>Frecuencia de Reuniones</w:t>
             </w:r>
@@ -2760,6 +2902,7 @@
                 <w:webHidden/>
                 <w:sz w:val="23"/>
                 <w:szCs w:val="23"/>
+                <w:u w:val="none"/>
               </w:rPr>
               <w:tab/>
               <w:fldChar w:fldCharType="begin"/>
@@ -2782,6 +2925,7 @@
             <w:r>
               <w:rPr>
                 <w:rStyle w:val="Hipervnculo"/>
+                <w:u w:val="none"/>
               </w:rPr>
               <w:t>8</w:t>
             </w:r>
@@ -2789,12 +2933,14 @@
               <w:rPr>
                 <w:rStyle w:val="Hipervnculo"/>
                 <w:b w:val="0"/>
+                <w:u w:val="none"/>
               </w:rPr>
               <w:t>.</w:t>
             </w:r>
             <w:r>
               <w:rPr>
                 <w:rFonts w:eastAsiaTheme="minorEastAsia"/>
+                <w:u w:val="none"/>
                 <w:lang w:val="es-SV" w:eastAsia="es-SV"/>
               </w:rPr>
               <w:tab/>
@@ -2802,12 +2948,14 @@
             <w:r>
               <w:rPr>
                 <w:rStyle w:val="Hipervnculo"/>
+                <w:u w:val="none"/>
               </w:rPr>
               <w:t>COMITÉ DEL FONDO DE SOLIDARIDAD</w:t>
             </w:r>
             <w:r>
               <w:rPr>
                 <w:webHidden/>
+                <w:u w:val="none"/>
               </w:rPr>
               <w:tab/>
               <w:fldChar w:fldCharType="begin"/>
@@ -2837,6 +2985,7 @@
                 <w:b w:val="0"/>
                 <w:sz w:val="23"/>
                 <w:szCs w:val="23"/>
+                <w:u w:val="none"/>
               </w:rPr>
               <w:t>8.1</w:t>
             </w:r>
@@ -2847,6 +2996,7 @@
                 <w:bCs w:val="0"/>
                 <w:sz w:val="23"/>
                 <w:szCs w:val="23"/>
+                <w:u w:val="none"/>
                 <w:lang w:val="es-SV" w:eastAsia="es-SV"/>
               </w:rPr>
               <w:tab/>
@@ -2857,6 +3007,7 @@
                 <w:b w:val="0"/>
                 <w:sz w:val="23"/>
                 <w:szCs w:val="23"/>
+                <w:u w:val="none"/>
               </w:rPr>
               <w:t>Objetivos</w:t>
             </w:r>
@@ -2866,6 +3017,7 @@
                 <w:webHidden/>
                 <w:sz w:val="23"/>
                 <w:szCs w:val="23"/>
+                <w:u w:val="none"/>
               </w:rPr>
               <w:tab/>
               <w:fldChar w:fldCharType="begin"/>
@@ -2895,6 +3047,7 @@
                 <w:b w:val="0"/>
                 <w:sz w:val="23"/>
                 <w:szCs w:val="23"/>
+                <w:u w:val="none"/>
               </w:rPr>
               <w:t>8.2</w:t>
             </w:r>
@@ -2905,6 +3058,7 @@
                 <w:bCs w:val="0"/>
                 <w:sz w:val="23"/>
                 <w:szCs w:val="23"/>
+                <w:u w:val="none"/>
                 <w:lang w:val="es-SV" w:eastAsia="es-SV"/>
               </w:rPr>
               <w:tab/>
@@ -2915,6 +3069,7 @@
                 <w:b w:val="0"/>
                 <w:sz w:val="23"/>
                 <w:szCs w:val="23"/>
+                <w:u w:val="none"/>
               </w:rPr>
               <w:t>Responsabilidades</w:t>
             </w:r>
@@ -2924,6 +3079,7 @@
                 <w:webHidden/>
                 <w:sz w:val="23"/>
                 <w:szCs w:val="23"/>
+                <w:u w:val="none"/>
               </w:rPr>
               <w:tab/>
               <w:t>18</w:t>
@@ -2949,6 +3105,7 @@
                 <w:b w:val="0"/>
                 <w:sz w:val="23"/>
                 <w:szCs w:val="23"/>
+                <w:u w:val="none"/>
               </w:rPr>
               <w:t>8.3</w:t>
             </w:r>
@@ -2959,6 +3116,7 @@
                 <w:bCs w:val="0"/>
                 <w:sz w:val="23"/>
                 <w:szCs w:val="23"/>
+                <w:u w:val="none"/>
                 <w:lang w:val="es-SV" w:eastAsia="es-SV"/>
               </w:rPr>
               <w:tab/>
@@ -2969,6 +3127,7 @@
                 <w:b w:val="0"/>
                 <w:sz w:val="23"/>
                 <w:szCs w:val="23"/>
+                <w:u w:val="none"/>
               </w:rPr>
               <w:t>Conformación del Comité</w:t>
             </w:r>
@@ -2978,6 +3137,7 @@
                 <w:webHidden/>
                 <w:sz w:val="23"/>
                 <w:szCs w:val="23"/>
+                <w:u w:val="none"/>
               </w:rPr>
               <w:tab/>
               <w:t>20</w:t>
@@ -2995,6 +3155,7 @@
                 <w:b w:val="0"/>
                 <w:sz w:val="23"/>
                 <w:szCs w:val="23"/>
+                <w:u w:val="none"/>
               </w:rPr>
               <w:t>8.4</w:t>
             </w:r>
@@ -3005,6 +3166,7 @@
                 <w:bCs w:val="0"/>
                 <w:sz w:val="23"/>
                 <w:szCs w:val="23"/>
+                <w:u w:val="none"/>
                 <w:lang w:val="es-SV" w:eastAsia="es-SV"/>
               </w:rPr>
               <w:tab/>
@@ -3015,6 +3177,7 @@
                 <w:b w:val="0"/>
                 <w:sz w:val="23"/>
                 <w:szCs w:val="23"/>
+                <w:u w:val="none"/>
               </w:rPr>
               <w:t>Frecuencia de Reuniones</w:t>
             </w:r>
@@ -3024,6 +3187,7 @@
                 <w:webHidden/>
                 <w:sz w:val="23"/>
                 <w:szCs w:val="23"/>
+                <w:u w:val="none"/>
               </w:rPr>
               <w:tab/>
             </w:r>
@@ -3031,6 +3195,7 @@
           <w:r>
             <w:rPr>
               <w:bCs w:val="0"/>
+              <w:u w:val="none"/>
             </w:rPr>
             <w:fldChar w:fldCharType="end"/>
           </w:r>
@@ -3270,7 +3435,7 @@
           <w:color w:val="000000" w:themeColor="text1"/>
           <w:sz w:val="24"/>
           <w:szCs w:val="24"/>
-          <w:u w:val="none"/>
+          <w:u w:val="single"/>
         </w:rPr>
         <w:t xml:space="preserve">DE R.L.</w:t>
       </w:r>
@@ -3294,7 +3459,7 @@
           <w:color w:val="000000" w:themeColor="text1"/>
           <w:sz w:val="24"/>
           <w:szCs w:val="24"/>
-          <w:u w:val="none"/>
+          <w:u w:val="single"/>
         </w:rPr>
         <w:t xml:space="preserve">DE R.L.</w:t>
       </w:r>
@@ -3882,7 +4047,7 @@
           <w:color w:val="000000" w:themeColor="text1"/>
           <w:sz w:val="24"/>
           <w:szCs w:val="24"/>
-          <w:u w:val="none"/>
+          <w:u w:val="single"/>
           <w:shd w:val="clear" w:color="auto" w:fill="FFFEFF"/>
         </w:rPr>
         <w:t>y dar resolución</w:t>
@@ -4028,7 +4193,7 @@
           <w:color w:val="000000" w:themeColor="text1"/>
           <w:sz w:val="24"/>
           <w:szCs w:val="24"/>
-          <w:u w:val="none"/>
+          <w:u w:val="single"/>
           <w:shd w:val="clear" w:color="auto" w:fill="FFFEFF"/>
         </w:rPr>
         <w:t>, con el objetivo de mantener el buen crecimiento de la Cartera de Créditos y de Tarjeta</w:t>
@@ -4042,7 +4207,7 @@
           <w:color w:val="000000" w:themeColor="text1"/>
           <w:sz w:val="24"/>
           <w:szCs w:val="24"/>
-          <w:u w:val="none"/>
+          <w:u w:val="single"/>
           <w:shd w:val="clear" w:color="auto" w:fill="FFFEFF"/>
         </w:rPr>
         <w:t>.</w:t>
@@ -4327,7 +4492,7 @@
           <w:color w:val="000000" w:themeColor="text1"/>
           <w:sz w:val="24"/>
           <w:szCs w:val="24"/>
-          <w:u w:val="none"/>
+          <w:u w:val="single"/>
         </w:rPr>
         <w:t xml:space="preserve">y forma de pago</w:t>
       </w:r>
@@ -4351,7 +4516,7 @@
           <w:color w:val="000000" w:themeColor="text1"/>
           <w:sz w:val="24"/>
           <w:szCs w:val="24"/>
-          <w:u w:val="none"/>
+          <w:u w:val="single"/>
         </w:rPr>
         <w:t>s</w:t>
       </w:r>
@@ -4375,7 +4540,7 @@
           <w:color w:val="000000" w:themeColor="text1"/>
           <w:sz w:val="24"/>
           <w:szCs w:val="24"/>
-          <w:u w:val="none"/>
+          <w:u w:val="single"/>
         </w:rPr>
         <w:t>s</w:t>
       </w:r>
@@ -4515,7 +4680,7 @@
           <w:color w:val="000000" w:themeColor="text1"/>
           <w:sz w:val="24"/>
           <w:szCs w:val="24"/>
-          <w:u w:val="none"/>
+          <w:u w:val="single"/>
         </w:rPr>
         <w:t>De las sesiones que celebren en el Comité de Créditos se levantará acta. Las actas deberán ser redactadas de forma clara y detallada para comprender los fundamentos de los acuerdos tomados y de los temas conocidos. Se asentarán en el libro legar respectivo, bajo numeración secuencial.</w:t>
       </w:r>
@@ -4614,7 +4779,7 @@
           <w:color w:val="000000" w:themeColor="text1"/>
           <w:sz w:val="24"/>
           <w:szCs w:val="24"/>
-          <w:u w:val="none"/>
+          <w:u w:val="single"/>
         </w:rPr>
         <w:t>Elaborar el Plan de trabajo anual y su respectivo presupuesto, y presentarlo al Consejo de Administración para su aprobación, a más tardar en el mes de enero de cada año.</w:t>
       </w:r>
@@ -4678,7 +4843,7 @@
           <w:color w:val="000000" w:themeColor="text1"/>
           <w:sz w:val="24"/>
           <w:szCs w:val="24"/>
-          <w:u w:val="none"/>
+          <w:u w:val="single"/>
         </w:rPr>
         <w:t>nacional</w:t>
       </w:r>
@@ -4806,7 +4971,7 @@
           <w:color w:val="000000" w:themeColor="text1"/>
           <w:sz w:val="24"/>
           <w:szCs w:val="24"/>
-          <w:u w:val="none"/>
+          <w:u w:val="single"/>
         </w:rPr>
         <w:t xml:space="preserve">y otras Unidades de la Cooperativa para mantenerse actualizados en temas financieros y marco regulatorio financiero y en prevención de lavado de dinero y activos y financiamiento del terrorismo y la Financiación de la Proliferación de Armas de Destrucción Masiva</w:t>
       </w:r>
@@ -4946,7 +5111,7 @@
           <w:color w:val="000000" w:themeColor="text1"/>
           <w:sz w:val="24"/>
           <w:szCs w:val="24"/>
-          <w:u w:val="none"/>
+          <w:u w:val="single"/>
         </w:rPr>
         <w:t>las unidades de la Cooperativa</w:t>
       </w:r>
@@ -5161,7 +5326,7 @@
           <w:color w:val="000000" w:themeColor="text1"/>
           <w:sz w:val="24"/>
           <w:szCs w:val="24"/>
-          <w:u w:val="none"/>
+          <w:u w:val="single"/>
         </w:rPr>
         <w:t>estará</w:t>
       </w:r>
@@ -5221,7 +5386,7 @@
           <w:color w:val="000000" w:themeColor="text1"/>
           <w:sz w:val="24"/>
           <w:szCs w:val="24"/>
-          <w:u w:val="none"/>
+          <w:u w:val="single"/>
         </w:rPr>
         <w:t>El Consejo de Administración está facultado para nombrar los Suplentes que considere necesarios para lograr la eficiencia en la aprobación de los créditos. Por lo menos un miembro del Consejo de Administración deberá formar parte de dicho Comité.</w:t>
       </w:r>
@@ -5251,7 +5416,7 @@
           <w:color w:val="000000" w:themeColor="text1"/>
           <w:sz w:val="24"/>
           <w:szCs w:val="24"/>
-          <w:u w:val="none"/>
+          <w:u w:val="single"/>
         </w:rPr>
         <w:t>Los requisitos para ser miembro del Comité de Créditos se detallan en Anexo 3 y que forma parte integrante de este Código.</w:t>
       </w:r>
@@ -5281,7 +5446,7 @@
           <w:color w:val="000000" w:themeColor="text1"/>
           <w:sz w:val="24"/>
           <w:szCs w:val="24"/>
-          <w:u w:val="none"/>
+          <w:u w:val="single"/>
         </w:rPr>
         <w:t>Los Directores del Consejo de Administración, miembros del Comité de Créditos, Gerentes y Personal que autorizan créditos, a más tardar treinta días después de haber tomado posesión de su cargo y en el mes de enero de cada año, deberán declarar bajo juramento a la Superintendencia que no son inhábiles para desempeñar el cargo y a informar a más tardar el siguiente día hábil a dicha institución su inhabilidad, si ésta se produce con posterioridad.</w:t>
       </w:r>
@@ -5370,7 +5535,7 @@
           <w:color w:val="000000" w:themeColor="text1"/>
           <w:sz w:val="24"/>
           <w:szCs w:val="24"/>
-          <w:u w:val="none"/>
+          <w:u w:val="single"/>
         </w:rPr>
         <w:t>El Comité se reunirá ordinariamente al menos una vez por semana a fin de resolver las solicitudes de créditos y tarjetas de crédito y para desarrollar otras actividades o atribuciones establecidas por el Consejo de Administración; pudiendo sesionar de forma extraordinaria cuando las circunstancias lo ameriten. Los suplentes concurrirán a las sesiones del Comité únicamente con voz, excepto cuando suplan a los propietarios en cuyo caso tendrán voto. La presencia de dos de sus miembros constituirá quórum, ya sea propietario o suplente. El Secretario del Comité llevará el Libro de Actas respectivo y si en alguna sesión faltare y no están presentes los suplentes, hará sus veces el Vocal.</w:t>
       </w:r>
@@ -5404,7 +5569,7 @@
           <w:color w:val="000000" w:themeColor="text1"/>
           <w:sz w:val="24"/>
           <w:szCs w:val="24"/>
-          <w:u w:val="none"/>
+          <w:u w:val="single"/>
         </w:rPr>
         <w:t>Las resoluciones de solicitudes de créditos que el Comité determine, deberán ser firmadas por todos los miembros presentes en la sesión. En caso de que un miembro no esté de acuerdo en alguna resolución tomada por la mayoría deberá dejarlo consignado dando sus razonamientos.</w:t>
       </w:r>
@@ -5438,7 +5603,7 @@
           <w:color w:val="000000" w:themeColor="text1"/>
           <w:sz w:val="24"/>
           <w:szCs w:val="24"/>
-          <w:u w:val="none"/>
+          <w:u w:val="single"/>
         </w:rPr>
         <w:t>Los análisis y resoluciones del Comité de Créditos, tomará como base la documentación presentada por el asociado y las instancias correspondientes, así como las opiniones de los analistas, Jefe de Créditos y de las Gerencias; pudiendo solicitar información y opiniones adicionales.</w:t>
       </w:r>
@@ -5472,7 +5637,7 @@
           <w:color w:val="000000" w:themeColor="text1"/>
           <w:sz w:val="24"/>
           <w:szCs w:val="24"/>
-          <w:u w:val="none"/>
+          <w:u w:val="single"/>
         </w:rPr>
         <w:t>El Comité recibirá la información necesaria para conocer las condiciones financieras, económicas y crediticias nacionales, que necesite para su mejor desempeño por lo que recibirá copia de:</w:t>
       </w:r>
@@ -5502,7 +5667,7 @@
           <w:color w:val="000000" w:themeColor="text1"/>
           <w:sz w:val="24"/>
           <w:szCs w:val="24"/>
-          <w:u w:val="none"/>
+          <w:u w:val="single"/>
         </w:rPr>
         <w:t>• Todos los acuerdos y otras decisiones del Consejo de Administración que correspondan a Políticas, procedimientos y lineamientos sobre el proceso financiero y crediticio de COMEDICA de R.L.</w:t>
       </w:r>
@@ -5532,7 +5697,7 @@
           <w:color w:val="000000" w:themeColor="text1"/>
           <w:sz w:val="24"/>
           <w:szCs w:val="24"/>
-          <w:u w:val="none"/>
+          <w:u w:val="single"/>
         </w:rPr>
         <w:t>• De las opiniones y observaciones que sobre la organización y funcionamiento del Comité de Créditos le haga la Junta de Vigilancia directamente o a través del Consejo de Administración.</w:t>
       </w:r>
@@ -5562,7 +5727,7 @@
           <w:color w:val="000000" w:themeColor="text1"/>
           <w:sz w:val="24"/>
           <w:szCs w:val="24"/>
-          <w:u w:val="none"/>
+          <w:u w:val="single"/>
         </w:rPr>
         <w:t>• Información sobre las condiciones de mora, así como de las variables de los usuarios en mora, que presenta las gerencias de la Cooperativa; y de los procesos en recuperación judicial de préstamos que el Comité de Cobros y Recuperación presente.</w:t>
       </w:r>
@@ -5724,7 +5889,7 @@
           <w:color w:val="000000" w:themeColor="text1"/>
           <w:sz w:val="24"/>
           <w:szCs w:val="24"/>
-          <w:u w:val="none"/>
+          <w:u w:val="single"/>
         </w:rPr>
         <w:t xml:space="preserve">DE R.L</w:t>
       </w:r>
@@ -5736,7 +5901,7 @@
           <w:color w:val="000000" w:themeColor="text1"/>
           <w:sz w:val="24"/>
           <w:szCs w:val="24"/>
-          <w:u w:val="none"/>
+          <w:u w:val="single"/>
         </w:rPr>
         <w:t>.</w:t>
       </w:r>
@@ -5949,7 +6114,7 @@
           <w:szCs w:val="24"/>
           <w:u w:val="none"/>
         </w:rPr>
-        <w:t xml:space="preserve">El Comité realizará </w:t>
+        <w:t xml:space="preserve">El Comité realizará</w:t>
       </w:r>
       <w:r>
         <w:rPr>
@@ -5960,7 +6125,7 @@
           <w:u w:val="none"/>
           <w:lang w:val="es-ES_tradnl"/>
         </w:rPr>
-        <w:t>realizará actividades de promoción, información, para asociados y aspirantes, así como Cursos Básicos de cooperativismo, contemplados en el Plan de Trabajo mensual que deberá presentar al Consejo de Administración a más tardar en la segunda semana del mes anterior y que a su vez responderá a lo establecido en el plan anual y en su presupuesto, los cuales, podrán tener revisiones trimestrales.</w:t>
+        <w:t> actividades de promoción, información, para asociados y aspirantes, así como Cursos Básicos de cooperativismo, contemplados en el Plan de Trabajo mensual que deberá presentar al Consejo de Administración a más tardar en la segunda semana del mes anterior y que a su vez responderá a lo establecido en el plan anual y en su presupuesto, los cuales, podrán tener revisiones trimestrales.</w:t>
       </w:r>
     </w:p>
     <w:p>
@@ -6401,7 +6566,7 @@
           <w:color w:val="000000" w:themeColor="text1"/>
           <w:sz w:val="24"/>
           <w:szCs w:val="24"/>
-          <w:u w:val="none"/>
+          <w:u w:val="single"/>
           <w:lang w:val="es-ES_tradnl"/>
         </w:rPr>
         <w:t xml:space="preserve">DE R.L.</w:t>
@@ -6423,7 +6588,7 @@
           <w:color w:val="000000" w:themeColor="text1"/>
           <w:sz w:val="24"/>
           <w:szCs w:val="24"/>
-          <w:u w:val="none"/>
+          <w:u w:val="single"/>
           <w:lang w:val="es-ES_tradnl"/>
         </w:rPr>
         <w:t xml:space="preserve">DE R.L.</w:t>
@@ -6555,7 +6720,7 @@
           <w:color w:val="000000" w:themeColor="text1"/>
           <w:sz w:val="24"/>
           <w:szCs w:val="24"/>
-          <w:u w:val="none"/>
+          <w:u w:val="single"/>
         </w:rPr>
         <w:t>El Comité estará integrado por: a) Un Presidente quien dirigirá las sesiones y será el representante nato del Comité; b) un Secretario, encargado de elaborar las actas de las sesiones y la correspondencia; y de llevar el control de gastos del fondo de educación. c) un Vocal, quien reemplazará al Presidente o al Secretario en caso de ausencia, y será el responsable del plan de capacitación, de su control y evaluación, d) Suplente, quien sustituirá al Vocal cuando éste se encuentre ausente o sustituyendo al Presidente o al Secretario y será el responsable de las publicaciones del Comité. Todos serán nombrados por el Consejo de administración.</w:t>
       </w:r>
@@ -6586,7 +6751,7 @@
           <w:color w:val="000000" w:themeColor="text1"/>
           <w:sz w:val="24"/>
           <w:szCs w:val="24"/>
-          <w:u w:val="none"/>
+          <w:u w:val="single"/>
         </w:rPr>
         <w:t>Los requisitos para ser miembro del Comité de Educación se detallan en Anexo 6 y que forma parte integrante de éste Código.</w:t>
       </w:r>
@@ -6690,7 +6855,7 @@
           <w:color w:val="000000" w:themeColor="text1"/>
           <w:sz w:val="24"/>
           <w:szCs w:val="24"/>
-          <w:u w:val="none"/>
+          <w:u w:val="single"/>
         </w:rPr>
         <w:t>Para ser válida la sesión se necesita que exista quórum con la presencia mínima de dos miembros del Comité.</w:t>
       </w:r>
@@ -6716,7 +6881,7 @@
           <w:color w:val="000000" w:themeColor="text1"/>
           <w:sz w:val="24"/>
           <w:szCs w:val="24"/>
-          <w:u w:val="none"/>
+          <w:u w:val="single"/>
         </w:rPr>
         <w:t>Sus resoluciones o acuerdos se tomarán por mayoría de votos y en caso de empate el Presidente, o quien haga sus veces, tendrá doble voto.</w:t>
       </w:r>
@@ -6742,7 +6907,7 @@
           <w:color w:val="000000" w:themeColor="text1"/>
           <w:sz w:val="24"/>
           <w:szCs w:val="24"/>
-          <w:u w:val="none"/>
+          <w:u w:val="single"/>
         </w:rPr>
         <w:t>Las actas serán breves, concisas, y orientadas a recoger lo esencial de lo tratado en cada sesión, agregándose la documentación necesaria cuando fuese pertinente. Una vez impresas en el libro legal serán firmadas por el Presidente, Secretario y Vocal en el libro respectivo. El miembro suplente firmara las actas cuando actúe como propietario durante toda la sesión. Semanalmente se enviará copia del acta a la Junta de Vigilancia.</w:t>
       </w:r>
@@ -6768,7 +6933,7 @@
           <w:color w:val="000000" w:themeColor="text1"/>
           <w:sz w:val="24"/>
           <w:szCs w:val="24"/>
-          <w:u w:val="none"/>
+          <w:u w:val="single"/>
         </w:rPr>
         <w:t>El Jefe del Departamento de Educación y Responsabilidad Social preparará la documentación necesaria, en coordinación con el Secretario, y su participación en las sesiones estará sujeta a la naturaleza de los asuntos a tratar.</w:t>
       </w:r>
@@ -6927,7 +7092,7 @@
           <w:color w:val="000000" w:themeColor="text1"/>
           <w:sz w:val="24"/>
           <w:szCs w:val="24"/>
-          <w:u w:val="none"/>
+          <w:u w:val="single"/>
         </w:rPr>
         <w:t>y clientes</w:t>
       </w:r>
@@ -7132,7 +7297,7 @@
           <w:color w:val="000000" w:themeColor="text1"/>
           <w:sz w:val="24"/>
           <w:szCs w:val="24"/>
-          <w:u w:val="none"/>
+          <w:u w:val="single"/>
           <w:lang w:val="es-SV" w:eastAsia="es-SV"/>
         </w:rPr>
         <w:t>Analizar, Discutir y Aprobar las propuestas de solución presentadas por el Departamento de Soluciones Financieras en relación a las dificultades que presentan los asociados y clientes para cumplir con las obligaciones crediticias adquiridas con la cooperativa,</w:t>
@@ -7164,7 +7329,7 @@
           <w:color w:val="000000" w:themeColor="text1"/>
           <w:sz w:val="24"/>
           <w:szCs w:val="24"/>
-          <w:u w:val="none"/>
+          <w:u w:val="single"/>
           <w:lang w:val="es-SV" w:eastAsia="es-SV"/>
         </w:rPr>
         <w:t>Proponer alternativas de solución de los préstamos y tarjetas de crédito en mora.</w:t>
@@ -7196,7 +7361,7 @@
           <w:color w:val="000000" w:themeColor="text1"/>
           <w:sz w:val="24"/>
           <w:szCs w:val="24"/>
-          <w:u w:val="none"/>
+          <w:u w:val="single"/>
           <w:lang w:val="es-SV" w:eastAsia="es-SV"/>
         </w:rPr>
         <w:t>Aprobar y dar seguimiento a los casos que se trasladarán al cobro prejudicial</w:t>
@@ -7291,7 +7456,7 @@
           <w:rFonts w:ascii="Arial" w:hAnsi="Arial" w:cs="Arial"/>
           <w:sz w:val="24"/>
           <w:szCs w:val="24"/>
-          <w:u w:val="none"/>
+          <w:u w:val="single"/>
           <w:lang w:val="es-SV" w:eastAsia="es-SV"/>
         </w:rPr>
         <w:t>Aprobar y dar seguimiento a los casos que se trasladarán al cobro prejudicial, notificando por escrito al Consejo de Administración para su ratificación Una vez ratificado el traslado a la vía judicial, dará seguimiento a los casos aprobados. Si se logra un arreglo de pago antes de que fuere asignado a un apoderado judicial, el Comité deberá notificar por escrito al Consejo de Administración, solicitando revocar el acuerdo de traslado.</w:t>
@@ -7579,7 +7744,7 @@
           <w:color w:val="000000" w:themeColor="text1"/>
           <w:sz w:val="24"/>
           <w:szCs w:val="24"/>
-          <w:u w:val="none"/>
+          <w:u w:val="single"/>
           <w:lang w:val="es-SV" w:eastAsia="es-SV"/>
         </w:rPr>
         <w:t>Elaborar el Plan de trabajo anual y su respectivo presupuesto, a solicitud del Consejo de Administración para su aprobación.</w:t>
@@ -7611,7 +7776,7 @@
           <w:color w:val="000000" w:themeColor="text1"/>
           <w:sz w:val="24"/>
           <w:szCs w:val="24"/>
-          <w:u w:val="none"/>
+          <w:u w:val="single"/>
           <w:lang w:val="es-SV" w:eastAsia="es-SV"/>
         </w:rPr>
         <w:t>Cuando lo considere necesario, podrá programar y participar en reuniones conjuntas con el Comité de Créditos.</w:t>
@@ -7643,7 +7808,7 @@
           <w:color w:val="000000" w:themeColor="text1"/>
           <w:sz w:val="24"/>
           <w:szCs w:val="24"/>
-          <w:u w:val="none"/>
+          <w:u w:val="single"/>
           <w:lang w:val="es-SV" w:eastAsia="es-SV"/>
         </w:rPr>
         <w:t>Solicitar al Departamento de Soluciones Financieras, reportes con relación al estado de la cartera, saldos en mora o cualquier otra información que considere necesaria.</w:t>
@@ -7675,7 +7840,7 @@
           <w:color w:val="000000" w:themeColor="text1"/>
           <w:sz w:val="24"/>
           <w:szCs w:val="24"/>
-          <w:u w:val="none"/>
+          <w:u w:val="single"/>
           <w:lang w:val="es-SV" w:eastAsia="es-SV"/>
         </w:rPr>
         <w:t>Dar seguimiento a los casos presentados por el Departamento de Soluciones Financieras al Comité, cuando así se ha programado en sesiones previas del Comité.</w:t>
@@ -7767,7 +7932,7 @@
           <w:color w:val="000000" w:themeColor="text1"/>
           <w:sz w:val="24"/>
           <w:szCs w:val="24"/>
-          <w:u w:val="none"/>
+          <w:u w:val="single"/>
           <w:lang w:val="es-ES_tradnl"/>
         </w:rPr>
         <w:t>Director</w:t>
@@ -7815,7 +7980,7 @@
           <w:color w:val="000000" w:themeColor="text1"/>
           <w:sz w:val="24"/>
           <w:szCs w:val="24"/>
-          <w:u w:val="none"/>
+          <w:u w:val="single"/>
           <w:lang w:val="es-ES_tradnl"/>
         </w:rPr>
         <w:t>Los requisitos para ser miembro del Comité de Cobros y Recuperación se detallan en Anexo 6 y que forma parte integrante de este Código.</w:t>
@@ -7887,7 +8052,7 @@
           <w:color w:val="000000" w:themeColor="text1"/>
           <w:sz w:val="24"/>
           <w:szCs w:val="24"/>
-          <w:u w:val="none"/>
+          <w:u w:val="single"/>
           <w:lang w:val="es-SV" w:eastAsia="es-SV"/>
         </w:rPr>
         <w:t>El Comité se reunirá ordinariamente una vez por semana a fin de analizar los casos presentados por el Departamento de Soluciones Financieras de la cartera de préstamos y tarjeta de crédito en donde se han agotado los esfuerzos de la gestión administrativa, sin resultados concretos y que presentan un estado de difícil recuperación o irrecuperables; podrán sesionar de forma extraordinaria cuando las circunstancias lo ameriten.</w:t>
@@ -7918,7 +8083,7 @@
           <w:color w:val="000000" w:themeColor="text1"/>
           <w:sz w:val="24"/>
           <w:szCs w:val="24"/>
-          <w:u w:val="none"/>
+          <w:u w:val="single"/>
           <w:lang w:val="es-SV" w:eastAsia="es-SV"/>
         </w:rPr>
         <w:t>La presencia de tres de sus miembros, propietarios o suplentes harán quórum, salvo causa justificada, todos deberán asistir a las reuniones.</w:t>
@@ -7949,7 +8114,7 @@
           <w:color w:val="000000" w:themeColor="text1"/>
           <w:sz w:val="24"/>
           <w:szCs w:val="24"/>
-          <w:u w:val="none"/>
+          <w:u w:val="single"/>
           <w:lang w:val="es-SV" w:eastAsia="es-SV"/>
         </w:rPr>
         <w:t>El jefe del Departamento de Soluciones Financieras es el responsable de presentar ante el Comité, los informes preparados por los ejecutivos con sus observaciones y recomendaciones. El Comité deberá tomar un acuerdo al respecto.</w:t>
@@ -7980,7 +8145,7 @@
           <w:color w:val="000000" w:themeColor="text1"/>
           <w:sz w:val="24"/>
           <w:szCs w:val="24"/>
-          <w:u w:val="none"/>
+          <w:u w:val="single"/>
           <w:lang w:val="es-SV" w:eastAsia="es-SV"/>
         </w:rPr>
         <w:t>Las resoluciones tomadas por el Comité deberán ser firmadas por todos los miembros titulares (presidente, secretario y vocal) presentes en la sesión, o por el suplente cuando faltare alguno de ellos. En caso de que un miembro no esté de acuerdo en alguna resolución tomada por la mayoría, deberá dejarlo consignado en el acta respectiva, dando sus razonamientos.</w:t>
@@ -8011,7 +8176,7 @@
           <w:color w:val="000000" w:themeColor="text1"/>
           <w:sz w:val="24"/>
           <w:szCs w:val="24"/>
-          <w:u w:val="none"/>
+          <w:u w:val="single"/>
           <w:lang w:val="es-SV" w:eastAsia="es-SV"/>
         </w:rPr>
         <w:t>El Comité tendrá la facultad de convocar a los deudores y codeudores, para que asistan a exponer su situación y proponer alternativas de solución.</w:t>
@@ -8042,7 +8207,7 @@
           <w:color w:val="000000" w:themeColor="text1"/>
           <w:sz w:val="24"/>
           <w:szCs w:val="24"/>
-          <w:u w:val="none"/>
+          <w:u w:val="single"/>
           <w:lang w:val="es-SV" w:eastAsia="es-SV"/>
         </w:rPr>
         <w:t>La comunicación de los acuerdos del Comité se hará por escrito y serán firmados por el secretario, colocando el sello del Comité, se comunicarán al deudor y a sus codeudores, si hubiere. En los casos que sea necesario se comunicará a otros cuerpos directivos y entes relacionados.</w:t>
@@ -8073,7 +8238,7 @@
           <w:color w:val="000000" w:themeColor="text1"/>
           <w:sz w:val="24"/>
           <w:szCs w:val="24"/>
-          <w:u w:val="none"/>
+          <w:u w:val="single"/>
           <w:lang w:val="es-SV" w:eastAsia="es-SV"/>
         </w:rPr>
         <w:t>Las certificaciones de acuerdos que se soliciten serán expedidas por el Secretario del Comité.</w:t>
@@ -8222,7 +8387,7 @@
           <w:color w:val="000000" w:themeColor="text1"/>
           <w:sz w:val="24"/>
           <w:szCs w:val="24"/>
-          <w:u w:val="none"/>
+          <w:u w:val="single"/>
         </w:rPr>
         <w:t>Es responsable de lograr la efectiva y eficiente administración de los recursos financieros, y de evaluar el impacto financiero de las medidas de recuperación y la información utilizada para la toma de decisiones.</w:t>
       </w:r>
@@ -9146,7 +9311,7 @@
           <w:color w:val="000000" w:themeColor="text1"/>
           <w:sz w:val="24"/>
           <w:szCs w:val="24"/>
-          <w:u w:val="none"/>
+          <w:u w:val="single"/>
         </w:rPr>
         <w:t>Evaluar, revisar y proponer al Consejo de Administración, el Plan de Recuperación y sus mejoras futuras;</w:t>
       </w:r>
@@ -9174,7 +9339,7 @@
           <w:color w:val="000000" w:themeColor="text1"/>
           <w:sz w:val="24"/>
           <w:szCs w:val="24"/>
-          <w:u w:val="none"/>
+          <w:u w:val="single"/>
         </w:rPr>
         <w:t>Proponer con fundamento razonado los ajustes necesarios al Plan de Recuperación o a los planes estratégicos y de negocio, según corresponda, a efecto de adecuarlos a la real situación económica y financiera y al perfil de riesgos de la Cooperativa;</w:t>
       </w:r>
@@ -9202,7 +9367,7 @@
           <w:color w:val="000000" w:themeColor="text1"/>
           <w:sz w:val="24"/>
           <w:szCs w:val="24"/>
-          <w:u w:val="none"/>
+          <w:u w:val="single"/>
         </w:rPr>
         <w:t>Definir los indicadores cuantitativos y cualitativos objeto de seguimiento del Plan de Recuperación;</w:t>
       </w:r>
@@ -9230,7 +9395,7 @@
           <w:color w:val="000000" w:themeColor="text1"/>
           <w:sz w:val="24"/>
           <w:szCs w:val="24"/>
-          <w:u w:val="none"/>
+          <w:u w:val="single"/>
         </w:rPr>
         <w:t>Asegurar que se implementen las acciones correctivas requeridas en caso de que exista incumplimiento a los límites establecidos, con respecto al nivel de tolerancia al riesgo de liquidez asumido.</w:t>
       </w:r>
@@ -9258,7 +9423,7 @@
           <w:color w:val="000000" w:themeColor="text1"/>
           <w:sz w:val="24"/>
           <w:szCs w:val="24"/>
-          <w:u w:val="none"/>
+          <w:u w:val="single"/>
         </w:rPr>
         <w:t>Velar por el cumplimiento de los requerimientos regulatorios en materia de planes de recuperación y atender los requerimientos de información por parte de la Superintendencia;</w:t>
       </w:r>
@@ -9286,7 +9451,7 @@
           <w:color w:val="000000" w:themeColor="text1"/>
           <w:sz w:val="24"/>
           <w:szCs w:val="24"/>
-          <w:u w:val="none"/>
+          <w:u w:val="single"/>
         </w:rPr>
         <w:t>Evaluar la crisis de liquidez que se está implementando, decidir las acciones a seguir y monitorear los cambios en los escenarios para tomar acciones correctivas cuando sea necesario</w:t>
       </w:r>
@@ -9314,7 +9479,7 @@
           <w:color w:val="000000" w:themeColor="text1"/>
           <w:sz w:val="24"/>
           <w:szCs w:val="24"/>
-          <w:u w:val="none"/>
+          <w:u w:val="single"/>
         </w:rPr>
         <w:t>Dar seguimiento al cumplimiento de algunas de las medidas del Plan de Recuperación de acuerdo al requerimiento de la Superintendencia;</w:t>
       </w:r>
@@ -9342,7 +9507,7 @@
           <w:color w:val="000000" w:themeColor="text1"/>
           <w:sz w:val="24"/>
           <w:szCs w:val="24"/>
-          <w:u w:val="none"/>
+          <w:u w:val="single"/>
         </w:rPr>
         <w:t>Recomendar al Consejo de Administración, la activación o modificación de los mecanismos de atención de la contingencia de liquidez;</w:t>
       </w:r>
@@ -9452,7 +9617,7 @@
           <w:color w:val="000000" w:themeColor="text1"/>
           <w:sz w:val="24"/>
           <w:szCs w:val="24"/>
-          <w:u w:val="none"/>
+          <w:u w:val="single"/>
         </w:rPr>
         <w:t>El Comité estará integrado por los siguientes cargos: del Consejo de Administración, Presidente, Tesorero, Vocal y Director que se desempeñe como Presidente del Comité de Créditos; de la Junta de Vigilancia, Presidente y Secretario; Gerente General o su delegado, el Gerente de Finanzas y Planificación, Gerente de Negocios y el Gerente de Operaciones.</w:t>
       </w:r>
@@ -9476,7 +9641,7 @@
           <w:color w:val="000000" w:themeColor="text1"/>
           <w:sz w:val="24"/>
           <w:szCs w:val="24"/>
-          <w:u w:val="none"/>
+          <w:u w:val="single"/>
         </w:rPr>
         <w:t>El Comité será presidido por el Presidente del Consejo de Administración y en su ausencia por el Tesorero, las actas serán levantadas por el Gerente de Finanzas y Planificación. El plazo del ejercicio para miembros directivos será de tres años, o por el período que se encuentren desempeñando dichos cargos en los respectivos Cuerpos Directivos y para miembros del personal administrativo el periodo que se encuentren fungiendo como responsables de los puestos señalados.</w:t>
       </w:r>
@@ -9500,7 +9665,7 @@
           <w:color w:val="000000" w:themeColor="text1"/>
           <w:sz w:val="24"/>
           <w:szCs w:val="24"/>
-          <w:u w:val="none"/>
+          <w:u w:val="single"/>
         </w:rPr>
         <w:t>Los requisitos para ser miembro del Comité de Finanzas y de Recuperación Financiera se detallan en Anexo 6 y que forma parte integrante de este Código.</w:t>
       </w:r>
@@ -9580,7 +9745,7 @@
           <w:color w:val="000000" w:themeColor="text1"/>
           <w:sz w:val="24"/>
           <w:szCs w:val="24"/>
-          <w:u w:val="none"/>
+          <w:u w:val="single"/>
         </w:rPr>
         <w:t>El Comité de Finanzas y de Recuperación Financiera, se reunirá una vez al mes o por lo menos una vez cada trimestre para dar seguimiento a las actividades relacionadas con la gestión financiera. Reportará directamente al Consejo de Administración, con copia a la Junta de Vigilancia y Gerente General.</w:t>
       </w:r>
@@ -9608,7 +9773,7 @@
           <w:color w:val="000000" w:themeColor="text1"/>
           <w:sz w:val="24"/>
           <w:szCs w:val="24"/>
-          <w:u w:val="none"/>
+          <w:u w:val="single"/>
         </w:rPr>
         <w:t>Para las reuniones ordinarias, el Gerente de Finanzas y Planificación a requerimiento del Presidente del Consejo de Administración o en su defecto por el Tesorero, convocará por medio escrito, electrónico o llamada telefónica a cada uno de los miembros del Comité con al menos dos días hábiles de anticipación, salvo excepciones que ameriten reunión de carácter urgente.</w:t>
       </w:r>
@@ -9636,7 +9801,7 @@
           <w:color w:val="000000" w:themeColor="text1"/>
           <w:sz w:val="24"/>
           <w:szCs w:val="24"/>
-          <w:u w:val="none"/>
+          <w:u w:val="single"/>
         </w:rPr>
         <w:t>Los Acuerdos que se tomen serán presentados por el Tesorero al Consejo de Administración, para su aprobación; y el Gerente General comunicará a Gerentes de Área los acuerdos aprobados para su conocimiento y/o cumplimiento.</w:t>
       </w:r>
@@ -9664,7 +9829,7 @@
           <w:color w:val="000000" w:themeColor="text1"/>
           <w:sz w:val="24"/>
           <w:szCs w:val="24"/>
-          <w:u w:val="none"/>
+          <w:u w:val="single"/>
         </w:rPr>
         <w:t>El día, hora y lugar de la reunión se establecerá por el Presidente del Consejo de Administración y en su ausencia por el Tesorero del mismo cuerpo directivo.</w:t>
       </w:r>
@@ -9692,7 +9857,7 @@
           <w:color w:val="000000" w:themeColor="text1"/>
           <w:sz w:val="24"/>
           <w:szCs w:val="24"/>
-          <w:u w:val="none"/>
+          <w:u w:val="single"/>
         </w:rPr>
         <w:t>La agenda será propuesta por el Gerente de Finanzas y Planificación, Gerente General o a quien éste delegue; la cual será aprobada por el Comité de Finanzas y de Recuperación Financiera.</w:t>
       </w:r>
@@ -9720,7 +9885,7 @@
           <w:color w:val="000000" w:themeColor="text1"/>
           <w:sz w:val="24"/>
           <w:szCs w:val="24"/>
-          <w:u w:val="none"/>
+          <w:u w:val="single"/>
         </w:rPr>
         <w:t>Los informes de las reuniones realizadas deberán ser firmados por los miembros que participaron en la reunión, dejando constancia de las razones de sus desacuerdos en caso que los haya.</w:t>
       </w:r>
@@ -9748,7 +9913,7 @@
           <w:color w:val="000000" w:themeColor="text1"/>
           <w:sz w:val="24"/>
           <w:szCs w:val="24"/>
-          <w:u w:val="none"/>
+          <w:u w:val="single"/>
         </w:rPr>
         <w:t>Para las reuniones del Comité, se establecerá quórum con la presencia del Presidente o Tesorero del Consejo de Administración, tres miembros directivos más Gerente de Finanzas y Planificación y el Gerente General o su delegado. Los acuerdos se tomarán por consenso o mayoría.</w:t>
       </w:r>
@@ -10219,7 +10384,7 @@
           <w:color w:val="000000" w:themeColor="text1"/>
           <w:sz w:val="24"/>
           <w:szCs w:val="24"/>
-          <w:u w:val="none"/>
+          <w:u w:val="single"/>
           <w:lang w:val="es-SV" w:eastAsia="es-SV"/>
         </w:rPr>
         <w:t>prevención del</w:t>
@@ -10230,7 +10395,7 @@
           <w:color w:val="000000" w:themeColor="text1"/>
           <w:sz w:val="24"/>
           <w:szCs w:val="24"/>
-          <w:u w:val="none"/>
+          <w:u w:val="single"/>
           <w:lang w:val="es-SV" w:eastAsia="es-SV"/>
         </w:rPr>
         <w:t xml:space="preserve"> </w:t>
@@ -10252,7 +10417,7 @@
           <w:color w:val="000000" w:themeColor="text1"/>
           <w:sz w:val="24"/>
           <w:szCs w:val="24"/>
-          <w:u w:val="none"/>
+          <w:u w:val="single"/>
           <w:lang w:val="es-SV" w:eastAsia="es-SV"/>
         </w:rPr>
         <w:t>dinero y</w:t>
@@ -10285,7 +10450,7 @@
           <w:color w:val="000000" w:themeColor="text1"/>
           <w:sz w:val="24"/>
           <w:szCs w:val="24"/>
-          <w:u w:val="none"/>
+          <w:u w:val="single"/>
           <w:lang w:val="es-SV" w:eastAsia="es-SV"/>
         </w:rPr>
         <w:t>y la Financiación de la Proliferación de Armas de Destrucción Masiva,</w:t>
@@ -10307,7 +10472,7 @@
           <w:color w:val="000000" w:themeColor="text1"/>
           <w:sz w:val="24"/>
           <w:szCs w:val="24"/>
-          <w:u w:val="none"/>
+          <w:u w:val="single"/>
           <w:lang w:val="es-SV" w:eastAsia="es-SV"/>
         </w:rPr>
         <w:t>PLDA/FT/FPADM</w:t>
@@ -10318,7 +10483,7 @@
           <w:color w:val="000000" w:themeColor="text1"/>
           <w:sz w:val="24"/>
           <w:szCs w:val="24"/>
-          <w:u w:val="none"/>
+          <w:u w:val="single"/>
           <w:lang w:val="es-SV" w:eastAsia="es-SV"/>
         </w:rPr>
         <w:t xml:space="preserve"/>
@@ -10888,7 +11053,7 @@
           <w:color w:val="000000" w:themeColor="text1"/>
           <w:sz w:val="24"/>
           <w:szCs w:val="24"/>
-          <w:u w:val="none"/>
+          <w:u w:val="single"/>
           <w:lang w:val="es-SV" w:eastAsia="es-SV"/>
         </w:rPr>
         <w:t>Evaluar de forma independiente la efectividad de los controles implementados con el Plan de Recuperación.</w:t>
@@ -10920,7 +11085,7 @@
           <w:color w:val="000000" w:themeColor="text1"/>
           <w:sz w:val="24"/>
           <w:szCs w:val="24"/>
-          <w:u w:val="none"/>
+          <w:u w:val="single"/>
           <w:lang w:val="es-SV" w:eastAsia="es-SV"/>
         </w:rPr>
         <w:t>Emitir recomendaciones al Consejo de Administración para fortalecer el proceso de recuperación.</w:t>
@@ -10952,7 +11117,7 @@
           <w:color w:val="000000" w:themeColor="text1"/>
           <w:sz w:val="24"/>
           <w:szCs w:val="24"/>
-          <w:u w:val="none"/>
+          <w:u w:val="single"/>
           <w:lang w:val="es-SV" w:eastAsia="es-SV"/>
         </w:rPr>
         <w:t>Informar al Consejo de Administración y al Comité de Auditoría y Finanzas sobre hallazgos relevantes.</w:t>
@@ -11081,7 +11246,7 @@
           <w:color w:val="000000" w:themeColor="text1"/>
           <w:sz w:val="24"/>
           <w:szCs w:val="24"/>
-          <w:u w:val="none"/>
+          <w:u w:val="single"/>
           <w:lang w:val="es-SV" w:eastAsia="es-SV"/>
         </w:rPr>
         <w:t>Los Miembros del Comité, podrán delegar sustituto en caso de que ocurra ausencia justificada.</w:t>
@@ -11108,7 +11273,7 @@
           <w:color w:val="000000" w:themeColor="text1"/>
           <w:sz w:val="24"/>
           <w:szCs w:val="24"/>
-          <w:u w:val="none"/>
+          <w:u w:val="single"/>
           <w:lang w:val="es-SV" w:eastAsia="es-SV"/>
         </w:rPr>
         <w:t>Los requisitos para ser miembro del Comité de Auditoría se detallan en Anexo 4 y que forma parte integrante de éste Código.</w:t>
@@ -11235,7 +11400,7 @@
           <w:color w:val="000000" w:themeColor="text1"/>
           <w:sz w:val="24"/>
           <w:szCs w:val="24"/>
-          <w:u w:val="none"/>
+          <w:u w:val="single"/>
           <w:lang w:val="es-SV" w:eastAsia="es-SV"/>
         </w:rPr>
         <w:t>El Auditor Interno será el Secretario del Comité, y levantará el acta de cada una de las sesiones mantenidas, que será aprobada en la sesión inmediatamente posterior. Las actas del Comité deberán estar a disposición de todos los Directores del Consejo de Administración.</w:t>
@@ -11266,7 +11431,7 @@
           <w:color w:val="000000" w:themeColor="text1"/>
           <w:sz w:val="24"/>
           <w:szCs w:val="24"/>
-          <w:u w:val="none"/>
+          <w:u w:val="single"/>
           <w:lang w:val="es-SV" w:eastAsia="es-SV"/>
         </w:rPr>
         <w:t>A las reuniones del Comité pueden ser citados con la frecuencia necesaria y con el fin de requerir explicaciones pertinentes acerca de asuntos de control interno, Gerentes de Área, Jefes de Departamentos, Auditor Externo, Auditor Fiscal, así como cualquier otro funcionario que el Comité considere conveniente.</w:t>
@@ -11297,7 +11462,7 @@
           <w:color w:val="000000" w:themeColor="text1"/>
           <w:sz w:val="24"/>
           <w:szCs w:val="24"/>
-          <w:u w:val="none"/>
+          <w:u w:val="single"/>
           <w:lang w:val="es-SV" w:eastAsia="es-SV"/>
         </w:rPr>
         <w:t>Cuando algún miembro del Comité tuviese interés personal en cualquier asunto que debe discutirse en el Comité, deberá ausentarse de la reunión hasta que la decisión se adopte.</w:t>
@@ -11328,7 +11493,7 @@
           <w:color w:val="000000" w:themeColor="text1"/>
           <w:sz w:val="24"/>
           <w:szCs w:val="24"/>
-          <w:u w:val="none"/>
+          <w:u w:val="single"/>
           <w:lang w:val="es-SV" w:eastAsia="es-SV"/>
         </w:rPr>
         <w:t>Los miembros del Comité que tengan conocimiento de algún potencial conflicto de interés (directo o indirecto), de cualquiera que los otros miembros, deberán manifestarlo a fin de que se delibere si procede o no el retiro del miembro de la sesión. Dicha deliberación quedará asentada en el acta de la mencionada Sesión.</w:t>
@@ -11482,7 +11647,7 @@
           <w:color w:val="000000" w:themeColor="text1"/>
           <w:sz w:val="24"/>
           <w:szCs w:val="24"/>
-          <w:u w:val="none"/>
+          <w:u w:val="single"/>
         </w:rPr>
         <w:t>El Comité de Riesgos es una instancia asesora y de apoyo al Consejo de Administración, actuará con criterio de independencia, confidencialidad y objetividad en el cumplimiento de sus responsabilidades de seguimiento de la gestión de riesgos, asimismo es el enlance con el Consejo de Administración.</w:t>
       </w:r>
@@ -11611,7 +11776,7 @@
           <w:color w:val="000000" w:themeColor="text1"/>
           <w:sz w:val="24"/>
           <w:szCs w:val="24"/>
-          <w:u w:val="none"/>
+          <w:u w:val="single"/>
           <w:lang w:val="es-SV" w:eastAsia="es-SV"/>
         </w:rPr>
         <w:t>Evaluar, revisar y proponer para aprobación del</w:t>
@@ -11622,7 +11787,7 @@
           <w:color w:val="000000" w:themeColor="text1"/>
           <w:sz w:val="24"/>
           <w:szCs w:val="24"/>
-          <w:u w:val="none"/>
+          <w:u w:val="single"/>
           <w:lang w:val="es-SV" w:eastAsia="es-SV"/>
         </w:rPr>
         <w:t xml:space="preserve"/>
@@ -11644,7 +11809,7 @@
           <w:color w:val="000000" w:themeColor="text1"/>
           <w:sz w:val="24"/>
           <w:szCs w:val="24"/>
-          <w:u w:val="none"/>
+          <w:u w:val="single"/>
           <w:lang w:val="es-SV" w:eastAsia="es-SV"/>
         </w:rPr>
         <w:t>, estrategias, políticas y manuales para la</w:t>
@@ -11677,7 +11842,7 @@
           <w:color w:val="000000" w:themeColor="text1"/>
           <w:sz w:val="24"/>
           <w:szCs w:val="24"/>
-          <w:u w:val="none"/>
+          <w:u w:val="single"/>
           <w:lang w:val="es-SV" w:eastAsia="es-SV"/>
         </w:rPr>
         <w:t>integral</w:t>
@@ -11710,7 +11875,7 @@
           <w:color w:val="000000" w:themeColor="text1"/>
           <w:sz w:val="24"/>
           <w:szCs w:val="24"/>
-          <w:u w:val="none"/>
+          <w:u w:val="single"/>
           <w:lang w:val="es-SV" w:eastAsia="es-SV"/>
         </w:rPr>
         <w:t>y continuidad del negocio.</w:t>
@@ -11769,7 +11934,7 @@
           <w:color w:val="000000" w:themeColor="text1"/>
           <w:sz w:val="24"/>
           <w:szCs w:val="24"/>
-          <w:u w:val="none"/>
+          <w:u w:val="single"/>
           <w:lang w:val="es-SV" w:eastAsia="es-SV"/>
         </w:rPr>
         <w:t>en especial en los niveles patrimoniales</w:t>
@@ -11791,7 +11956,7 @@
           <w:color w:val="000000" w:themeColor="text1"/>
           <w:sz w:val="24"/>
           <w:szCs w:val="24"/>
-          <w:u w:val="none"/>
+          <w:u w:val="single"/>
           <w:lang w:val="es-SV" w:eastAsia="es-SV"/>
         </w:rPr>
         <w:t>, así como sus acciones correctivas</w:t>
@@ -11850,7 +12015,7 @@
           <w:color w:val="000000" w:themeColor="text1"/>
           <w:sz w:val="24"/>
           <w:szCs w:val="24"/>
-          <w:u w:val="none"/>
+          <w:u w:val="single"/>
           <w:lang w:val="es-SV" w:eastAsia="es-SV"/>
         </w:rPr>
         <w:t>Informar al Consejo de Administración sobre las exposiciones, desviaciones y excepciones de los riesgos que son gestionados en la Cooperativa.</w:t>
@@ -11996,7 +12161,7 @@
           <w:color w:val="000000" w:themeColor="text1"/>
           <w:sz w:val="24"/>
           <w:szCs w:val="24"/>
-          <w:u w:val="none"/>
+          <w:u w:val="single"/>
           <w:lang w:val="es-SV" w:eastAsia="es-SV"/>
         </w:rPr>
         <w:t>, los casos o circunstancias especiales en los cuales se puedan exceder los límites de exposición, así como los controles especiales sobre dichas circunstancias</w:t>
@@ -12007,7 +12172,7 @@
           <w:color w:val="000000" w:themeColor="text1"/>
           <w:sz w:val="24"/>
           <w:szCs w:val="24"/>
-          <w:u w:val="none"/>
+          <w:u w:val="single"/>
           <w:lang w:val="es-SV" w:eastAsia="es-SV"/>
         </w:rPr>
         <w:t xml:space="preserve">. </w:t>
@@ -12055,7 +12220,7 @@
           <w:color w:val="000000" w:themeColor="text1"/>
           <w:sz w:val="24"/>
           <w:szCs w:val="24"/>
-          <w:u w:val="none"/>
+          <w:u w:val="single"/>
           <w:lang w:val="es-SV" w:eastAsia="es-SV"/>
         </w:rPr>
         <w:t>Aprobar las acciones correctivas propuestas por el Departamento de Administración de Riesgos y las áreas involucradas, así como los mecanismos para la implementación de las mismas, en el caso que exista desviación con respecto a los niveles o límites de exposición asumidos.</w:t>
@@ -12239,7 +12404,7 @@
           <w:color w:val="000000" w:themeColor="text1"/>
           <w:sz w:val="24"/>
           <w:szCs w:val="24"/>
-          <w:u w:val="none"/>
+          <w:u w:val="single"/>
           <w:lang w:val="es-SV" w:eastAsia="es-SV"/>
         </w:rPr>
         <w:t>Informar al Consejo de Administración sobre el resultado de los informes elaborados por el Departamento de Administración de Riesgos</w:t>
@@ -12298,7 +12463,7 @@
           <w:color w:val="000000" w:themeColor="text1"/>
           <w:sz w:val="24"/>
           <w:szCs w:val="24"/>
-          <w:u w:val="none"/>
+          <w:u w:val="single"/>
           <w:lang w:val="es-SV" w:eastAsia="es-SV"/>
         </w:rPr>
         <w:t>relacionadas a la Gestión Integral</w:t>
@@ -12320,7 +12485,7 @@
           <w:color w:val="000000" w:themeColor="text1"/>
           <w:sz w:val="24"/>
           <w:szCs w:val="24"/>
-          <w:u w:val="none"/>
+          <w:u w:val="single"/>
           <w:lang w:val="es-SV" w:eastAsia="es-SV"/>
         </w:rPr>
         <w:t>s</w:t>
@@ -12342,7 +12507,7 @@
           <w:color w:val="000000" w:themeColor="text1"/>
           <w:sz w:val="24"/>
           <w:szCs w:val="24"/>
-          <w:u w:val="none"/>
+          <w:u w:val="single"/>
           <w:lang w:val="es-SV" w:eastAsia="es-SV"/>
         </w:rPr>
         <w:t>Continuidad del Negocio y Seguridad de la Información</w:t>
@@ -12401,7 +12566,7 @@
           <w:color w:val="000000" w:themeColor="text1"/>
           <w:sz w:val="24"/>
           <w:szCs w:val="24"/>
-          <w:u w:val="none"/>
+          <w:u w:val="single"/>
           <w:lang w:val="es-SV" w:eastAsia="es-SV"/>
         </w:rPr>
         <w:t>Validar el Plan de Continuidad del Negocio, planes de contingencia, programa de pruebas de Continuidad del Negocio, para aprobación del Consejo de Administración.</w:t>
@@ -12445,7 +12610,7 @@
           <w:color w:val="000000" w:themeColor="text1"/>
           <w:sz w:val="24"/>
           <w:szCs w:val="24"/>
-          <w:u w:val="none"/>
+          <w:u w:val="single"/>
           <w:lang w:val="es-SV" w:eastAsia="es-SV"/>
         </w:rPr>
         <w:t>Dar seguimiento a la ejecución de los programas de prueba de continuidad del negocio y a los planes de acción o mejora que resulten, recomendando acciones o mecanismos adicionales para la planificación y ejecución de las mismas.</w:t>
@@ -12489,7 +12654,7 @@
           <w:color w:val="000000" w:themeColor="text1"/>
           <w:sz w:val="24"/>
           <w:szCs w:val="24"/>
-          <w:u w:val="none"/>
+          <w:u w:val="single"/>
           <w:lang w:val="es-SV" w:eastAsia="es-SV"/>
         </w:rPr>
         <w:t>Supervisar que la gestión de continuidad del negocio sea efectiva y que se realice el análisis de impacto al negocio, identificando y priorizando los procesos críticos de la entidad.</w:t>
@@ -12533,7 +12698,7 @@
           <w:color w:val="000000" w:themeColor="text1"/>
           <w:sz w:val="24"/>
           <w:szCs w:val="24"/>
-          <w:u w:val="none"/>
+          <w:u w:val="single"/>
           <w:lang w:val="es-SV" w:eastAsia="es-SV"/>
         </w:rPr>
         <w:t>Apoyar en la implementación de la Gestión de Continuidad del Negocio</w:t>
@@ -12577,7 +12742,7 @@
           <w:color w:val="000000" w:themeColor="text1"/>
           <w:sz w:val="24"/>
           <w:szCs w:val="24"/>
-          <w:u w:val="none"/>
+          <w:u w:val="single"/>
           <w:lang w:val="es-SV" w:eastAsia="es-SV"/>
         </w:rPr>
         <w:t>Proponer al Consejo de Administración la estructura del Sistema de Gestión de la Seguridad de la Información.</w:t>
@@ -12621,7 +12786,7 @@
           <w:color w:val="000000" w:themeColor="text1"/>
           <w:sz w:val="24"/>
           <w:szCs w:val="24"/>
-          <w:u w:val="none"/>
+          <w:u w:val="single"/>
           <w:lang w:val="es-SV" w:eastAsia="es-SV"/>
         </w:rPr>
         <w:t>Revisar, evaluar y proponer para aprobación del Consejo de Administración el programa y recursos de seguridad de la información.</w:t>
@@ -12665,7 +12830,7 @@
           <w:color w:val="000000" w:themeColor="text1"/>
           <w:sz w:val="24"/>
           <w:szCs w:val="24"/>
-          <w:u w:val="none"/>
+          <w:u w:val="single"/>
           <w:lang w:val="es-SV" w:eastAsia="es-SV"/>
         </w:rPr>
         <w:t>Validar las políticas, metodologías, manual de controles y métricas que permitan revisar y monitorear la seguridad de la información y posteriormente someterlo a aprobación del Consejo de Administración.</w:t>
@@ -12709,7 +12874,7 @@
           <w:color w:val="000000" w:themeColor="text1"/>
           <w:sz w:val="24"/>
           <w:szCs w:val="24"/>
-          <w:u w:val="none"/>
+          <w:u w:val="single"/>
           <w:lang w:val="es-SV" w:eastAsia="es-SV"/>
         </w:rPr>
         <w:t>Dar seguimiento de la Gestión de la Seguridad de la Información y Continuidad del Negocio.</w:t>
@@ -12759,7 +12924,7 @@
           <w:color w:val="000000" w:themeColor="text1"/>
           <w:sz w:val="24"/>
           <w:szCs w:val="24"/>
-          <w:u w:val="none"/>
+          <w:u w:val="single"/>
           <w:lang w:val="es-SV" w:eastAsia="es-SV"/>
         </w:rPr>
         <w:t>Evaluar los riesgos que puedan afectar la capacidad financiera y operativa de la Cooperativa y contribuir a la definición de Planes de Acción para mitigarlos o prevenirlos.</w:t>
@@ -12791,7 +12956,7 @@
           <w:color w:val="000000" w:themeColor="text1"/>
           <w:sz w:val="24"/>
           <w:szCs w:val="24"/>
-          <w:u w:val="none"/>
+          <w:u w:val="single"/>
           <w:lang w:val="es-SV" w:eastAsia="es-SV"/>
         </w:rPr>
         <w:t>Analizar los riesgos que puedan derivar en la activación del Plan de Recuperación de la Cooperativa.</w:t>
@@ -12823,7 +12988,7 @@
           <w:color w:val="000000" w:themeColor="text1"/>
           <w:sz w:val="24"/>
           <w:szCs w:val="24"/>
-          <w:u w:val="none"/>
+          <w:u w:val="single"/>
           <w:lang w:val="es-SV" w:eastAsia="es-SV"/>
         </w:rPr>
         <w:t>Evaluar los indicadores definidos para el seguimiento del Plan de Recuperación de la Cooperativa.</w:t>
@@ -12855,7 +13020,7 @@
           <w:color w:val="000000" w:themeColor="text1"/>
           <w:sz w:val="24"/>
           <w:szCs w:val="24"/>
-          <w:u w:val="none"/>
+          <w:u w:val="single"/>
           <w:lang w:val="es-SV" w:eastAsia="es-SV"/>
         </w:rPr>
         <w:t>Apoyar la actualización de escenarios de estrés y medidas de recuperación.</w:t>
@@ -12887,7 +13052,7 @@
           <w:color w:val="000000" w:themeColor="text1"/>
           <w:sz w:val="24"/>
           <w:szCs w:val="24"/>
-          <w:u w:val="none"/>
+          <w:u w:val="single"/>
           <w:lang w:val="es-SV" w:eastAsia="es-SV"/>
         </w:rPr>
         <w:t>Emitir recomendaciones al Consejo de Administración;</w:t>
@@ -12996,7 +13161,7 @@
           <w:color w:val="000000" w:themeColor="text1"/>
           <w:sz w:val="24"/>
           <w:szCs w:val="24"/>
-          <w:u w:val="none"/>
+          <w:u w:val="single"/>
         </w:rPr>
         <w:t>El Comité de Riesgos está integrado por un número impar de Miembros con los siguientes cargos: Directivos del Consejo de Administración: Presidente o su delegado, quien presidirá como Presidente del Comité, Tesorero y Vocal; Presidente de la Junta de Vigilancia o su delegado, Gerente General o su delegado, Auditor Interno, Gerente Legal y de Cumplimiento Normativo, Jefe Departamento de Seguridad de la Información y Ciberseguridad y Jefe Administración de Riesgos quien ocupará el cargo de Secretario del Comité.</w:t>
       </w:r>
@@ -13023,7 +13188,7 @@
           <w:color w:val="000000" w:themeColor="text1"/>
           <w:sz w:val="24"/>
           <w:szCs w:val="24"/>
-          <w:u w:val="none"/>
+          <w:u w:val="single"/>
         </w:rPr>
         <w:t>El Comité de Riesgos será presidido por un Director del Consejo de Administración con conocimiento en finanzas y en gestión de riesgos.</w:t>
       </w:r>
@@ -13050,7 +13215,7 @@
           <w:color w:val="000000" w:themeColor="text1"/>
           <w:sz w:val="24"/>
           <w:szCs w:val="24"/>
-          <w:u w:val="none"/>
+          <w:u w:val="single"/>
         </w:rPr>
         <w:t>Adicionalmente el Comité podrá extender la invitación con derecho a voz, pero sin derecho a voto, a otros Directores del Consejo de Administración, Equipo Gerencial y Empleados de la Cooperativa que considere conveniente, que por su conocimiento y experiencia en los diferentes puntos que conocerá el Comité en sus sesiones, aportarán información relevante o apoyarán la gestión.</w:t>
       </w:r>
@@ -13077,7 +13242,7 @@
           <w:color w:val="000000" w:themeColor="text1"/>
           <w:sz w:val="24"/>
           <w:szCs w:val="24"/>
-          <w:u w:val="none"/>
+          <w:u w:val="single"/>
         </w:rPr>
         <w:t>Los requisitos para ser miembro del Comité de Riesgos se detallan en Anexo 5 y que forma parte integrante de este Código.</w:t>
       </w:r>
@@ -13196,7 +13361,7 @@
           <w:color w:val="000000" w:themeColor="text1"/>
           <w:sz w:val="24"/>
           <w:szCs w:val="24"/>
-          <w:u w:val="none"/>
+          <w:u w:val="single"/>
         </w:rPr>
         <w:t>El Comité de Riesgos podrá reunirse, de acuerdo a como lo convengan de la siguiente forma:</w:t>
       </w:r>
@@ -13227,7 +13392,7 @@
           <w:color w:val="000000" w:themeColor="text1"/>
           <w:sz w:val="24"/>
           <w:szCs w:val="24"/>
-          <w:u w:val="none"/>
+          <w:u w:val="single"/>
         </w:rPr>
         <w:t>En reuniones presenciales en las instalaciones del Centro Financiero de la Cooperativa, en la hora y día designado por el Consejo de Administración.</w:t>
       </w:r>
@@ -13258,7 +13423,7 @@
           <w:color w:val="000000" w:themeColor="text1"/>
           <w:sz w:val="24"/>
           <w:szCs w:val="24"/>
-          <w:u w:val="none"/>
+          <w:u w:val="single"/>
         </w:rPr>
         <w:t>Reuniones a través de videoconferencias por diferentes medios tecnológicos que permitan la identificación y participación del miembro en la sesión, no obstante, los acuerdos y resoluciones que sean tomados deberán documentarse, de conformidad a lo establecido en el Art. 13 del Reglamento.</w:t>
       </w:r>
@@ -13289,7 +13454,7 @@
           <w:color w:val="000000" w:themeColor="text1"/>
           <w:sz w:val="24"/>
           <w:szCs w:val="24"/>
-          <w:u w:val="none"/>
+          <w:u w:val="single"/>
         </w:rPr>
         <w:t>No obstante, en las reuniones presenciales cuando alguno de los miembros del Comité se encontraren en lugares distintos o en situaciones que le imposibiliten reunirse en las instalaciones del Centro Financiero de la Cooperativa, podrá sesionar a través de videoconferencia con los medios tecnológicos disponibles.</w:t>
       </w:r>
@@ -13320,7 +13485,7 @@
           <w:color w:val="000000" w:themeColor="text1"/>
           <w:sz w:val="24"/>
           <w:szCs w:val="24"/>
-          <w:u w:val="none"/>
+          <w:u w:val="single"/>
         </w:rPr>
         <w:t>El Gerente General gestionará ante el Consejo de Administración la convocatoria a reunión ordinaria y extraordinaria del Comité de Riesgos.</w:t>
       </w:r>
@@ -13351,7 +13516,7 @@
           <w:color w:val="000000" w:themeColor="text1"/>
           <w:sz w:val="24"/>
           <w:szCs w:val="24"/>
-          <w:u w:val="none"/>
+          <w:u w:val="single"/>
         </w:rPr>
         <w:t>Para las reuniones del Comité se establecerá quórum con la asistenciá minima de tres de sus miembros, pero siempre deberá contar con la presencia de un Miembro del Consejo de Administración, Junta de Vigilancia, Gerente General o sus delegados.</w:t>
       </w:r>
@@ -13382,7 +13547,7 @@
           <w:color w:val="000000" w:themeColor="text1"/>
           <w:sz w:val="24"/>
           <w:szCs w:val="24"/>
-          <w:u w:val="none"/>
+          <w:u w:val="single"/>
         </w:rPr>
         <w:t>El Presidente del Consejo de Administración, Presidente de Junta de Vigilancia o el Gerente General en caso de imposibilidad de asistencia, pueden informar por escrito o mediante correo electrónico a sus delegados, comunicando la designación al Gerente General o Secretario del Comité.</w:t>
       </w:r>
@@ -13413,7 +13578,7 @@
           <w:color w:val="000000" w:themeColor="text1"/>
           <w:sz w:val="24"/>
           <w:szCs w:val="24"/>
-          <w:u w:val="none"/>
+          <w:u w:val="single"/>
         </w:rPr>
         <w:t>Los temas a tratar en el Comité de Riesgos deberán quedar asentados en una agenda propuesta por el Jefe de Administración de Riesgos, la cual será aprobada por el Comité.</w:t>
       </w:r>
@@ -13444,7 +13609,7 @@
           <w:color w:val="000000" w:themeColor="text1"/>
           <w:sz w:val="24"/>
           <w:szCs w:val="24"/>
-          <w:u w:val="none"/>
+          <w:u w:val="single"/>
         </w:rPr>
         <w:t>De las sesiones que celebre el Comité, se levantará acta y estará a disposición de los Directores del Consejo de Administración.</w:t>
       </w:r>
@@ -13475,7 +13640,7 @@
           <w:color w:val="000000" w:themeColor="text1"/>
           <w:sz w:val="24"/>
           <w:szCs w:val="24"/>
-          <w:u w:val="none"/>
+          <w:u w:val="single"/>
         </w:rPr>
         <w:t>Las actas serán suscritas por los miembros asistentes, las cuales deberán ser numeradas de forma secuencial y redactadas en forma clara y detallada para comprender los fundamentos de los acuerdos tomados y de los temas conocidos.</w:t>
       </w:r>
@@ -13506,7 +13671,7 @@
           <w:color w:val="000000" w:themeColor="text1"/>
           <w:sz w:val="24"/>
           <w:szCs w:val="24"/>
-          <w:u w:val="none"/>
+          <w:u w:val="single"/>
         </w:rPr>
         <w:t>La elaboración, difusión y resguardo de las actas será llevada a cabo por el Jefe de Administración de Riesgos.</w:t>
       </w:r>
@@ -13537,7 +13702,7 @@
           <w:color w:val="000000" w:themeColor="text1"/>
           <w:sz w:val="24"/>
           <w:szCs w:val="24"/>
-          <w:u w:val="none"/>
+          <w:u w:val="single"/>
         </w:rPr>
         <w:t>El contenido del Acta debe ser aprobado en la sesión del Comité de Riesgos inmediata posterior.</w:t>
       </w:r>
@@ -13568,7 +13733,7 @@
           <w:color w:val="000000" w:themeColor="text1"/>
           <w:sz w:val="24"/>
           <w:szCs w:val="24"/>
-          <w:u w:val="none"/>
+          <w:u w:val="single"/>
         </w:rPr>
         <w:t>Los acuerdos se tomarán por consenso o mayoría</w:t>
       </w:r>
@@ -13599,7 +13764,7 @@
           <w:color w:val="000000" w:themeColor="text1"/>
           <w:sz w:val="24"/>
           <w:szCs w:val="24"/>
-          <w:u w:val="none"/>
+          <w:u w:val="single"/>
         </w:rPr>
         <w:t>El Presidente del Consejo de Administración, tendrá doble voto en caso de empate.</w:t>
       </w:r>
@@ -13630,7 +13795,7 @@
           <w:color w:val="000000" w:themeColor="text1"/>
           <w:sz w:val="24"/>
           <w:szCs w:val="24"/>
-          <w:u w:val="none"/>
+          <w:u w:val="single"/>
         </w:rPr>
         <w:t>El Jefe de Administración de Riesgos llevará un control de los acuerdos adoptados por el Comité de Riesgos con las siguientes especificaciones: fecha y numero de sesión, acuerdo adoptado, responsables de su cumplimiento, gestión, fecha de gestión y estado.</w:t>
       </w:r>
@@ -13661,7 +13826,7 @@
           <w:color w:val="000000" w:themeColor="text1"/>
           <w:sz w:val="24"/>
           <w:szCs w:val="24"/>
-          <w:u w:val="none"/>
+          <w:u w:val="single"/>
         </w:rPr>
         <w:t>En cada sesión se dará a conocer los avances que presenten los acuerdos pendientes.</w:t>
       </w:r>
@@ -13692,7 +13857,7 @@
           <w:color w:val="000000" w:themeColor="text1"/>
           <w:sz w:val="24"/>
           <w:szCs w:val="24"/>
-          <w:u w:val="none"/>
+          <w:u w:val="single"/>
         </w:rPr>
         <w:t>Se informará semestralmente al Consejo de Administración un resumen de los aspectos más importantes sobre los cuales ha conocido y tomado decisión el Comité y deberá quedar asentado en el acta de la sesión que celebre el Consejo de Administración.</w:t>
       </w:r>
@@ -13741,7 +13906,7 @@
           <w:color w:val="000000" w:themeColor="text1"/>
           <w:sz w:val="24"/>
           <w:szCs w:val="24"/>
-          <w:u w:val="none"/>
+          <w:u w:val="single"/>
         </w:rPr>
         <w:t>JUNTA DE</w:t>
       </w:r>
@@ -13763,7 +13928,7 @@
           <w:color w:val="000000" w:themeColor="text1"/>
           <w:sz w:val="24"/>
           <w:szCs w:val="24"/>
-          <w:u w:val="none"/>
+          <w:u w:val="single"/>
         </w:rPr>
         <w:t>LDA/FT/FPADM</w:t>
       </w:r>
@@ -13890,7 +14055,7 @@
           <w:color w:val="000000" w:themeColor="text1"/>
           <w:sz w:val="24"/>
           <w:szCs w:val="24"/>
-          <w:u w:val="none"/>
+          <w:u w:val="single"/>
         </w:rPr>
         <w:t>apoyo a la Gerencia de Oficialía de Cumplimiento, en materia de prevención del Lavado de Dinero y Activos, Financiamiento del Terrorismo y la Financiación de la Proliferación de Armas de Destrucción Masiva, y servir de</w:t>
       </w:r>
@@ -13910,7 +14075,7 @@
           <w:color w:val="000000" w:themeColor="text1"/>
           <w:sz w:val="24"/>
           <w:szCs w:val="24"/>
-          <w:u w:val="none"/>
+          <w:u w:val="single"/>
         </w:rPr>
         <w:t>la Gerencia de</w:t>
       </w:r>
@@ -13960,7 +14125,7 @@
           <w:color w:val="000000" w:themeColor="text1"/>
           <w:sz w:val="24"/>
           <w:szCs w:val="24"/>
-          <w:u w:val="none"/>
+          <w:u w:val="single"/>
         </w:rPr>
         <w:t>Función Principal: Apoyar y vigilar la labor de la Gerencia de Oficialía de Cumplimiento, para el control y seguimiento de las políticas y procedimientos establecidos para el cumplimiento del marco regulatorio de lavado de dinero y activos, financiamiento del terrorismo y la financiación de la proliferación de armas de destrucción masiva.</w:t>
       </w:r>
@@ -14094,7 +14259,7 @@
           <w:color w:val="000000" w:themeColor="text1"/>
           <w:sz w:val="24"/>
           <w:szCs w:val="24"/>
-          <w:u w:val="none"/>
+          <w:u w:val="single"/>
         </w:rPr>
         <w:t>Instruir</w:t>
       </w:r>
@@ -14104,7 +14269,7 @@
           <w:color w:val="000000" w:themeColor="text1"/>
           <w:sz w:val="24"/>
           <w:szCs w:val="24"/>
-          <w:u w:val="none"/>
+          <w:u w:val="single"/>
         </w:rPr>
         <w:t xml:space="preserve"> </w:t>
       </w:r>
@@ -14124,7 +14289,7 @@
           <w:color w:val="000000" w:themeColor="text1"/>
           <w:sz w:val="24"/>
           <w:szCs w:val="24"/>
-          <w:u w:val="none"/>
+          <w:u w:val="single"/>
         </w:rPr>
         <w:t>de la Cooperativa</w:t>
       </w:r>
@@ -14134,7 +14299,7 @@
           <w:color w:val="000000" w:themeColor="text1"/>
           <w:sz w:val="24"/>
           <w:szCs w:val="24"/>
-          <w:u w:val="none"/>
+          <w:u w:val="single"/>
         </w:rPr>
         <w:t xml:space="preserve"/>
       </w:r>
@@ -14144,7 +14309,7 @@
           <w:color w:val="000000" w:themeColor="text1"/>
           <w:sz w:val="24"/>
           <w:szCs w:val="24"/>
-          <w:u w:val="none"/>
+          <w:u w:val="single"/>
         </w:rPr>
         <w:t xml:space="preserve"> </w:t>
       </w:r>
@@ -14154,7 +14319,7 @@
           <w:color w:val="000000" w:themeColor="text1"/>
           <w:sz w:val="24"/>
           <w:szCs w:val="24"/>
-          <w:u w:val="none"/>
+          <w:u w:val="single"/>
         </w:rPr>
         <w:t>en materia</w:t>
       </w:r>
@@ -14174,7 +14339,7 @@
           <w:color w:val="000000" w:themeColor="text1"/>
           <w:sz w:val="24"/>
           <w:szCs w:val="24"/>
-          <w:u w:val="none"/>
+          <w:u w:val="single"/>
         </w:rPr>
         <w:t>LDA/FT/FPADM, mediante acuerdos o modificaciones</w:t>
       </w:r>
@@ -14251,7 +14416,7 @@
           <w:color w:val="000000" w:themeColor="text1"/>
           <w:sz w:val="24"/>
           <w:szCs w:val="24"/>
-          <w:u w:val="none"/>
+          <w:u w:val="single"/>
         </w:rPr>
         <w:t>Dar seguimiento a la gestión que realiza la Gerencia</w:t>
       </w:r>
@@ -14327,7 +14492,7 @@
           <w:color w:val="000000" w:themeColor="text1"/>
           <w:sz w:val="24"/>
           <w:szCs w:val="24"/>
-          <w:u w:val="none"/>
+          <w:u w:val="single"/>
         </w:rPr>
         <w:t>Conocer las deficiencias al programa de prevención, detectadas por la Gerencia de Oficialía de Cumplimiento; así como las acciones o medidas correctivas que se hayan implementado para tales efectos.</w:t>
       </w:r>
@@ -14374,7 +14539,7 @@
           <w:color w:val="000000" w:themeColor="text1"/>
           <w:sz w:val="24"/>
           <w:szCs w:val="24"/>
-          <w:u w:val="none"/>
+          <w:u w:val="single"/>
         </w:rPr>
         <w:t xml:space="preserve"/>
       </w:r>
@@ -14384,7 +14549,7 @@
           <w:color w:val="000000" w:themeColor="text1"/>
           <w:sz w:val="24"/>
           <w:szCs w:val="24"/>
-          <w:u w:val="none"/>
+          <w:u w:val="single"/>
         </w:rPr>
         <w:t>Revisar la ejecución del Plan Anual de Capacitación, que involucre a todo el personal de la Cooperativa y que, además, incluya la capacitación especializada para el personal de la Oficialía de Cumplimiento en temas de LDA/FT/FPADM.</w:t>
       </w:r>
@@ -14430,7 +14595,7 @@
           <w:color w:val="000000" w:themeColor="text1"/>
           <w:sz w:val="24"/>
           <w:szCs w:val="24"/>
-          <w:u w:val="none"/>
+          <w:u w:val="single"/>
         </w:rPr>
         <w:t xml:space="preserve">Revisar que el enfoque de la Gerencia de Oficialía de Cumplimiento, además de fortalecer la estructura de control interno, esté orientado a la prevención y gestión de riesgos de LDA/FT/FPADM.</w:t>
       </w:r>
@@ -14477,7 +14642,7 @@
           <w:color w:val="000000" w:themeColor="text1"/>
           <w:sz w:val="24"/>
           <w:szCs w:val="24"/>
-          <w:u w:val="none"/>
+          <w:u w:val="single"/>
         </w:rPr>
         <w:t xml:space="preserve"/>
       </w:r>
@@ -14487,7 +14652,7 @@
           <w:color w:val="000000" w:themeColor="text1"/>
           <w:sz w:val="24"/>
           <w:szCs w:val="24"/>
-          <w:u w:val="none"/>
+          <w:u w:val="single"/>
         </w:rPr>
         <w:t>Revisar por lo menos cada tres años, la estructura organizativa de la Gerencia de Oficialía de Cumplimiento, en cuanto a recurso humano, en relación proporcional al tamaño de la Cooperativa, cantidad de clientes, productos y servicios, así como la operatividad que tenga la misma, para determinar la necesidad de mayores recursos a fin de mitigar los riesgos derivados de LDA/FT/FPADM.</w:t>
       </w:r>
@@ -14528,7 +14693,7 @@
           <w:color w:val="000000" w:themeColor="text1"/>
           <w:sz w:val="24"/>
           <w:szCs w:val="24"/>
-          <w:u w:val="none"/>
+          <w:u w:val="single"/>
         </w:rPr>
         <w:t>Promover y garantizar la independencia y autonomía de la Gerencia de Oficialía de Cumplimiento dentro de la Cooperativa.</w:t>
       </w:r>
@@ -14569,7 +14734,7 @@
           <w:color w:val="000000" w:themeColor="text1"/>
           <w:sz w:val="24"/>
           <w:szCs w:val="24"/>
-          <w:u w:val="none"/>
+          <w:u w:val="single"/>
         </w:rPr>
         <w:t xml:space="preserve">Asegurarse que la Gerencia de Oficialía de Cumplimiento tenga acceso irrestricto a toda la información y documentación que maneja la Cooperativa relacionada con el LDA/FT/FPADM.</w:t>
       </w:r>
@@ -14610,7 +14775,7 @@
           <w:color w:val="000000" w:themeColor="text1"/>
           <w:sz w:val="24"/>
           <w:szCs w:val="24"/>
-          <w:u w:val="none"/>
+          <w:u w:val="single"/>
         </w:rPr>
         <w:t xml:space="preserve">Sesionar, de acuerdo con la periodicidad establecida en el presente Reglamento, con el objetivo de supervisar el desarrollo de las actividades realizadas por la Gerencia de Oficialía de Cumplimiento.</w:t>
       </w:r>
@@ -14651,7 +14816,7 @@
           <w:color w:val="000000" w:themeColor="text1"/>
           <w:sz w:val="24"/>
           <w:szCs w:val="24"/>
-          <w:u w:val="none"/>
+          <w:u w:val="single"/>
         </w:rPr>
         <w:t>Conocer las revisiones de auditoría interna, externa y entes reguladores realizadas a la Gerencia de Oficialía de Cumplimiento, así como de los hallazgos señalados para su debida atención y seguimiento hasta su finalización.</w:t>
       </w:r>
@@ -14692,7 +14857,7 @@
           <w:color w:val="000000" w:themeColor="text1"/>
           <w:sz w:val="24"/>
           <w:szCs w:val="24"/>
-          <w:u w:val="none"/>
+          <w:u w:val="single"/>
         </w:rPr>
         <w:t>Las funciones específicas que le sean delegadas por el Consejo de Administración en el Código de Gobierno Corporativo.</w:t>
       </w:r>
@@ -14733,7 +14898,7 @@
           <w:color w:val="000000" w:themeColor="text1"/>
           <w:sz w:val="24"/>
           <w:szCs w:val="24"/>
-          <w:u w:val="none"/>
+          <w:u w:val="single"/>
         </w:rPr>
         <w:t>El presidente del Comité de PLDA/FT/FPADM tendrá las siguientes funciones:</w:t>
       </w:r>
@@ -14763,7 +14928,7 @@
           <w:color w:val="000000" w:themeColor="text1"/>
           <w:sz w:val="24"/>
           <w:szCs w:val="24"/>
-          <w:u w:val="none"/>
+          <w:u w:val="single"/>
         </w:rPr>
         <w:t>Dar por abierta la sesión y dirigir las presentaciones y deliberaciones.</w:t>
       </w:r>
@@ -14793,7 +14958,7 @@
           <w:color w:val="000000" w:themeColor="text1"/>
           <w:sz w:val="24"/>
           <w:szCs w:val="24"/>
-          <w:u w:val="none"/>
+          <w:u w:val="single"/>
         </w:rPr>
         <w:t>Solicitar cambiar el orden de la agenda cuando sea requerido.</w:t>
       </w:r>
@@ -14823,7 +14988,7 @@
           <w:color w:val="000000" w:themeColor="text1"/>
           <w:sz w:val="24"/>
           <w:szCs w:val="24"/>
-          <w:u w:val="none"/>
+          <w:u w:val="single"/>
         </w:rPr>
         <w:t>Coordinar el Comité para desarrollar sus actividades de una manera armónica con la participación de los miembros.</w:t>
       </w:r>
@@ -14853,7 +15018,7 @@
           <w:color w:val="000000" w:themeColor="text1"/>
           <w:sz w:val="24"/>
           <w:szCs w:val="24"/>
-          <w:u w:val="none"/>
+          <w:u w:val="single"/>
         </w:rPr>
         <w:t>Procurar que los miembros cuenten con la información y los elementos necesarios para el mejor desempeño de sus funciones.</w:t>
       </w:r>
@@ -14883,7 +15048,7 @@
           <w:color w:val="000000" w:themeColor="text1"/>
           <w:sz w:val="24"/>
           <w:szCs w:val="24"/>
-          <w:u w:val="none"/>
+          <w:u w:val="single"/>
         </w:rPr>
         <w:t>Velar por que, en el desarrollo de cada punto, se destine el tiempo suficiente para el análisis detallado de cada uno de ellos.</w:t>
       </w:r>
@@ -14909,7 +15074,7 @@
           <w:color w:val="000000" w:themeColor="text1"/>
           <w:sz w:val="24"/>
           <w:szCs w:val="24"/>
-          <w:u w:val="none"/>
+          <w:u w:val="single"/>
         </w:rPr>
         <w:t>Las funciones del presidente podrán ser ampliadas a solicitud del Consejo de Administración.</w:t>
       </w:r>
@@ -14935,7 +15100,7 @@
           <w:color w:val="000000" w:themeColor="text1"/>
           <w:sz w:val="24"/>
           <w:szCs w:val="24"/>
-          <w:u w:val="none"/>
+          <w:u w:val="single"/>
         </w:rPr>
         <w:t>El Gerente de Oficialía de Cumplimiento será el secretario del Comité de PLDA/FT/FPADM, y tendrá al menos las siguientes funciones:</w:t>
       </w:r>
@@ -14965,7 +15130,7 @@
           <w:color w:val="000000" w:themeColor="text1"/>
           <w:sz w:val="24"/>
           <w:szCs w:val="24"/>
-          <w:u w:val="none"/>
+          <w:u w:val="single"/>
         </w:rPr>
         <w:t>Convocar a sesión de Comité de PLDA/FT/FPADM;</w:t>
       </w:r>
@@ -14995,7 +15160,7 @@
           <w:color w:val="000000" w:themeColor="text1"/>
           <w:sz w:val="24"/>
           <w:szCs w:val="24"/>
-          <w:u w:val="none"/>
+          <w:u w:val="single"/>
         </w:rPr>
         <w:t>Elaborar la agenda de cada sesión de Comité y respaldarla con la información y documentos que sean necesarios para desarrollarla;</w:t>
       </w:r>
@@ -15025,7 +15190,7 @@
           <w:color w:val="000000" w:themeColor="text1"/>
           <w:sz w:val="24"/>
           <w:szCs w:val="24"/>
-          <w:u w:val="none"/>
+          <w:u w:val="single"/>
         </w:rPr>
         <w:t>Verificar el quórum de asistencia a cada sesión;</w:t>
       </w:r>
@@ -15055,7 +15220,7 @@
           <w:color w:val="000000" w:themeColor="text1"/>
           <w:sz w:val="24"/>
           <w:szCs w:val="24"/>
-          <w:u w:val="none"/>
+          <w:u w:val="single"/>
         </w:rPr>
         <w:t>Documentar formalmente en las actas que el Comité de PLDA/FT/FPADM, lleve para tal fin, el desarrollo de las sesiones, seguimiento de los acuerdos girados, documentos anexos, así como resguardar el archivo digital y físico de las sesiones y de los documentos e información que respaldará la agenda vista en cada sesión.</w:t>
       </w:r>
@@ -15085,7 +15250,7 @@
           <w:color w:val="000000" w:themeColor="text1"/>
           <w:sz w:val="24"/>
           <w:szCs w:val="24"/>
-          <w:u w:val="none"/>
+          <w:u w:val="single"/>
         </w:rPr>
         <w:t>Imprimir las actas y gestionar las firmas correspondientes;</w:t>
       </w:r>
@@ -15115,7 +15280,7 @@
           <w:color w:val="000000" w:themeColor="text1"/>
           <w:sz w:val="24"/>
           <w:szCs w:val="24"/>
-          <w:u w:val="none"/>
+          <w:u w:val="single"/>
         </w:rPr>
         <w:t>Emitir certificaciones de puntos de acta.</w:t>
       </w:r>
@@ -15141,7 +15306,7 @@
           <w:color w:val="000000" w:themeColor="text1"/>
           <w:sz w:val="24"/>
           <w:szCs w:val="24"/>
-          <w:u w:val="none"/>
+          <w:u w:val="single"/>
         </w:rPr>
         <w:t>Cada miembro del Comité de PLDA/FT/FPADM, tendrá los siguientes deberes y obligaciones:</w:t>
       </w:r>
@@ -15171,7 +15336,7 @@
           <w:color w:val="000000" w:themeColor="text1"/>
           <w:sz w:val="24"/>
           <w:szCs w:val="24"/>
-          <w:u w:val="none"/>
+          <w:u w:val="single"/>
         </w:rPr>
         <w:t>Abstenerse de opinar sobre temas en lo que considere que existe conflicto de interés.</w:t>
       </w:r>
@@ -15201,7 +15366,7 @@
           <w:color w:val="000000" w:themeColor="text1"/>
           <w:sz w:val="24"/>
           <w:szCs w:val="24"/>
-          <w:u w:val="none"/>
+          <w:u w:val="single"/>
         </w:rPr>
         <w:t>Mantenerse debidamente informado respecto a las regulaciones vigentes que rigen los mercados financieros, bancarios y en materia de prevención de lavado de dinero y de activos, financiación del terrorismo y la financiación de la proliferación de armas de destrucción masiva.</w:t>
       </w:r>
@@ -15231,7 +15396,7 @@
           <w:color w:val="000000" w:themeColor="text1"/>
           <w:sz w:val="24"/>
           <w:szCs w:val="24"/>
-          <w:u w:val="none"/>
+          <w:u w:val="single"/>
         </w:rPr>
         <w:t>Abstenerse de utilizar la información que conociera en el ejercicio de sus funciones como miembro del Comité, para obtener beneficio personal o de terceros.</w:t>
       </w:r>
@@ -15261,7 +15426,7 @@
           <w:color w:val="000000" w:themeColor="text1"/>
           <w:sz w:val="24"/>
           <w:szCs w:val="24"/>
-          <w:u w:val="none"/>
+          <w:u w:val="single"/>
         </w:rPr>
         <w:t>Velar por el estricto cumplimiento de los procedimientos establecidos en este reglamento.</w:t>
       </w:r>
@@ -15291,7 +15456,7 @@
           <w:color w:val="000000" w:themeColor="text1"/>
           <w:sz w:val="24"/>
           <w:szCs w:val="24"/>
-          <w:u w:val="none"/>
+          <w:u w:val="single"/>
         </w:rPr>
         <w:t>Emitir sus puntos de vista, sugerencias y hacer las advertencias necesarias en cada caso, pudiendo solicitar que éstos queden asentados en las actas, para dar cumplimiento a las responsabilidades que le impone el marco normativo legal en prevención de LDA/FT/FPADM.</w:t>
       </w:r>
@@ -15369,7 +15534,7 @@
           <w:color w:val="000000" w:themeColor="text1"/>
           <w:sz w:val="24"/>
           <w:szCs w:val="24"/>
-          <w:u w:val="none"/>
+          <w:u w:val="single"/>
         </w:rPr>
         <w:t>El Comité estará conformado por los siguientes miembros propietarios: el Director presidente del Consejo de Administración, el Tesorero del Consejo de Administración, un Representante de la Junta de Vigilancia, Gerente General, Gerente Legal y Cumplimiento Normativo, Gerente de Operaciones, Gerente de Negocios, Jefe de Administración de Riesgos, Gerente de Oficialía de Cumplimiento y Auditor Interno.</w:t>
       </w:r>
@@ -15394,7 +15559,7 @@
           <w:color w:val="000000" w:themeColor="text1"/>
           <w:sz w:val="24"/>
           <w:szCs w:val="24"/>
-          <w:u w:val="none"/>
+          <w:u w:val="single"/>
         </w:rPr>
         <w:t>Se designa como presidente del Comité, al Director presidente del Consejo de Administración y con el rol de Secretario al Oficial de Cumplimiento.</w:t>
       </w:r>
@@ -15419,7 +15584,7 @@
           <w:color w:val="000000" w:themeColor="text1"/>
           <w:sz w:val="24"/>
           <w:szCs w:val="24"/>
-          <w:u w:val="none"/>
+          <w:u w:val="single"/>
         </w:rPr>
         <w:t>Los requisitos para ser miembro del Comité de Junta de Prevención del LDA/FT/FPADM se detallan en Anexo 6 y que forma parte integrante de este Código.</w:t>
       </w:r>
@@ -15501,7 +15666,7 @@
           <w:color w:val="000000" w:themeColor="text1"/>
           <w:sz w:val="24"/>
           <w:szCs w:val="24"/>
-          <w:u w:val="none"/>
+          <w:u w:val="single"/>
         </w:rPr>
         <w:t>El Comité de PLDA/FT/FPADM, se reunirá ordinariamente al menos de manera trimestral y extraordinariamente cuando sea requerido por cualquier miembro del referido Comité, en ambos casos, puede sesionar de forma presencial o virtual.</w:t>
       </w:r>
@@ -16359,7 +16524,7 @@
           <w:color w:val="000000" w:themeColor="text1"/>
           <w:sz w:val="24"/>
           <w:szCs w:val="24"/>
-          <w:u w:val="none"/>
+          <w:u w:val="single"/>
         </w:rPr>
         <w:t>reúnen los requisitos establecidos en el Art. 6 de este reglamento, y que</w:t>
       </w:r>
@@ -16379,7 +16544,7 @@
           <w:color w:val="000000" w:themeColor="text1"/>
           <w:sz w:val="24"/>
           <w:szCs w:val="24"/>
-          <w:u w:val="none"/>
+          <w:u w:val="single"/>
         </w:rPr>
         <w:t xml:space="preserve">DE R.L.</w:t>
       </w:r>
@@ -16389,7 +16554,7 @@
           <w:color w:val="000000" w:themeColor="text1"/>
           <w:sz w:val="24"/>
           <w:szCs w:val="24"/>
-          <w:u w:val="none"/>
+          <w:u w:val="single"/>
         </w:rPr>
         <w:t>;</w:t>
       </w:r>
@@ -16409,7 +16574,7 @@
           <w:color w:val="000000" w:themeColor="text1"/>
           <w:sz w:val="24"/>
           <w:szCs w:val="24"/>
-          <w:u w:val="none"/>
+          <w:u w:val="single"/>
         </w:rPr>
         <w:t>en el Art. 6</w:t>
       </w:r>
@@ -16542,7 +16707,7 @@
           <w:color w:val="000000" w:themeColor="text1"/>
           <w:sz w:val="24"/>
           <w:szCs w:val="24"/>
-          <w:u w:val="none"/>
+          <w:u w:val="single"/>
         </w:rPr>
         <w:t>Los cargos de presidente y secretario de dicho Comité, serán desempeñados por el Presidente y Secretario del Consejo de Administración, en vigencia respectivamente; el cargo de vocal será desempeñado por el Presidente de la Junta de Vigilancia en vigencia. Asimismo, el Consejo de Administración nombrará a un Primer Suplente, para un período de tres años, para llenar las vacantes que ocurran; y como asesor administrativo, el Jefe de Atención al Asociado y Clientes.</w:t>
       </w:r>
@@ -16568,7 +16733,7 @@
           <w:color w:val="000000" w:themeColor="text1"/>
           <w:sz w:val="24"/>
           <w:szCs w:val="24"/>
-          <w:u w:val="none"/>
+          <w:u w:val="single"/>
         </w:rPr>
         <w:t>Los suplentes concurrirán a las sesiones del Comité únicamente con voz, excepto cuando suplan a los propietarios en cuyo caso tendrán voto.</w:t>
       </w:r>
@@ -16594,7 +16759,7 @@
           <w:color w:val="000000" w:themeColor="text1"/>
           <w:sz w:val="24"/>
           <w:szCs w:val="24"/>
-          <w:u w:val="none"/>
+          <w:u w:val="single"/>
         </w:rPr>
         <w:t>Los requisitos para ser miembro del Comité de Fondo de Solidaridad se detallan en Anexo 6 y que forma parte integrante de éste Código.</w:t>
       </w:r>
@@ -16690,7 +16855,7 @@
         <w:rPr>
           <w:rFonts w:ascii="Arial" w:hAnsi="Arial" w:cs="Arial"/>
           <w:color w:val="000000" w:themeColor="text1"/>
-          <w:u w:val="none"/>
+          <w:u w:val="single"/>
         </w:rPr>
         <w:t>Sus resoluciones se tomarán por mayoría de votos.</w:t>
       </w:r>
@@ -16713,7 +16878,7 @@
         <w:rPr>
           <w:rFonts w:ascii="Arial" w:hAnsi="Arial" w:cs="Arial"/>
           <w:color w:val="000000" w:themeColor="text1"/>
-          <w:u w:val="none"/>
+          <w:u w:val="single"/>
         </w:rPr>
         <w:t>En caso de empate el presidente o quien haga sus veces tendrá voto de calidad.</w:t>
       </w:r>
@@ -16736,7 +16901,7 @@
         <w:rPr>
           <w:rFonts w:ascii="Arial" w:hAnsi="Arial" w:cs="Arial"/>
           <w:color w:val="000000" w:themeColor="text1"/>
-          <w:u w:val="none"/>
+          <w:u w:val="single"/>
         </w:rPr>
         <w:t>La presencia de dos de sus miembros constituirá quórum, ya sean propietarios o suplentes.</w:t>
       </w:r>
@@ -16759,7 +16924,7 @@
         <w:rPr>
           <w:rFonts w:ascii="Arial" w:hAnsi="Arial" w:cs="Arial"/>
           <w:color w:val="000000" w:themeColor="text1"/>
-          <w:u w:val="none"/>
+          <w:u w:val="single"/>
         </w:rPr>
         <w:t>El Secretario del Comité o quien haga sus veces, llevará el libro de Actas respectivo.</w:t>
       </w:r>
@@ -16791,7 +16956,7 @@
           <w:bCs/>
           <w:color w:val="000000" w:themeColor="text1"/>
           <w:szCs w:val="24"/>
-          <w:u w:val="none"/>
+          <w:u w:val="single"/>
         </w:rPr>
         <w:t>NORMAS GENERALES DE APLICACIÓN PARA TODOS LOS COMITÉS</w:t>
       </w:r>
@@ -16820,7 +16985,7 @@
           <w:color w:val="000000" w:themeColor="text1"/>
           <w:sz w:val="24"/>
           <w:szCs w:val="24"/>
-          <w:u w:val="none"/>
+          <w:u w:val="single"/>
         </w:rPr>
         <w:t>La convocatoria a participar en los Comités se comunicará al menos con un día de anticipación, ya sea vía escrita, correo electrónico o cualquier otro medio que la tecnología lo permita.</w:t>
       </w:r>
@@ -16849,7 +17014,7 @@
           <w:color w:val="000000" w:themeColor="text1"/>
           <w:sz w:val="24"/>
           <w:szCs w:val="24"/>
-          <w:u w:val="none"/>
+          <w:u w:val="single"/>
         </w:rPr>
         <w:t>Confirmar vía telefónica, por escrito, correo electrónico o cualquier otro medio que la tecnología permita, la confirmación de asistencia o ausencia a la sesión de comité.</w:t>
       </w:r>
@@ -16878,7 +17043,7 @@
           <w:color w:val="000000" w:themeColor="text1"/>
           <w:sz w:val="24"/>
           <w:szCs w:val="24"/>
-          <w:u w:val="none"/>
+          <w:u w:val="single"/>
         </w:rPr>
         <w:t>Al inicio de la reunión, la agenda será leída obligatoriamente y sometida a aprobación del Comité con el quórum obligatorio para llevar a cabo la sesión.</w:t>
       </w:r>
@@ -16907,7 +17072,7 @@
           <w:color w:val="000000" w:themeColor="text1"/>
           <w:sz w:val="24"/>
           <w:szCs w:val="24"/>
-          <w:u w:val="none"/>
+          <w:u w:val="single"/>
         </w:rPr>
         <w:t>El Secretario del Comité dará lectura al acta anterior para su ratificación y aprobación.</w:t>
       </w:r>
@@ -16936,7 +17101,7 @@
           <w:color w:val="000000" w:themeColor="text1"/>
           <w:sz w:val="24"/>
           <w:szCs w:val="24"/>
-          <w:u w:val="none"/>
+          <w:u w:val="single"/>
         </w:rPr>
         <w:t>Las actas deberán ser redactadas en forma clara y detallada para comprender los fundamentos de los acuerdos tomados y de los temas conocidos, debiendo implementar un sistema de numeración secuencial de las actas de las reuniones.</w:t>
       </w:r>
@@ -16965,7 +17130,7 @@
           <w:color w:val="000000" w:themeColor="text1"/>
           <w:sz w:val="24"/>
           <w:szCs w:val="24"/>
-          <w:u w:val="none"/>
+          <w:u w:val="single"/>
         </w:rPr>
         <w:t>Las actas de los comités estarán a disposición de los Directores del Consejo de Administración.</w:t>
       </w:r>
@@ -16994,7 +17159,7 @@
           <w:color w:val="000000" w:themeColor="text1"/>
           <w:sz w:val="24"/>
           <w:szCs w:val="24"/>
-          <w:u w:val="none"/>
+          <w:u w:val="single"/>
         </w:rPr>
         <w:t>Un resumen de los aspectos más importantes sobre los cuales ha conocido y tomado decisión cada Comité deberá quedar asentado en el acta de la sesión que celebre el Consejo de Administración en el semestre posterior.</w:t>
       </w:r>
@@ -17023,7 +17188,7 @@
           <w:color w:val="000000" w:themeColor="text1"/>
           <w:sz w:val="24"/>
           <w:szCs w:val="24"/>
-          <w:u w:val="none"/>
+          <w:u w:val="single"/>
         </w:rPr>
         <w:t>De existir hechos relevantes que el Consejo de Administración debe conocer, éste deberá ser presentado por los referidos Comités en la sesión más próxima que celebre el Consejo de Administración.</w:t>
       </w:r>
@@ -17052,7 +17217,7 @@
           <w:color w:val="000000" w:themeColor="text1"/>
           <w:sz w:val="24"/>
           <w:szCs w:val="24"/>
-          <w:u w:val="none"/>
+          <w:u w:val="single"/>
         </w:rPr>
         <w:t>El Secretario del Comité deberá verificar y dar seguimiento al cumplimiento de los acuerdos adoptados por el Comité.</w:t>
       </w:r>
@@ -17081,7 +17246,7 @@
           <w:color w:val="000000" w:themeColor="text1"/>
           <w:sz w:val="24"/>
           <w:szCs w:val="24"/>
-          <w:u w:val="none"/>
+          <w:u w:val="single"/>
         </w:rPr>
         <w:t xml:space="preserve">Los integrantes del Comité no podrán solicitar, invitar o permitir a otros Asociados no autorizados por el Consejo de Administración a que participen en las sesiones, para analizar y discutir puntos específicos. Lo anterior no es aplicable a otros Directores del Consejo de Administración, Equipo Gerencial y Empleados de la Cooperativa que por su conocimiento y experiencia en los diferentes puntos que conocerá el Comité en sus sesiones, aportarán información relevante o apoyarán la gestión, por lo que el Comité podrá extender la invitación con derecho a voz, pero sin derecho a voto.</w:t>
       </w:r>

</xml_diff>

<commit_message>
Informe Relativo a Comités: corrige espacios preservados en texto
Co-Authored-By: Claude Opus 5.5 <noreply@anthropic.com>
Claude-Session: https://claude.ai/code/session_01TjsTNehkj163qWYSaVVmAn
</commit_message>
<xml_diff>
--- a/Informe_Relativo_a_Comites_2024_Version_Final.docx
+++ b/Informe_Relativo_a_Comites_2024_Version_Final.docx
@@ -754,7 +754,7 @@
           <w:u w:val="none"/>
           <w:lang w:eastAsia="es-ES"/>
         </w:rPr>
-        <w:t>INDICE</w:t>
+        <w:t xml:space="preserve">INDICE</w:t>
       </w:r>
     </w:p>
     <w:sdt>
@@ -808,7 +808,7 @@
                 <w:rFonts w:eastAsia="Times New Roman"/>
                 <w:u w:val="none"/>
               </w:rPr>
-              <w:t>INTRODUCCION</w:t>
+              <w:t xml:space="preserve">INTRODUCCION</w:t>
             </w:r>
             <w:r>
               <w:rPr>
@@ -819,7 +819,7 @@
               <w:fldChar w:fldCharType="begin"/>
               <w:instrText xml:space="preserve"> PAGEREF _Toc29569290 \h </w:instrText>
               <w:fldChar w:fldCharType="separate"/>
-              <w:t>4</w:t>
+              <w:t xml:space="preserve">4</w:t>
               <w:fldChar w:fldCharType="end"/>
             </w:r>
           </w:hyperlink>
@@ -840,7 +840,7 @@
                 <w:u w:val="none"/>
                 <w:lang w:val="es-ES_tradnl"/>
               </w:rPr>
-              <w:t>1.</w:t>
+              <w:t xml:space="preserve">1.</w:t>
             </w:r>
             <w:r>
               <w:rPr>
@@ -857,7 +857,7 @@
                 <w:shd w:val="clear" w:color="auto" w:fill="FFFEFF"/>
                 <w:lang w:val="es-ES_tradnl"/>
               </w:rPr>
-              <w:t>COMITÉ DE CRÉDITOS</w:t>
+              <w:t xml:space="preserve">COMITÉ DE CRÉDITOS</w:t>
             </w:r>
             <w:r>
               <w:rPr>
@@ -868,7 +868,7 @@
               <w:fldChar w:fldCharType="begin"/>
               <w:instrText xml:space="preserve"> PAGEREF _Toc29569291 \h </w:instrText>
               <w:fldChar w:fldCharType="separate"/>
-              <w:t>5</w:t>
+              <w:t xml:space="preserve">5</w:t>
               <w:fldChar w:fldCharType="end"/>
             </w:r>
           </w:hyperlink>
@@ -894,7 +894,7 @@
                 <w:szCs w:val="23"/>
                 <w:u w:val="none"/>
               </w:rPr>
-              <w:t>1.1</w:t>
+              <w:t xml:space="preserve">1.1</w:t>
             </w:r>
             <w:r>
               <w:rPr>
@@ -916,7 +916,7 @@
                 <w:szCs w:val="23"/>
                 <w:u w:val="none"/>
               </w:rPr>
-              <w:t>Objetivos</w:t>
+              <w:t xml:space="preserve">Objetivos</w:t>
             </w:r>
             <w:r>
               <w:rPr>
@@ -930,7 +930,7 @@
               <w:fldChar w:fldCharType="begin"/>
               <w:instrText xml:space="preserve"> PAGEREF _Toc29569292 \h </w:instrText>
               <w:fldChar w:fldCharType="separate"/>
-              <w:t>5</w:t>
+              <w:t xml:space="preserve">5</w:t>
               <w:fldChar w:fldCharType="end"/>
             </w:r>
           </w:hyperlink>
@@ -957,7 +957,7 @@
                 <w:szCs w:val="23"/>
                 <w:u w:val="none"/>
               </w:rPr>
-              <w:t>1.2</w:t>
+              <w:t xml:space="preserve">1.2</w:t>
             </w:r>
             <w:r>
               <w:rPr>
@@ -980,7 +980,7 @@
                 <w:szCs w:val="23"/>
                 <w:u w:val="none"/>
               </w:rPr>
-              <w:t>Responsabilidades</w:t>
+              <w:t xml:space="preserve">Responsabilidades</w:t>
             </w:r>
             <w:r>
               <w:rPr>
@@ -994,7 +994,7 @@
               <w:fldChar w:fldCharType="begin"/>
               <w:instrText xml:space="preserve"> PAGEREF _Toc29569293 \h </w:instrText>
               <w:fldChar w:fldCharType="separate"/>
-              <w:t>5</w:t>
+              <w:t xml:space="preserve">5</w:t>
               <w:fldChar w:fldCharType="end"/>
             </w:r>
           </w:hyperlink>
@@ -1021,7 +1021,7 @@
                 <w:szCs w:val="23"/>
                 <w:u w:val="none"/>
               </w:rPr>
-              <w:t>1.3</w:t>
+              <w:t xml:space="preserve">1.3</w:t>
             </w:r>
             <w:r>
               <w:rPr>
@@ -1044,7 +1044,7 @@
                 <w:szCs w:val="23"/>
                 <w:u w:val="none"/>
               </w:rPr>
-              <w:t>Conformación del Comité</w:t>
+              <w:t xml:space="preserve">Conformación del Comité</w:t>
             </w:r>
             <w:r>
               <w:rPr>
@@ -1058,7 +1058,7 @@
               <w:fldChar w:fldCharType="begin"/>
               <w:instrText xml:space="preserve"> PAGEREF _Toc29569294 \h </w:instrText>
               <w:fldChar w:fldCharType="separate"/>
-              <w:t>6</w:t>
+              <w:t xml:space="preserve">6</w:t>
               <w:fldChar w:fldCharType="end"/>
             </w:r>
           </w:hyperlink>
@@ -1085,7 +1085,7 @@
                 <w:szCs w:val="23"/>
                 <w:u w:val="none"/>
               </w:rPr>
-              <w:t>1.4</w:t>
+              <w:t xml:space="preserve">1.4</w:t>
             </w:r>
             <w:r>
               <w:rPr>
@@ -1108,7 +1108,7 @@
                 <w:szCs w:val="23"/>
                 <w:u w:val="none"/>
               </w:rPr>
-              <w:t>Frecuencia de Reuniones</w:t>
+              <w:t xml:space="preserve">Frecuencia de Reuniones</w:t>
             </w:r>
             <w:r>
               <w:rPr>
@@ -1119,7 +1119,7 @@
                 <w:u w:val="none"/>
               </w:rPr>
               <w:tab/>
-              <w:t>7</w:t>
+              <w:t xml:space="preserve">7</w:t>
             </w:r>
           </w:hyperlink>
         </w:p>
@@ -1139,7 +1139,7 @@
                 <w:u w:val="none"/>
                 <w:lang w:val="es-ES_tradnl"/>
               </w:rPr>
-              <w:t>2.</w:t>
+              <w:t xml:space="preserve">2.</w:t>
             </w:r>
             <w:r>
               <w:rPr>
@@ -1156,7 +1156,7 @@
                 <w:shd w:val="clear" w:color="auto" w:fill="FFFEFF"/>
                 <w:lang w:val="es-ES_tradnl"/>
               </w:rPr>
-              <w:t>COMITÉ DE EDUCACIÓN</w:t>
+              <w:t xml:space="preserve">COMITÉ DE EDUCACIÓN</w:t>
             </w:r>
             <w:r>
               <w:rPr>
@@ -1167,7 +1167,7 @@
               <w:fldChar w:fldCharType="begin"/>
               <w:instrText xml:space="preserve"> PAGEREF _Toc29569296 \h </w:instrText>
               <w:fldChar w:fldCharType="separate"/>
-              <w:t>7</w:t>
+              <w:t xml:space="preserve">7</w:t>
               <w:fldChar w:fldCharType="end"/>
             </w:r>
           </w:hyperlink>
@@ -1194,7 +1194,7 @@
                 <w:szCs w:val="23"/>
                 <w:u w:val="none"/>
               </w:rPr>
-              <w:t>2.1</w:t>
+              <w:t xml:space="preserve">2.1</w:t>
             </w:r>
             <w:r>
               <w:rPr>
@@ -1217,7 +1217,7 @@
                 <w:szCs w:val="23"/>
                 <w:u w:val="none"/>
               </w:rPr>
-              <w:t>Objetivos</w:t>
+              <w:t xml:space="preserve">Objetivos</w:t>
             </w:r>
             <w:r>
               <w:rPr>
@@ -1231,7 +1231,7 @@
               <w:fldChar w:fldCharType="begin"/>
               <w:instrText xml:space="preserve"> PAGEREF _Toc29569297 \h </w:instrText>
               <w:fldChar w:fldCharType="separate"/>
-              <w:t>7</w:t>
+              <w:t xml:space="preserve">7</w:t>
               <w:fldChar w:fldCharType="end"/>
             </w:r>
           </w:hyperlink>
@@ -1258,7 +1258,7 @@
                 <w:szCs w:val="23"/>
                 <w:u w:val="none"/>
               </w:rPr>
-              <w:t>2.2</w:t>
+              <w:t xml:space="preserve">2.2</w:t>
             </w:r>
             <w:r>
               <w:rPr>
@@ -1281,7 +1281,7 @@
                 <w:szCs w:val="23"/>
                 <w:u w:val="none"/>
               </w:rPr>
-              <w:t>Responsabilidades</w:t>
+              <w:t xml:space="preserve">Responsabilidades</w:t>
             </w:r>
             <w:r>
               <w:rPr>
@@ -1295,7 +1295,7 @@
               <w:fldChar w:fldCharType="begin"/>
               <w:instrText xml:space="preserve"> PAGEREF _Toc29569298 \h </w:instrText>
               <w:fldChar w:fldCharType="separate"/>
-              <w:t>7</w:t>
+              <w:t xml:space="preserve">7</w:t>
               <w:fldChar w:fldCharType="end"/>
             </w:r>
           </w:hyperlink>
@@ -1322,7 +1322,7 @@
                 <w:szCs w:val="23"/>
                 <w:u w:val="none"/>
               </w:rPr>
-              <w:t>2.3</w:t>
+              <w:t xml:space="preserve">2.3</w:t>
             </w:r>
             <w:r>
               <w:rPr>
@@ -1345,7 +1345,7 @@
                 <w:szCs w:val="23"/>
                 <w:u w:val="none"/>
               </w:rPr>
-              <w:t>Conformación del Comité</w:t>
+              <w:t xml:space="preserve">Conformación del Comité</w:t>
             </w:r>
             <w:r>
               <w:rPr>
@@ -1359,7 +1359,7 @@
               <w:fldChar w:fldCharType="begin"/>
               <w:instrText xml:space="preserve"> PAGEREF _Toc29569299 \h </w:instrText>
               <w:fldChar w:fldCharType="separate"/>
-              <w:t>8</w:t>
+              <w:t xml:space="preserve">8</w:t>
               <w:fldChar w:fldCharType="end"/>
             </w:r>
           </w:hyperlink>
@@ -1380,7 +1380,7 @@
                 <w:u w:val="none"/>
                 <w:lang w:val="es-ES_tradnl"/>
               </w:rPr>
-              <w:t>3.</w:t>
+              <w:t xml:space="preserve">3.</w:t>
             </w:r>
             <w:r>
               <w:rPr>
@@ -1408,7 +1408,7 @@
               <w:fldChar w:fldCharType="begin"/>
               <w:instrText xml:space="preserve"> PAGEREF _Toc29569300 \h </w:instrText>
               <w:fldChar w:fldCharType="separate"/>
-              <w:t>9</w:t>
+              <w:t xml:space="preserve">9</w:t>
               <w:fldChar w:fldCharType="end"/>
             </w:r>
           </w:hyperlink>
@@ -1435,7 +1435,7 @@
                 <w:u w:val="none"/>
                 <w:lang w:val="es-ES_tradnl"/>
               </w:rPr>
-              <w:t>3.1</w:t>
+              <w:t xml:space="preserve">3.1</w:t>
             </w:r>
             <w:r>
               <w:rPr>
@@ -1459,7 +1459,7 @@
                 <w:shd w:val="clear" w:color="auto" w:fill="FFFEFF"/>
                 <w:lang w:val="es-ES_tradnl"/>
               </w:rPr>
-              <w:t>Objetivos</w:t>
+              <w:t xml:space="preserve">Objetivos</w:t>
             </w:r>
             <w:r>
               <w:rPr>
@@ -1473,7 +1473,7 @@
               <w:fldChar w:fldCharType="begin"/>
               <w:instrText xml:space="preserve"> PAGEREF _Toc29569301 \h </w:instrText>
               <w:fldChar w:fldCharType="separate"/>
-              <w:t>9</w:t>
+              <w:t xml:space="preserve">9</w:t>
               <w:fldChar w:fldCharType="end"/>
             </w:r>
           </w:hyperlink>
@@ -1500,7 +1500,7 @@
                 <w:szCs w:val="23"/>
                 <w:u w:val="none"/>
               </w:rPr>
-              <w:t>3.2</w:t>
+              <w:t xml:space="preserve">3.2</w:t>
             </w:r>
             <w:r>
               <w:rPr>
@@ -1523,7 +1523,7 @@
                 <w:szCs w:val="23"/>
                 <w:u w:val="none"/>
               </w:rPr>
-              <w:t>Responsabilidades</w:t>
+              <w:t xml:space="preserve">Responsabilidades</w:t>
             </w:r>
             <w:r>
               <w:rPr>
@@ -1537,7 +1537,7 @@
               <w:fldChar w:fldCharType="begin"/>
               <w:instrText xml:space="preserve"> PAGEREF _Toc29569302 \h </w:instrText>
               <w:fldChar w:fldCharType="separate"/>
-              <w:t>9</w:t>
+              <w:t xml:space="preserve">9</w:t>
               <w:fldChar w:fldCharType="end"/>
             </w:r>
           </w:hyperlink>
@@ -1563,7 +1563,7 @@
                 <w:szCs w:val="23"/>
                 <w:u w:val="none"/>
               </w:rPr>
-              <w:t>3.3</w:t>
+              <w:t xml:space="preserve">3.3</w:t>
             </w:r>
             <w:r>
               <w:rPr>
@@ -1585,7 +1585,7 @@
                 <w:szCs w:val="23"/>
                 <w:u w:val="none"/>
               </w:rPr>
-              <w:t>Conformación del Comité</w:t>
+              <w:t xml:space="preserve">Conformación del Comité</w:t>
             </w:r>
             <w:r>
               <w:rPr>
@@ -1599,7 +1599,7 @@
               <w:fldChar w:fldCharType="begin"/>
               <w:instrText xml:space="preserve"> PAGEREF _Toc29569303 \h </w:instrText>
               <w:fldChar w:fldCharType="separate"/>
-              <w:t>10</w:t>
+              <w:t xml:space="preserve">10</w:t>
               <w:fldChar w:fldCharType="end"/>
             </w:r>
           </w:hyperlink>
@@ -1619,7 +1619,7 @@
                 <w:b w:val="0"/>
                 <w:u w:val="none"/>
               </w:rPr>
-              <w:t>4.</w:t>
+              <w:t xml:space="preserve">4.</w:t>
             </w:r>
             <w:r>
               <w:rPr>
@@ -1645,7 +1645,7 @@
               <w:fldChar w:fldCharType="begin"/>
               <w:instrText xml:space="preserve"> PAGEREF _Toc29569304 \h </w:instrText>
               <w:fldChar w:fldCharType="separate"/>
-              <w:t>11</w:t>
+              <w:t xml:space="preserve">11</w:t>
               <w:fldChar w:fldCharType="end"/>
             </w:r>
           </w:hyperlink>
@@ -1672,7 +1672,7 @@
                 <w:szCs w:val="23"/>
                 <w:u w:val="none"/>
               </w:rPr>
-              <w:t>4.1</w:t>
+              <w:t xml:space="preserve">4.1</w:t>
             </w:r>
             <w:r>
               <w:rPr>
@@ -1695,7 +1695,7 @@
                 <w:szCs w:val="23"/>
                 <w:u w:val="none"/>
               </w:rPr>
-              <w:t>Objetivos</w:t>
+              <w:t xml:space="preserve">Objetivos</w:t>
             </w:r>
             <w:r>
               <w:rPr>
@@ -1709,7 +1709,7 @@
               <w:fldChar w:fldCharType="begin"/>
               <w:instrText xml:space="preserve"> PAGEREF _Toc29569305 \h </w:instrText>
               <w:fldChar w:fldCharType="separate"/>
-              <w:t>11</w:t>
+              <w:t xml:space="preserve">11</w:t>
               <w:fldChar w:fldCharType="end"/>
             </w:r>
           </w:hyperlink>
@@ -1735,7 +1735,7 @@
                 <w:szCs w:val="23"/>
                 <w:u w:val="none"/>
               </w:rPr>
-              <w:t>4.2</w:t>
+              <w:t xml:space="preserve">4.2</w:t>
             </w:r>
             <w:r>
               <w:rPr>
@@ -1757,7 +1757,7 @@
                 <w:szCs w:val="23"/>
                 <w:u w:val="none"/>
               </w:rPr>
-              <w:t>Responsabilidades</w:t>
+              <w:t xml:space="preserve">Responsabilidades</w:t>
             </w:r>
             <w:r>
               <w:rPr>
@@ -1771,7 +1771,7 @@
               <w:fldChar w:fldCharType="begin"/>
               <w:instrText xml:space="preserve"> PAGEREF _Toc29569306 \h </w:instrText>
               <w:fldChar w:fldCharType="separate"/>
-              <w:t>11</w:t>
+              <w:t xml:space="preserve">11</w:t>
               <w:fldChar w:fldCharType="end"/>
             </w:r>
           </w:hyperlink>
@@ -1797,7 +1797,7 @@
                 <w:szCs w:val="23"/>
                 <w:u w:val="none"/>
               </w:rPr>
-              <w:t>4.3</w:t>
+              <w:t xml:space="preserve">4.3</w:t>
             </w:r>
             <w:r>
               <w:rPr>
@@ -1819,7 +1819,7 @@
                 <w:szCs w:val="23"/>
                 <w:u w:val="none"/>
               </w:rPr>
-              <w:t>Conformación del Comité</w:t>
+              <w:t xml:space="preserve">Conformación del Comité</w:t>
             </w:r>
             <w:r>
               <w:rPr>
@@ -1833,7 +1833,7 @@
               <w:fldChar w:fldCharType="begin"/>
               <w:instrText xml:space="preserve"> PAGEREF _Toc29569307 \h </w:instrText>
               <w:fldChar w:fldCharType="separate"/>
-              <w:t>13</w:t>
+              <w:t xml:space="preserve">13</w:t>
               <w:fldChar w:fldCharType="end"/>
             </w:r>
           </w:hyperlink>
@@ -1859,7 +1859,7 @@
                 <w:szCs w:val="23"/>
                 <w:u w:val="none"/>
               </w:rPr>
-              <w:t>4.4</w:t>
+              <w:t xml:space="preserve">4.4</w:t>
             </w:r>
             <w:r>
               <w:rPr>
@@ -1881,7 +1881,7 @@
                 <w:szCs w:val="23"/>
                 <w:u w:val="none"/>
               </w:rPr>
-              <w:t>Frecuencia de Reuniones</w:t>
+              <w:t xml:space="preserve">Frecuencia de Reuniones</w:t>
             </w:r>
             <w:r>
               <w:rPr>
@@ -1895,7 +1895,7 @@
               <w:fldChar w:fldCharType="begin"/>
               <w:instrText xml:space="preserve"> PAGEREF _Toc29569308 \h </w:instrText>
               <w:fldChar w:fldCharType="separate"/>
-              <w:t>13</w:t>
+              <w:t xml:space="preserve">13</w:t>
               <w:fldChar w:fldCharType="end"/>
             </w:r>
           </w:hyperlink>
@@ -1916,7 +1916,7 @@
                 <w:u w:val="none"/>
                 <w:lang w:val="es-ES_tradnl"/>
               </w:rPr>
-              <w:t>5.</w:t>
+              <w:t xml:space="preserve">5.</w:t>
             </w:r>
             <w:r>
               <w:rPr>
@@ -1944,7 +1944,7 @@
               <w:fldChar w:fldCharType="begin"/>
               <w:instrText xml:space="preserve"> PAGEREF _Toc29569309 \h </w:instrText>
               <w:fldChar w:fldCharType="separate"/>
-              <w:t>13</w:t>
+              <w:t xml:space="preserve">13</w:t>
               <w:fldChar w:fldCharType="end"/>
             </w:r>
           </w:hyperlink>
@@ -1970,7 +1970,7 @@
                 <w:szCs w:val="23"/>
                 <w:u w:val="none"/>
               </w:rPr>
-              <w:t>5.1</w:t>
+              <w:t xml:space="preserve">5.1</w:t>
             </w:r>
             <w:r>
               <w:rPr>
@@ -1992,7 +1992,7 @@
                 <w:szCs w:val="23"/>
                 <w:u w:val="none"/>
               </w:rPr>
-              <w:t>Objetivos</w:t>
+              <w:t xml:space="preserve">Objetivos</w:t>
             </w:r>
             <w:r>
               <w:rPr>
@@ -2006,7 +2006,7 @@
               <w:fldChar w:fldCharType="begin"/>
               <w:instrText xml:space="preserve"> PAGEREF _Toc29569310 \h </w:instrText>
               <w:fldChar w:fldCharType="separate"/>
-              <w:t>1</w:t>
+              <w:t xml:space="preserve">1</w:t>
               <w:fldChar w:fldCharType="end"/>
             </w:r>
           </w:hyperlink>
@@ -2017,7 +2017,7 @@
               <w:szCs w:val="23"/>
               <w:u w:val="none"/>
             </w:rPr>
-            <w:t>3</w:t>
+            <w:t xml:space="preserve">3</w:t>
           </w:r>
         </w:p>
         <w:p>
@@ -2041,7 +2041,7 @@
                 <w:szCs w:val="23"/>
                 <w:u w:val="none"/>
               </w:rPr>
-              <w:t>5.2</w:t>
+              <w:t xml:space="preserve">5.2</w:t>
             </w:r>
             <w:r>
               <w:rPr>
@@ -2063,7 +2063,7 @@
                 <w:szCs w:val="23"/>
                 <w:u w:val="none"/>
               </w:rPr>
-              <w:t>Responsabilidades</w:t>
+              <w:t xml:space="preserve">Responsabilidades</w:t>
             </w:r>
             <w:r>
               <w:rPr>
@@ -2077,7 +2077,7 @@
               <w:fldChar w:fldCharType="begin"/>
               <w:instrText xml:space="preserve"> PAGEREF _Toc29569311 \h </w:instrText>
               <w:fldChar w:fldCharType="separate"/>
-              <w:t>13</w:t>
+              <w:t xml:space="preserve">13</w:t>
               <w:fldChar w:fldCharType="end"/>
             </w:r>
           </w:hyperlink>
@@ -2104,7 +2104,7 @@
                 <w:u w:val="none"/>
                 <w:lang w:val="es-ES_tradnl"/>
               </w:rPr>
-              <w:t>5.3</w:t>
+              <w:t xml:space="preserve">5.3</w:t>
             </w:r>
             <w:r>
               <w:rPr>
@@ -2128,7 +2128,7 @@
                 <w:shd w:val="clear" w:color="auto" w:fill="FFFEFF"/>
                 <w:lang w:val="es-ES_tradnl"/>
               </w:rPr>
-              <w:t>Conformación del Comité</w:t>
+              <w:t xml:space="preserve">Conformación del Comité</w:t>
             </w:r>
             <w:r>
               <w:rPr>
@@ -2142,7 +2142,7 @@
               <w:fldChar w:fldCharType="begin"/>
               <w:instrText xml:space="preserve"> PAGEREF _Toc29569312 \h </w:instrText>
               <w:fldChar w:fldCharType="separate"/>
-              <w:t>1</w:t>
+              <w:t xml:space="preserve">1</w:t>
               <w:fldChar w:fldCharType="end"/>
             </w:r>
           </w:hyperlink>
@@ -2153,7 +2153,7 @@
               <w:szCs w:val="23"/>
               <w:u w:val="none"/>
             </w:rPr>
-            <w:t>5</w:t>
+            <w:t xml:space="preserve">5</w:t>
           </w:r>
         </w:p>
         <w:p>
@@ -2177,7 +2177,7 @@
                 <w:szCs w:val="23"/>
                 <w:u w:val="none"/>
               </w:rPr>
-              <w:t>5.4</w:t>
+              <w:t xml:space="preserve">5.4</w:t>
             </w:r>
             <w:r>
               <w:rPr>
@@ -2199,7 +2199,7 @@
                 <w:szCs w:val="23"/>
                 <w:u w:val="none"/>
               </w:rPr>
-              <w:t>Frecuencia de Reuniones</w:t>
+              <w:t xml:space="preserve">Frecuencia de Reuniones</w:t>
             </w:r>
             <w:r>
               <w:rPr>
@@ -2213,7 +2213,7 @@
               <w:fldChar w:fldCharType="begin"/>
               <w:instrText xml:space="preserve"> PAGEREF _Toc29569313 \h </w:instrText>
               <w:fldChar w:fldCharType="separate"/>
-              <w:t>1</w:t>
+              <w:t xml:space="preserve">1</w:t>
               <w:fldChar w:fldCharType="end"/>
             </w:r>
           </w:hyperlink>
@@ -2224,7 +2224,7 @@
               <w:szCs w:val="23"/>
               <w:u w:val="none"/>
             </w:rPr>
-            <w:t>5</w:t>
+            <w:t xml:space="preserve">5</w:t>
           </w:r>
         </w:p>
         <w:p>
@@ -2243,7 +2243,7 @@
                 <w:u w:val="none"/>
                 <w:lang w:val="es-ES_tradnl"/>
               </w:rPr>
-              <w:t>6.</w:t>
+              <w:t xml:space="preserve">6.</w:t>
             </w:r>
             <w:r>
               <w:rPr>
@@ -2278,7 +2278,7 @@
                 <w:shd w:val="clear" w:color="auto" w:fill="FFFEFF"/>
                 <w:lang w:val="es-ES_tradnl"/>
               </w:rPr>
-              <w:t>RIESGOS</w:t>
+              <w:t xml:space="preserve">RIESGOS</w:t>
             </w:r>
             <w:r>
               <w:rPr>
@@ -2289,7 +2289,7 @@
               <w:fldChar w:fldCharType="begin"/>
               <w:instrText xml:space="preserve"> PAGEREF _Toc29569314 \h </w:instrText>
               <w:fldChar w:fldCharType="separate"/>
-              <w:t>16</w:t>
+              <w:t xml:space="preserve">16</w:t>
               <w:fldChar w:fldCharType="end"/>
             </w:r>
           </w:hyperlink>
@@ -2315,7 +2315,7 @@
                 <w:szCs w:val="23"/>
                 <w:u w:val="none"/>
               </w:rPr>
-              <w:t>6.1</w:t>
+              <w:t xml:space="preserve">6.1</w:t>
             </w:r>
             <w:r>
               <w:rPr>
@@ -2337,7 +2337,7 @@
                 <w:szCs w:val="23"/>
                 <w:u w:val="none"/>
               </w:rPr>
-              <w:t>Objetivos</w:t>
+              <w:t xml:space="preserve">Objetivos</w:t>
             </w:r>
             <w:r>
               <w:rPr>
@@ -2351,7 +2351,7 @@
               <w:fldChar w:fldCharType="begin"/>
               <w:instrText xml:space="preserve"> PAGEREF _Toc29569315 \h </w:instrText>
               <w:fldChar w:fldCharType="separate"/>
-              <w:t>16</w:t>
+              <w:t xml:space="preserve">16</w:t>
               <w:fldChar w:fldCharType="end"/>
             </w:r>
           </w:hyperlink>
@@ -2377,7 +2377,7 @@
                 <w:szCs w:val="23"/>
                 <w:u w:val="none"/>
               </w:rPr>
-              <w:t>6.2</w:t>
+              <w:t xml:space="preserve">6.2</w:t>
             </w:r>
             <w:r>
               <w:rPr>
@@ -2399,7 +2399,7 @@
                 <w:szCs w:val="23"/>
                 <w:u w:val="none"/>
               </w:rPr>
-              <w:t>Responsabilidades</w:t>
+              <w:t xml:space="preserve">Responsabilidades</w:t>
             </w:r>
             <w:r>
               <w:rPr>
@@ -2413,7 +2413,7 @@
               <w:fldChar w:fldCharType="begin"/>
               <w:instrText xml:space="preserve"> PAGEREF _Toc29569316 \h </w:instrText>
               <w:fldChar w:fldCharType="separate"/>
-              <w:t>16</w:t>
+              <w:t xml:space="preserve">16</w:t>
               <w:fldChar w:fldCharType="end"/>
             </w:r>
           </w:hyperlink>
@@ -2439,7 +2439,7 @@
                 <w:szCs w:val="23"/>
                 <w:u w:val="none"/>
               </w:rPr>
-              <w:t>6.3</w:t>
+              <w:t xml:space="preserve">6.3</w:t>
             </w:r>
             <w:r>
               <w:rPr>
@@ -2461,7 +2461,7 @@
                 <w:szCs w:val="23"/>
                 <w:u w:val="none"/>
               </w:rPr>
-              <w:t>Conformación del Comité</w:t>
+              <w:t xml:space="preserve">Conformación del Comité</w:t>
             </w:r>
             <w:r>
               <w:rPr>
@@ -2475,7 +2475,7 @@
               <w:fldChar w:fldCharType="begin"/>
               <w:instrText xml:space="preserve"> PAGEREF _Toc29569317 \h </w:instrText>
               <w:fldChar w:fldCharType="separate"/>
-              <w:t>1</w:t>
+              <w:t xml:space="preserve">1</w:t>
               <w:fldChar w:fldCharType="end"/>
             </w:r>
           </w:hyperlink>
@@ -2486,7 +2486,7 @@
               <w:szCs w:val="23"/>
               <w:u w:val="none"/>
             </w:rPr>
-            <w:t>7</w:t>
+            <w:t xml:space="preserve">7</w:t>
           </w:r>
         </w:p>
         <w:p>
@@ -2510,7 +2510,7 @@
                 <w:szCs w:val="23"/>
                 <w:u w:val="none"/>
               </w:rPr>
-              <w:t>6.4</w:t>
+              <w:t xml:space="preserve">6.4</w:t>
             </w:r>
             <w:r>
               <w:rPr>
@@ -2532,7 +2532,7 @@
                 <w:szCs w:val="23"/>
                 <w:u w:val="none"/>
               </w:rPr>
-              <w:t>Frecuencia de Reuniones</w:t>
+              <w:t xml:space="preserve">Frecuencia de Reuniones</w:t>
             </w:r>
             <w:r>
               <w:rPr>
@@ -2546,7 +2546,7 @@
               <w:fldChar w:fldCharType="begin"/>
               <w:instrText xml:space="preserve"> PAGEREF _Toc29569318 \h </w:instrText>
               <w:fldChar w:fldCharType="separate"/>
-              <w:t>17</w:t>
+              <w:t xml:space="preserve">17</w:t>
               <w:fldChar w:fldCharType="end"/>
             </w:r>
           </w:hyperlink>
@@ -2567,7 +2567,7 @@
                 <w:u w:val="none"/>
                 <w:lang w:val="es-SV"/>
               </w:rPr>
-              <w:t>7.</w:t>
+              <w:t xml:space="preserve">7.</w:t>
             </w:r>
             <w:r>
               <w:rPr>
@@ -2601,7 +2601,7 @@
                 <w:szCs w:val="24"/>
                 <w:u w:val="none"/>
               </w:rPr>
-              <w:t>JUNTA DE</w:t>
+              <w:t xml:space="preserve">JUNTA DE</w:t>
             </w:r>
             <w:r>
               <w:rPr>
@@ -2619,7 +2619,7 @@
                 <w:szCs w:val="24"/>
                 <w:u w:val="none"/>
               </w:rPr>
-              <w:t>LDA/FT/FPADM</w:t>
+              <w:t xml:space="preserve">LDA/FT/FPADM</w:t>
             </w:r>
             <w:r>
               <w:rPr>
@@ -2638,7 +2638,7 @@
               <w:fldChar w:fldCharType="begin"/>
               <w:instrText xml:space="preserve"> PAGEREF _Toc29569319 \h </w:instrText>
               <w:fldChar w:fldCharType="separate"/>
-              <w:t>17</w:t>
+              <w:t xml:space="preserve">17</w:t>
               <w:fldChar w:fldCharType="end"/>
             </w:r>
           </w:hyperlink>
@@ -2664,7 +2664,7 @@
                 <w:szCs w:val="23"/>
                 <w:u w:val="none"/>
               </w:rPr>
-              <w:t>7.1</w:t>
+              <w:t xml:space="preserve">7.1</w:t>
             </w:r>
             <w:r>
               <w:rPr>
@@ -2686,7 +2686,7 @@
                 <w:szCs w:val="23"/>
                 <w:u w:val="none"/>
               </w:rPr>
-              <w:t>Objetivos</w:t>
+              <w:t xml:space="preserve">Objetivos</w:t>
             </w:r>
             <w:r>
               <w:rPr>
@@ -2700,7 +2700,7 @@
               <w:fldChar w:fldCharType="begin"/>
               <w:instrText xml:space="preserve"> PAGEREF _Toc29569320 \h </w:instrText>
               <w:fldChar w:fldCharType="separate"/>
-              <w:t>1</w:t>
+              <w:t xml:space="preserve">1</w:t>
               <w:fldChar w:fldCharType="end"/>
             </w:r>
           </w:hyperlink>
@@ -2711,7 +2711,7 @@
               <w:szCs w:val="23"/>
               <w:u w:val="none"/>
             </w:rPr>
-            <w:t>7</w:t>
+            <w:t xml:space="preserve">7</w:t>
           </w:r>
         </w:p>
         <w:p>
@@ -2735,7 +2735,7 @@
                 <w:szCs w:val="23"/>
                 <w:u w:val="none"/>
               </w:rPr>
-              <w:t>7.2</w:t>
+              <w:t xml:space="preserve">7.2</w:t>
             </w:r>
             <w:r>
               <w:rPr>
@@ -2757,7 +2757,7 @@
                 <w:szCs w:val="23"/>
                 <w:u w:val="none"/>
               </w:rPr>
-              <w:t>Responsabilidades</w:t>
+              <w:t xml:space="preserve">Responsabilidades</w:t>
             </w:r>
             <w:r>
               <w:rPr>
@@ -2771,7 +2771,7 @@
               <w:fldChar w:fldCharType="begin"/>
               <w:instrText xml:space="preserve"> PAGEREF _Toc29569321 \h </w:instrText>
               <w:fldChar w:fldCharType="separate"/>
-              <w:t>1</w:t>
+              <w:t xml:space="preserve">1</w:t>
               <w:fldChar w:fldCharType="end"/>
             </w:r>
           </w:hyperlink>
@@ -2782,7 +2782,7 @@
               <w:szCs w:val="23"/>
               <w:u w:val="none"/>
             </w:rPr>
-            <w:t>7</w:t>
+            <w:t xml:space="preserve">7</w:t>
           </w:r>
         </w:p>
         <w:p>
@@ -2807,7 +2807,7 @@
                 <w:szCs w:val="23"/>
                 <w:u w:val="none"/>
               </w:rPr>
-              <w:t>7.3</w:t>
+              <w:t xml:space="preserve">7.3</w:t>
             </w:r>
             <w:r>
               <w:rPr>
@@ -2830,7 +2830,7 @@
                 <w:szCs w:val="23"/>
                 <w:u w:val="none"/>
               </w:rPr>
-              <w:t>Conformación del Comité</w:t>
+              <w:t xml:space="preserve">Conformación del Comité</w:t>
             </w:r>
             <w:r>
               <w:rPr>
@@ -2844,7 +2844,7 @@
               <w:fldChar w:fldCharType="begin"/>
               <w:instrText xml:space="preserve"> PAGEREF _Toc29569322 \h </w:instrText>
               <w:fldChar w:fldCharType="separate"/>
-              <w:t>18</w:t>
+              <w:t xml:space="preserve">18</w:t>
               <w:fldChar w:fldCharType="end"/>
             </w:r>
           </w:hyperlink>
@@ -2871,7 +2871,7 @@
                 <w:szCs w:val="23"/>
                 <w:u w:val="none"/>
               </w:rPr>
-              <w:t>7.4</w:t>
+              <w:t xml:space="preserve">7.4</w:t>
             </w:r>
             <w:r>
               <w:rPr>
@@ -2894,7 +2894,7 @@
                 <w:szCs w:val="23"/>
                 <w:u w:val="none"/>
               </w:rPr>
-              <w:t>Frecuencia de Reuniones</w:t>
+              <w:t xml:space="preserve">Frecuencia de Reuniones</w:t>
             </w:r>
             <w:r>
               <w:rPr>
@@ -2908,7 +2908,7 @@
               <w:fldChar w:fldCharType="begin"/>
               <w:instrText xml:space="preserve"> PAGEREF _Toc29569323 \h </w:instrText>
               <w:fldChar w:fldCharType="separate"/>
-              <w:t>18</w:t>
+              <w:t xml:space="preserve">18</w:t>
               <w:fldChar w:fldCharType="end"/>
             </w:r>
           </w:hyperlink>
@@ -2927,7 +2927,7 @@
                 <w:rStyle w:val="Hipervnculo"/>
                 <w:u w:val="none"/>
               </w:rPr>
-              <w:t>8</w:t>
+              <w:t xml:space="preserve">8</w:t>
             </w:r>
             <w:r>
               <w:rPr>
@@ -2935,7 +2935,7 @@
                 <w:b w:val="0"/>
                 <w:u w:val="none"/>
               </w:rPr>
-              <w:t>.</w:t>
+              <w:t xml:space="preserve">.</w:t>
             </w:r>
             <w:r>
               <w:rPr>
@@ -2950,7 +2950,7 @@
                 <w:rStyle w:val="Hipervnculo"/>
                 <w:u w:val="none"/>
               </w:rPr>
-              <w:t>COMITÉ DEL FONDO DE SOLIDARIDAD</w:t>
+              <w:t xml:space="preserve">COMITÉ DEL FONDO DE SOLIDARIDAD</w:t>
             </w:r>
             <w:r>
               <w:rPr>
@@ -2961,7 +2961,7 @@
               <w:fldChar w:fldCharType="begin"/>
               <w:instrText xml:space="preserve"> PAGEREF _Toc29569324 \h </w:instrText>
               <w:fldChar w:fldCharType="separate"/>
-              <w:t>18</w:t>
+              <w:t xml:space="preserve">18</w:t>
               <w:fldChar w:fldCharType="end"/>
             </w:r>
           </w:hyperlink>
@@ -2987,7 +2987,7 @@
                 <w:szCs w:val="23"/>
                 <w:u w:val="none"/>
               </w:rPr>
-              <w:t>8.1</w:t>
+              <w:t xml:space="preserve">8.1</w:t>
             </w:r>
             <w:r>
               <w:rPr>
@@ -3009,7 +3009,7 @@
                 <w:szCs w:val="23"/>
                 <w:u w:val="none"/>
               </w:rPr>
-              <w:t>Objetivos</w:t>
+              <w:t xml:space="preserve">Objetivos</w:t>
             </w:r>
             <w:r>
               <w:rPr>
@@ -3023,7 +3023,7 @@
               <w:fldChar w:fldCharType="begin"/>
               <w:instrText xml:space="preserve"> PAGEREF _Toc29569325 \h </w:instrText>
               <w:fldChar w:fldCharType="separate"/>
-              <w:t>18</w:t>
+              <w:t xml:space="preserve">18</w:t>
               <w:fldChar w:fldCharType="end"/>
             </w:r>
           </w:hyperlink>
@@ -3049,7 +3049,7 @@
                 <w:szCs w:val="23"/>
                 <w:u w:val="none"/>
               </w:rPr>
-              <w:t>8.2</w:t>
+              <w:t xml:space="preserve">8.2</w:t>
             </w:r>
             <w:r>
               <w:rPr>
@@ -3071,7 +3071,7 @@
                 <w:szCs w:val="23"/>
                 <w:u w:val="none"/>
               </w:rPr>
-              <w:t>Responsabilidades</w:t>
+              <w:t xml:space="preserve">Responsabilidades</w:t>
             </w:r>
             <w:r>
               <w:rPr>
@@ -3082,7 +3082,7 @@
                 <w:u w:val="none"/>
               </w:rPr>
               <w:tab/>
-              <w:t>18</w:t>
+              <w:t xml:space="preserve">18</w:t>
             </w:r>
           </w:hyperlink>
         </w:p>
@@ -3107,7 +3107,7 @@
                 <w:szCs w:val="23"/>
                 <w:u w:val="none"/>
               </w:rPr>
-              <w:t>8.3</w:t>
+              <w:t xml:space="preserve">8.3</w:t>
             </w:r>
             <w:r>
               <w:rPr>
@@ -3129,7 +3129,7 @@
                 <w:szCs w:val="23"/>
                 <w:u w:val="none"/>
               </w:rPr>
-              <w:t>Conformación del Comité</w:t>
+              <w:t xml:space="preserve">Conformación del Comité</w:t>
             </w:r>
             <w:r>
               <w:rPr>
@@ -3140,7 +3140,7 @@
                 <w:u w:val="none"/>
               </w:rPr>
               <w:tab/>
-              <w:t>20</w:t>
+              <w:t xml:space="preserve">20</w:t>
             </w:r>
           </w:hyperlink>
         </w:p>
@@ -3157,7 +3157,7 @@
                 <w:szCs w:val="23"/>
                 <w:u w:val="none"/>
               </w:rPr>
-              <w:t>8.4</w:t>
+              <w:t xml:space="preserve">8.4</w:t>
             </w:r>
             <w:r>
               <w:rPr>
@@ -3179,7 +3179,7 @@
                 <w:szCs w:val="23"/>
                 <w:u w:val="none"/>
               </w:rPr>
-              <w:t>Frecuencia de Reuniones</w:t>
+              <w:t xml:space="preserve">Frecuencia de Reuniones</w:t>
             </w:r>
             <w:r>
               <w:rPr>
@@ -3205,7 +3205,7 @@
               <w:bCs w:val="0"/>
               <w:u w:val="none"/>
             </w:rPr>
-            <w:t>20</w:t>
+            <w:t xml:space="preserve">20</w:t>
           </w:r>
         </w:p>
       </w:sdtContent>
@@ -3342,7 +3342,7 @@
           <w:u w:val="none"/>
           <w:lang w:eastAsia="es-ES"/>
         </w:rPr>
-        <w:t>INTRODUCCION</w:t>
+        <w:t xml:space="preserve">INTRODUCCION</w:t>
       </w:r>
       <w:bookmarkEnd w:id="0"/>
       <w:bookmarkEnd w:id="1"/>
@@ -3473,7 +3473,7 @@
           <w:szCs w:val="24"/>
           <w:u w:val="none"/>
         </w:rPr>
-        <w:t>, cada Comité</w:t>
+        <w:t xml:space="preserve">, cada Comité</w:t>
       </w:r>
       <w:r>
         <w:rPr>
@@ -3805,7 +3805,7 @@
           <w:shd w:val="clear" w:color="auto" w:fill="FFFEFF"/>
           <w:lang w:val="es-ES_tradnl"/>
         </w:rPr>
-        <w:t>COMITÉ DE CRÉDITOS</w:t>
+        <w:t xml:space="preserve">COMITÉ DE CRÉDITOS</w:t>
       </w:r>
       <w:bookmarkEnd w:id="2"/>
       <w:bookmarkEnd w:id="3"/>
@@ -3861,7 +3861,7 @@
           <w:szCs w:val="24"/>
           <w:u w:val="none"/>
         </w:rPr>
-        <w:t>Objetivos</w:t>
+        <w:t xml:space="preserve">Objetivos</w:t>
       </w:r>
       <w:bookmarkEnd w:id="5"/>
       <w:bookmarkEnd w:id="6"/>
@@ -3917,7 +3917,7 @@
           <w:u w:val="none"/>
           <w:shd w:val="clear" w:color="auto" w:fill="FFFEFF"/>
         </w:rPr>
-        <w:t>Propiciar el desarrollo económico de los asociados.</w:t>
+        <w:t xml:space="preserve">Propiciar el desarrollo económico de los asociados.</w:t>
       </w:r>
     </w:p>
     <w:p>
@@ -4050,7 +4050,7 @@
           <w:u w:val="single"/>
           <w:shd w:val="clear" w:color="auto" w:fill="FFFEFF"/>
         </w:rPr>
-        <w:t>y dar resolución</w:t>
+        <w:t xml:space="preserve">y dar resolución</w:t>
       </w:r>
       <w:r>
         <w:rPr>
@@ -4116,7 +4116,7 @@
           <w:u w:val="none"/>
           <w:shd w:val="clear" w:color="auto" w:fill="FFFEFF"/>
         </w:rPr>
-        <w:t>Proteger el capital</w:t>
+        <w:t xml:space="preserve">Proteger el capital</w:t>
       </w:r>
       <w:r>
         <w:rPr>
@@ -4182,7 +4182,7 @@
           <w:u w:val="none"/>
           <w:shd w:val="clear" w:color="auto" w:fill="FFFEFF"/>
         </w:rPr>
-        <w:t>Actuar con prudencia, equidad, solidaridad e incentivar la amortización puntual de los créditos</w:t>
+        <w:t xml:space="preserve">Actuar con prudencia, equidad, solidaridad e incentivar la amortización puntual de los créditos</w:t>
       </w:r>
       <w:r>
         <w:rPr>
@@ -4196,7 +4196,7 @@
           <w:u w:val="single"/>
           <w:shd w:val="clear" w:color="auto" w:fill="FFFEFF"/>
         </w:rPr>
-        <w:t>, con el objetivo de mantener el buen crecimiento de la Cartera de Créditos y de Tarjeta</w:t>
+        <w:t xml:space="preserve">, con el objetivo de mantener el buen crecimiento de la Cartera de Créditos y de Tarjeta</w:t>
       </w:r>
       <w:r>
         <w:rPr>
@@ -4210,7 +4210,7 @@
           <w:u w:val="single"/>
           <w:shd w:val="clear" w:color="auto" w:fill="FFFEFF"/>
         </w:rPr>
-        <w:t>.</w:t>
+        <w:t xml:space="preserve">.</w:t>
       </w:r>
     </w:p>
     <w:p>
@@ -4262,7 +4262,7 @@
           <w:u w:val="none"/>
           <w:shd w:val="clear" w:color="auto" w:fill="FFFEFF"/>
         </w:rPr>
-        <w:t>Normar la organización y el funcionamiento del Comité de Créditos.</w:t>
+        <w:t xml:space="preserve">Normar la organización y el funcionamiento del Comité de Créditos.</w:t>
       </w:r>
     </w:p>
     <w:p>
@@ -4315,7 +4315,7 @@
           <w:szCs w:val="24"/>
           <w:u w:val="none"/>
         </w:rPr>
-        <w:t>Responsabilidades</w:t>
+        <w:t xml:space="preserve">Responsabilidades</w:t>
       </w:r>
       <w:bookmarkEnd w:id="7"/>
       <w:bookmarkEnd w:id="8"/>
@@ -4366,7 +4366,7 @@
           <w:szCs w:val="24"/>
           <w:u w:val="none"/>
         </w:rPr>
-        <w:t>Son atribuciones del Comité de Créditos:</w:t>
+        <w:t xml:space="preserve">Son atribuciones del Comité de Créditos:</w:t>
       </w:r>
     </w:p>
     <w:p>
@@ -4518,7 +4518,7 @@
           <w:szCs w:val="24"/>
           <w:u w:val="single"/>
         </w:rPr>
-        <w:t>s</w:t>
+        <w:t xml:space="preserve">s</w:t>
       </w:r>
       <w:r>
         <w:rPr>
@@ -4542,7 +4542,7 @@
           <w:szCs w:val="24"/>
           <w:u w:val="single"/>
         </w:rPr>
-        <w:t>s</w:t>
+        <w:t xml:space="preserve">s</w:t>
       </w:r>
       <w:r>
         <w:rPr>
@@ -4554,7 +4554,7 @@
           <w:szCs w:val="24"/>
           <w:u w:val="none"/>
         </w:rPr>
-        <w:t>.</w:t>
+        <w:t xml:space="preserve">.</w:t>
       </w:r>
     </w:p>
     <w:p>
@@ -4618,7 +4618,7 @@
           <w:szCs w:val="24"/>
           <w:u w:val="none"/>
         </w:rPr>
-        <w:t/>
+        <w:t xml:space="preserve"/>
       </w:r>
     </w:p>
     <w:p>
@@ -4682,7 +4682,7 @@
           <w:szCs w:val="24"/>
           <w:u w:val="single"/>
         </w:rPr>
-        <w:t>De las sesiones que celebren en el Comité de Créditos se levantará acta. Las actas deberán ser redactadas de forma clara y detallada para comprender los fundamentos de los acuerdos tomados y de los temas conocidos. Se asentarán en el libro legar respectivo, bajo numeración secuencial.</w:t>
+        <w:t xml:space="preserve">De las sesiones que celebren en el Comité de Créditos se levantará acta. Las actas deberán ser redactadas de forma clara y detallada para comprender los fundamentos de los acuerdos tomados y de los temas conocidos. Se asentarán en el libro legar respectivo, bajo numeración secuencial.</w:t>
       </w:r>
     </w:p>
     <w:p>
@@ -4734,7 +4734,7 @@
           <w:szCs w:val="24"/>
           <w:u w:val="none"/>
         </w:rPr>
-        <w:t>Revisar periódicamente el Reglamento y las Políticas para el otorgamiento del crédito, con el fin de proponer al Consejo de Administración los cambios necesarios.</w:t>
+        <w:t xml:space="preserve">Revisar periódicamente el Reglamento y las Políticas para el otorgamiento del crédito, con el fin de proponer al Consejo de Administración los cambios necesarios.</w:t>
       </w:r>
     </w:p>
     <w:p>
@@ -4781,7 +4781,7 @@
           <w:szCs w:val="24"/>
           <w:u w:val="single"/>
         </w:rPr>
-        <w:t>Elaborar el Plan de trabajo anual y su respectivo presupuesto, y presentarlo al Consejo de Administración para su aprobación, a más tardar en el mes de enero de cada año.</w:t>
+        <w:t xml:space="preserve">Elaborar el Plan de trabajo anual y su respectivo presupuesto, y presentarlo al Consejo de Administración para su aprobación, a más tardar en el mes de enero de cada año.</w:t>
       </w:r>
     </w:p>
     <w:p>
@@ -4845,7 +4845,7 @@
           <w:szCs w:val="24"/>
           <w:u w:val="single"/>
         </w:rPr>
-        <w:t>nacional</w:t>
+        <w:t xml:space="preserve">nacional</w:t>
       </w:r>
       <w:r>
         <w:rPr>
@@ -4857,7 +4857,7 @@
           <w:szCs w:val="24"/>
           <w:u w:val="none"/>
         </w:rPr>
-        <w:t>.</w:t>
+        <w:t xml:space="preserve">.</w:t>
       </w:r>
     </w:p>
     <w:p>
@@ -4909,7 +4909,7 @@
           <w:szCs w:val="24"/>
           <w:u w:val="none"/>
         </w:rPr>
-        <w:t>Asistir a las reuniones ordinarias y extraordinarias que se le convoque.</w:t>
+        <w:t xml:space="preserve">Asistir a las reuniones ordinarias y extraordinarias que se le convoque.</w:t>
       </w:r>
     </w:p>
     <w:p>
@@ -4985,7 +4985,7 @@
           <w:szCs w:val="24"/>
           <w:u w:val="none"/>
         </w:rPr>
-        <w:t>.</w:t>
+        <w:t xml:space="preserve">.</w:t>
       </w:r>
     </w:p>
     <w:p>
@@ -5037,7 +5037,7 @@
           <w:szCs w:val="24"/>
           <w:u w:val="none"/>
         </w:rPr>
-        <w:t>Participar cuando sea necesario en el análisis, evaluación y cambios de los procesos del Departamento de Créditos.</w:t>
+        <w:t xml:space="preserve">Participar cuando sea necesario en el análisis, evaluación y cambios de los procesos del Departamento de Créditos.</w:t>
       </w:r>
     </w:p>
     <w:p>
@@ -5113,7 +5113,7 @@
           <w:szCs w:val="24"/>
           <w:u w:val="single"/>
         </w:rPr>
-        <w:t>las unidades de la Cooperativa</w:t>
+        <w:t xml:space="preserve">las unidades de la Cooperativa</w:t>
       </w:r>
       <w:r>
         <w:rPr>
@@ -5125,7 +5125,7 @@
           <w:szCs w:val="24"/>
           <w:u w:val="none"/>
         </w:rPr>
-        <w:t>,</w:t>
+        <w:t xml:space="preserve">,</w:t>
       </w:r>
       <w:r>
         <w:rPr>
@@ -5201,7 +5201,7 @@
           <w:szCs w:val="24"/>
           <w:u w:val="none"/>
         </w:rPr>
-        <w:t>Otras que de acuerdo a su función, le designe el Consejo de Administración.</w:t>
+        <w:t xml:space="preserve">Otras que de acuerdo a su función, le designe el Consejo de Administración.</w:t>
       </w:r>
     </w:p>
     <w:p>
@@ -5328,7 +5328,7 @@
           <w:szCs w:val="24"/>
           <w:u w:val="single"/>
         </w:rPr>
-        <w:t>estará</w:t>
+        <w:t xml:space="preserve">estará</w:t>
       </w:r>
       <w:r>
         <w:rPr>
@@ -5388,7 +5388,7 @@
           <w:szCs w:val="24"/>
           <w:u w:val="single"/>
         </w:rPr>
-        <w:t>El Consejo de Administración está facultado para nombrar los Suplentes que considere necesarios para lograr la eficiencia en la aprobación de los créditos. Por lo menos un miembro del Consejo de Administración deberá formar parte de dicho Comité.</w:t>
+        <w:t xml:space="preserve">El Consejo de Administración está facultado para nombrar los Suplentes que considere necesarios para lograr la eficiencia en la aprobación de los créditos. Por lo menos un miembro del Consejo de Administración deberá formar parte de dicho Comité.</w:t>
       </w:r>
     </w:p>
     <w:p>
@@ -5418,7 +5418,7 @@
           <w:szCs w:val="24"/>
           <w:u w:val="single"/>
         </w:rPr>
-        <w:t>Los requisitos para ser miembro del Comité de Créditos se detallan en Anexo 3 y que forma parte integrante de este Código.</w:t>
+        <w:t xml:space="preserve">Los requisitos para ser miembro del Comité de Créditos se detallan en Anexo 3 y que forma parte integrante de este Código.</w:t>
       </w:r>
     </w:p>
     <w:p>
@@ -5448,7 +5448,7 @@
           <w:szCs w:val="24"/>
           <w:u w:val="single"/>
         </w:rPr>
-        <w:t>Los Directores del Consejo de Administración, miembros del Comité de Créditos, Gerentes y Personal que autorizan créditos, a más tardar treinta días después de haber tomado posesión de su cargo y en el mes de enero de cada año, deberán declarar bajo juramento a la Superintendencia que no son inhábiles para desempeñar el cargo y a informar a más tardar el siguiente día hábil a dicha institución su inhabilidad, si ésta se produce con posterioridad.</w:t>
+        <w:t xml:space="preserve">Los Directores del Consejo de Administración, miembros del Comité de Créditos, Gerentes y Personal que autorizan créditos, a más tardar treinta días después de haber tomado posesión de su cargo y en el mes de enero de cada año, deberán declarar bajo juramento a la Superintendencia que no son inhábiles para desempeñar el cargo y a informar a más tardar el siguiente día hábil a dicha institución su inhabilidad, si ésta se produce con posterioridad.</w:t>
       </w:r>
     </w:p>
     <w:p>
@@ -5483,7 +5483,7 @@
           <w:szCs w:val="24"/>
           <w:u w:val="none"/>
         </w:rPr>
-        <w:t>Frecuencia de Reuniones</w:t>
+        <w:t xml:space="preserve">Frecuencia de Reuniones</w:t>
       </w:r>
       <w:bookmarkEnd w:id="11"/>
       <w:bookmarkEnd w:id="12"/>
@@ -5537,7 +5537,7 @@
           <w:szCs w:val="24"/>
           <w:u w:val="single"/>
         </w:rPr>
-        <w:t>El Comité se reunirá ordinariamente al menos una vez por semana a fin de resolver las solicitudes de créditos y tarjetas de crédito y para desarrollar otras actividades o atribuciones establecidas por el Consejo de Administración; pudiendo sesionar de forma extraordinaria cuando las circunstancias lo ameriten. Los suplentes concurrirán a las sesiones del Comité únicamente con voz, excepto cuando suplan a los propietarios en cuyo caso tendrán voto. La presencia de dos de sus miembros constituirá quórum, ya sea propietario o suplente. El Secretario del Comité llevará el Libro de Actas respectivo y si en alguna sesión faltare y no están presentes los suplentes, hará sus veces el Vocal.</w:t>
+        <w:t xml:space="preserve">El Comité se reunirá ordinariamente al menos una vez por semana a fin de resolver las solicitudes de créditos y tarjetas de crédito y para desarrollar otras actividades o atribuciones establecidas por el Consejo de Administración; pudiendo sesionar de forma extraordinaria cuando las circunstancias lo ameriten. Los suplentes concurrirán a las sesiones del Comité únicamente con voz, excepto cuando suplan a los propietarios en cuyo caso tendrán voto. La presencia de dos de sus miembros constituirá quórum, ya sea propietario o suplente. El Secretario del Comité llevará el Libro de Actas respectivo y si en alguna sesión faltare y no están presentes los suplentes, hará sus veces el Vocal.</w:t>
       </w:r>
     </w:p>
     <w:p>
@@ -5571,7 +5571,7 @@
           <w:szCs w:val="24"/>
           <w:u w:val="single"/>
         </w:rPr>
-        <w:t>Las resoluciones de solicitudes de créditos que el Comité determine, deberán ser firmadas por todos los miembros presentes en la sesión. En caso de que un miembro no esté de acuerdo en alguna resolución tomada por la mayoría deberá dejarlo consignado dando sus razonamientos.</w:t>
+        <w:t xml:space="preserve">Las resoluciones de solicitudes de créditos que el Comité determine, deberán ser firmadas por todos los miembros presentes en la sesión. En caso de que un miembro no esté de acuerdo en alguna resolución tomada por la mayoría deberá dejarlo consignado dando sus razonamientos.</w:t>
       </w:r>
     </w:p>
     <w:p>
@@ -5605,7 +5605,7 @@
           <w:szCs w:val="24"/>
           <w:u w:val="single"/>
         </w:rPr>
-        <w:t>Los análisis y resoluciones del Comité de Créditos, tomará como base la documentación presentada por el asociado y las instancias correspondientes, así como las opiniones de los analistas, Jefe de Créditos y de las Gerencias; pudiendo solicitar información y opiniones adicionales.</w:t>
+        <w:t xml:space="preserve">Los análisis y resoluciones del Comité de Créditos, tomará como base la documentación presentada por el asociado y las instancias correspondientes, así como las opiniones de los analistas, Jefe de Créditos y de las Gerencias; pudiendo solicitar información y opiniones adicionales.</w:t>
       </w:r>
     </w:p>
     <w:p>
@@ -5639,7 +5639,7 @@
           <w:szCs w:val="24"/>
           <w:u w:val="single"/>
         </w:rPr>
-        <w:t>El Comité recibirá la información necesaria para conocer las condiciones financieras, económicas y crediticias nacionales, que necesite para su mejor desempeño por lo que recibirá copia de:</w:t>
+        <w:t xml:space="preserve">El Comité recibirá la información necesaria para conocer las condiciones financieras, económicas y crediticias nacionales, que necesite para su mejor desempeño por lo que recibirá copia de:</w:t>
       </w:r>
     </w:p>
     <w:p>
@@ -5669,7 +5669,7 @@
           <w:szCs w:val="24"/>
           <w:u w:val="single"/>
         </w:rPr>
-        <w:t>• Todos los acuerdos y otras decisiones del Consejo de Administración que correspondan a Políticas, procedimientos y lineamientos sobre el proceso financiero y crediticio de COMEDICA de R.L.</w:t>
+        <w:t xml:space="preserve">• Todos los acuerdos y otras decisiones del Consejo de Administración que correspondan a Políticas, procedimientos y lineamientos sobre el proceso financiero y crediticio de COMEDICA de R.L.</w:t>
       </w:r>
     </w:p>
     <w:p>
@@ -5699,7 +5699,7 @@
           <w:szCs w:val="24"/>
           <w:u w:val="single"/>
         </w:rPr>
-        <w:t>• De las opiniones y observaciones que sobre la organización y funcionamiento del Comité de Créditos le haga la Junta de Vigilancia directamente o a través del Consejo de Administración.</w:t>
+        <w:t xml:space="preserve">• De las opiniones y observaciones que sobre la organización y funcionamiento del Comité de Créditos le haga la Junta de Vigilancia directamente o a través del Consejo de Administración.</w:t>
       </w:r>
     </w:p>
     <w:p>
@@ -5729,7 +5729,7 @@
           <w:szCs w:val="24"/>
           <w:u w:val="single"/>
         </w:rPr>
-        <w:t>• Información sobre las condiciones de mora, así como de las variables de los usuarios en mora, que presenta las gerencias de la Cooperativa; y de los procesos en recuperación judicial de préstamos que el Comité de Cobros y Recuperación presente.</w:t>
+        <w:t xml:space="preserve">• Información sobre las condiciones de mora, así como de las variables de los usuarios en mora, que presenta las gerencias de la Cooperativa; y de los procesos en recuperación judicial de préstamos que el Comité de Cobros y Recuperación presente.</w:t>
       </w:r>
     </w:p>
     <w:p>
@@ -5773,7 +5773,7 @@
           <w:shd w:val="clear" w:color="auto" w:fill="FFFEFF"/>
           <w:lang w:val="es-ES_tradnl"/>
         </w:rPr>
-        <w:t>COMITÉ DE EDUCACIÓN</w:t>
+        <w:t xml:space="preserve">COMITÉ DE EDUCACIÓN</w:t>
       </w:r>
       <w:bookmarkEnd w:id="13"/>
       <w:bookmarkEnd w:id="14"/>
@@ -5829,7 +5829,7 @@
           <w:szCs w:val="24"/>
           <w:u w:val="none"/>
         </w:rPr>
-        <w:t>Objetivos</w:t>
+        <w:t xml:space="preserve">Objetivos</w:t>
       </w:r>
       <w:bookmarkEnd w:id="16"/>
       <w:bookmarkEnd w:id="17"/>
@@ -5903,7 +5903,7 @@
           <w:szCs w:val="24"/>
           <w:u w:val="single"/>
         </w:rPr>
-        <w:t>.</w:t>
+        <w:t xml:space="preserve">.</w:t>
       </w:r>
       <w:r>
         <w:rPr>
@@ -5968,7 +5968,7 @@
           <w:szCs w:val="24"/>
           <w:u w:val="none"/>
         </w:rPr>
-        <w:t>Responsabilidades</w:t>
+        <w:t xml:space="preserve">Responsabilidades</w:t>
       </w:r>
       <w:bookmarkEnd w:id="18"/>
       <w:bookmarkEnd w:id="19"/>
@@ -6018,7 +6018,7 @@
           <w:szCs w:val="24"/>
           <w:u w:val="none"/>
         </w:rPr>
-        <w:t>Son facultades y obligaciones del Comité de Educación:</w:t>
+        <w:t xml:space="preserve">Son facultades y obligaciones del Comité de Educación:</w:t>
       </w:r>
     </w:p>
     <w:p>
@@ -6070,7 +6070,7 @@
           <w:szCs w:val="24"/>
           <w:u w:val="none"/>
         </w:rPr>
-        <w:t>Elaborar y someter al Consejo de Administración el Plan Anual de Trabajo y el Presupuesto correspondiente, para su aprobación durante los primeros quince días del mes de diciembre.</w:t>
+        <w:t xml:space="preserve">Elaborar y someter al Consejo de Administración el Plan Anual de Trabajo y el Presupuesto correspondiente, para su aprobación durante los primeros quince días del mes de diciembre.</w:t>
       </w:r>
     </w:p>
     <w:p>
@@ -6125,7 +6125,7 @@
           <w:u w:val="none"/>
           <w:lang w:val="es-ES_tradnl"/>
         </w:rPr>
-        <w:t> actividades de promoción, información, para asociados y aspirantes, así como Cursos Básicos de cooperativismo, contemplados en el Plan de Trabajo mensual que deberá presentar al Consejo de Administración a más tardar en la segunda semana del mes anterior y que a su vez responderá a lo establecido en el plan anual y en su presupuesto, los cuales, podrán tener revisiones trimestrales.</w:t>
+        <w:t xml:space="preserve"> actividades de promoción, información, para asociados y aspirantes, así como Cursos Básicos de cooperativismo, contemplados en el Plan de Trabajo mensual que deberá presentar al Consejo de Administración a más tardar en la segunda semana del mes anterior y que a su vez responderá a lo establecido en el plan anual y en su presupuesto, los cuales, podrán tener revisiones trimestrales.</w:t>
       </w:r>
     </w:p>
     <w:p>
@@ -6180,7 +6180,7 @@
           <w:szCs w:val="24"/>
           <w:u w:val="none"/>
         </w:rPr>
-        <w:t>Planificar y realizar cursos, seminarios y otras actividades, con el propósito de educar a los Asociados y Aspirantes a ingresar a la Cooperativa.</w:t>
+        <w:t xml:space="preserve">Planificar y realizar cursos, seminarios y otras actividades, con el propósito de educar a los Asociados y Aspirantes a ingresar a la Cooperativa.</w:t>
       </w:r>
     </w:p>
     <w:p>
@@ -6236,7 +6236,7 @@
           <w:u w:val="none"/>
           <w:lang w:val="es-ES_tradnl"/>
         </w:rPr>
-        <w:t>Organizar e impartir el Curso Básico de Cooperativismo, por lo menos una vez al mes, en San Salvador, y según demanda, en el interior del país. Los cursos se realizaran de acuerdo a pedido expreso por parte de los aspirantes a asociarse; cuando su número así lo requiera, como apoyo al curso virtual en la página Web.</w:t>
+        <w:t xml:space="preserve">Organizar e impartir el Curso Básico de Cooperativismo, por lo menos una vez al mes, en San Salvador, y según demanda, en el interior del país. Los cursos se realizaran de acuerdo a pedido expreso por parte de los aspirantes a asociarse; cuando su número así lo requiera, como apoyo al curso virtual en la página Web.</w:t>
       </w:r>
     </w:p>
     <w:p>
@@ -6293,7 +6293,7 @@
           <w:u w:val="none"/>
           <w:lang w:val="es-ES_tradnl"/>
         </w:rPr>
-        <w:t>Publicar un boletín informativo u otras publicaciones educativas, culturales o científicas, que podrán ser parte de la página Web de la Cooperativa; la cual deberá mantenerse actualizada. La publicación impresa deberá ser al menos semestral, en la cual se dará a conocer a los asociados el funcionamiento de la Cooperativa y sus aspectos administrativos así como sus derechos y deberes por medio de notas y artículos Cooperativos, Gerenciales Científicos culturales de diversa naturaleza.</w:t>
+        <w:t xml:space="preserve">Publicar un boletín informativo u otras publicaciones educativas, culturales o científicas, que podrán ser parte de la página Web de la Cooperativa; la cual deberá mantenerse actualizada. La publicación impresa deberá ser al menos semestral, en la cual se dará a conocer a los asociados el funcionamiento de la Cooperativa y sus aspectos administrativos así como sus derechos y deberes por medio de notas y artículos Cooperativos, Gerenciales Científicos culturales de diversa naturaleza.</w:t>
       </w:r>
     </w:p>
     <w:p>
@@ -6350,7 +6350,7 @@
           <w:u w:val="none"/>
           <w:lang w:val="es-ES_tradnl"/>
         </w:rPr>
-        <w:t>Colaborar en la preparación y celebración de Asambleas Generales.</w:t>
+        <w:t xml:space="preserve">Colaborar en la preparación y celebración de Asambleas Generales.</w:t>
       </w:r>
     </w:p>
     <w:p>
@@ -6407,7 +6407,7 @@
           <w:u w:val="none"/>
           <w:lang w:val="es-ES_tradnl"/>
         </w:rPr>
-        <w:t>Elaboración de proyectos relacionados con la actividad educativa de Cuerpos Directivos, Asociados en General y Personal Administrativo.</w:t>
+        <w:t xml:space="preserve">Elaboración de proyectos relacionados con la actividad educativa de Cuerpos Directivos, Asociados en General y Personal Administrativo.</w:t>
       </w:r>
     </w:p>
     <w:p>
@@ -6464,7 +6464,7 @@
           <w:u w:val="none"/>
           <w:lang w:val="es-ES_tradnl"/>
         </w:rPr>
-        <w:t>Informar de los servicios y beneficios de que gozan los asociados, con el objetivo de aumentar la membresía y proyectar la imagen pública de nuestra Cooperativa.</w:t>
+        <w:t xml:space="preserve">Informar de los servicios y beneficios de que gozan los asociados, con el objetivo de aumentar la membresía y proyectar la imagen pública de nuestra Cooperativa.</w:t>
       </w:r>
     </w:p>
     <w:p>
@@ -6513,7 +6513,7 @@
           <w:u w:val="none"/>
           <w:lang w:val="es-ES_tradnl"/>
         </w:rPr>
-        <w:t>Realizar otras actividades y acciones que se estimen necesarias y convenientes para el cumplimiento de los objetivos de la Cooperativa. El Comité informara de los resultados al Consejo de Administración.</w:t>
+        <w:t xml:space="preserve">Realizar otras actividades y acciones que se estimen necesarias y convenientes para el cumplimiento de los objetivos de la Cooperativa. El Comité informara de los resultados al Consejo de Administración.</w:t>
       </w:r>
     </w:p>
     <w:p>
@@ -6636,7 +6636,7 @@
           <w:u w:val="none"/>
           <w:lang w:val="es-ES_tradnl"/>
         </w:rPr>
-        <w:t>Elaborar un informe mensual al Consejo de Administración con copia a Junta de Vigilancia de todos sus gastos, actividades y resultados.</w:t>
+        <w:t xml:space="preserve">Elaborar un informe mensual al Consejo de Administración con copia a Junta de Vigilancia de todos sus gastos, actividades y resultados.</w:t>
       </w:r>
     </w:p>
     <w:p>
@@ -6722,7 +6722,7 @@
           <w:szCs w:val="24"/>
           <w:u w:val="single"/>
         </w:rPr>
-        <w:t>El Comité estará integrado por: a) Un Presidente quien dirigirá las sesiones y será el representante nato del Comité; b) un Secretario, encargado de elaborar las actas de las sesiones y la correspondencia; y de llevar el control de gastos del fondo de educación. c) un Vocal, quien reemplazará al Presidente o al Secretario en caso de ausencia, y será el responsable del plan de capacitación, de su control y evaluación, d) Suplente, quien sustituirá al Vocal cuando éste se encuentre ausente o sustituyendo al Presidente o al Secretario y será el responsable de las publicaciones del Comité. Todos serán nombrados por el Consejo de administración.</w:t>
+        <w:t xml:space="preserve">El Comité estará integrado por: a) Un Presidente quien dirigirá las sesiones y será el representante nato del Comité; b) un Secretario, encargado de elaborar las actas de las sesiones y la correspondencia; y de llevar el control de gastos del fondo de educación. c) un Vocal, quien reemplazará al Presidente o al Secretario en caso de ausencia, y será el responsable del plan de capacitación, de su control y evaluación, d) Suplente, quien sustituirá al Vocal cuando éste se encuentre ausente o sustituyendo al Presidente o al Secretario y será el responsable de las publicaciones del Comité. Todos serán nombrados por el Consejo de administración.</w:t>
       </w:r>
     </w:p>
     <w:p>
@@ -6753,7 +6753,7 @@
           <w:szCs w:val="24"/>
           <w:u w:val="single"/>
         </w:rPr>
-        <w:t>Los requisitos para ser miembro del Comité de Educación se detallan en Anexo 6 y que forma parte integrante de éste Código.</w:t>
+        <w:t xml:space="preserve">Los requisitos para ser miembro del Comité de Educación se detallan en Anexo 6 y que forma parte integrante de éste Código.</w:t>
       </w:r>
     </w:p>
     <w:p>
@@ -6781,7 +6781,7 @@
           <w:szCs w:val="24"/>
           <w:u w:val="none"/>
         </w:rPr>
-        <w:t>Frecuencia de Reuniones</w:t>
+        <w:t xml:space="preserve">Frecuencia de Reuniones</w:t>
       </w:r>
     </w:p>
     <w:p>
@@ -6820,7 +6820,7 @@
           <w:szCs w:val="24"/>
           <w:u w:val="none"/>
         </w:rPr>
-        <w:t>Las sesiones del Comité de Educación son de dos clases: Ordinarias y Extraordinarias. Las ordinarias se celebran una vez por semana, el día, hora y lugar que se establezca de común acuerdo por los integrantes. Su duración dependerá de la agenda propuesta por el Secretario.</w:t>
+        <w:t xml:space="preserve">Las sesiones del Comité de Educación son de dos clases: Ordinarias y Extraordinarias. Las ordinarias se celebran una vez por semana, el día, hora y lugar que se establezca de común acuerdo por los integrantes. Su duración dependerá de la agenda propuesta por el Secretario.</w:t>
       </w:r>
     </w:p>
     <w:p>
@@ -6857,7 +6857,7 @@
           <w:szCs w:val="24"/>
           <w:u w:val="single"/>
         </w:rPr>
-        <w:t>Para ser válida la sesión se necesita que exista quórum con la presencia mínima de dos miembros del Comité.</w:t>
+        <w:t xml:space="preserve">Para ser válida la sesión se necesita que exista quórum con la presencia mínima de dos miembros del Comité.</w:t>
       </w:r>
     </w:p>
     <w:p>
@@ -6883,7 +6883,7 @@
           <w:szCs w:val="24"/>
           <w:u w:val="single"/>
         </w:rPr>
-        <w:t>Sus resoluciones o acuerdos se tomarán por mayoría de votos y en caso de empate el Presidente, o quien haga sus veces, tendrá doble voto.</w:t>
+        <w:t xml:space="preserve">Sus resoluciones o acuerdos se tomarán por mayoría de votos y en caso de empate el Presidente, o quien haga sus veces, tendrá doble voto.</w:t>
       </w:r>
     </w:p>
     <w:p>
@@ -6909,7 +6909,7 @@
           <w:szCs w:val="24"/>
           <w:u w:val="single"/>
         </w:rPr>
-        <w:t>Las actas serán breves, concisas, y orientadas a recoger lo esencial de lo tratado en cada sesión, agregándose la documentación necesaria cuando fuese pertinente. Una vez impresas en el libro legal serán firmadas por el Presidente, Secretario y Vocal en el libro respectivo. El miembro suplente firmara las actas cuando actúe como propietario durante toda la sesión. Semanalmente se enviará copia del acta a la Junta de Vigilancia.</w:t>
+        <w:t xml:space="preserve">Las actas serán breves, concisas, y orientadas a recoger lo esencial de lo tratado en cada sesión, agregándose la documentación necesaria cuando fuese pertinente. Una vez impresas en el libro legal serán firmadas por el Presidente, Secretario y Vocal en el libro respectivo. El miembro suplente firmara las actas cuando actúe como propietario durante toda la sesión. Semanalmente se enviará copia del acta a la Junta de Vigilancia.</w:t>
       </w:r>
     </w:p>
     <w:p>
@@ -6935,7 +6935,7 @@
           <w:szCs w:val="24"/>
           <w:u w:val="single"/>
         </w:rPr>
-        <w:t>El Jefe del Departamento de Educación y Responsabilidad Social preparará la documentación necesaria, en coordinación con el Secretario, y su participación en las sesiones estará sujeta a la naturaleza de los asuntos a tratar.</w:t>
+        <w:t xml:space="preserve">El Jefe del Departamento de Educación y Responsabilidad Social preparará la documentación necesaria, en coordinación con el Secretario, y su participación en las sesiones estará sujeta a la naturaleza de los asuntos a tratar.</w:t>
       </w:r>
     </w:p>
     <w:p>
@@ -7039,7 +7039,7 @@
           <w:shd w:val="clear" w:color="auto" w:fill="FFFEFF"/>
           <w:lang w:val="es-ES_tradnl"/>
         </w:rPr>
-        <w:t>Objetivos</w:t>
+        <w:t xml:space="preserve">Objetivos</w:t>
       </w:r>
       <w:bookmarkEnd w:id="25"/>
       <w:bookmarkEnd w:id="26"/>
@@ -7094,7 +7094,7 @@
           <w:szCs w:val="24"/>
           <w:u w:val="single"/>
         </w:rPr>
-        <w:t>y clientes</w:t>
+        <w:t xml:space="preserve">y clientes</w:t>
       </w:r>
       <w:r>
         <w:rPr>
@@ -7157,7 +7157,7 @@
           <w:szCs w:val="24"/>
           <w:u w:val="none"/>
         </w:rPr>
-        <w:t>Responsabilidades</w:t>
+        <w:t xml:space="preserve">Responsabilidades</w:t>
       </w:r>
       <w:bookmarkEnd w:id="27"/>
       <w:bookmarkEnd w:id="28"/>
@@ -7300,7 +7300,7 @@
           <w:u w:val="single"/>
           <w:lang w:val="es-SV" w:eastAsia="es-SV"/>
         </w:rPr>
-        <w:t>Analizar, Discutir y Aprobar las propuestas de solución presentadas por el Departamento de Soluciones Financieras en relación a las dificultades que presentan los asociados y clientes para cumplir con las obligaciones crediticias adquiridas con la cooperativa,</w:t>
+        <w:t xml:space="preserve">Analizar, Discutir y Aprobar las propuestas de solución presentadas por el Departamento de Soluciones Financieras en relación a las dificultades que presentan los asociados y clientes para cumplir con las obligaciones crediticias adquiridas con la cooperativa,</w:t>
       </w:r>
     </w:p>
     <w:p>
@@ -7332,7 +7332,7 @@
           <w:u w:val="single"/>
           <w:lang w:val="es-SV" w:eastAsia="es-SV"/>
         </w:rPr>
-        <w:t>Proponer alternativas de solución de los préstamos y tarjetas de crédito en mora.</w:t>
+        <w:t xml:space="preserve">Proponer alternativas de solución de los préstamos y tarjetas de crédito en mora.</w:t>
       </w:r>
     </w:p>
     <w:p>
@@ -7364,7 +7364,7 @@
           <w:u w:val="single"/>
           <w:lang w:val="es-SV" w:eastAsia="es-SV"/>
         </w:rPr>
-        <w:t>Aprobar y dar seguimiento a los casos que se trasladarán al cobro prejudicial</w:t>
+        <w:t xml:space="preserve">Aprobar y dar seguimiento a los casos que se trasladarán al cobro prejudicial</w:t>
       </w:r>
     </w:p>
     <w:p>
@@ -7459,7 +7459,7 @@
           <w:u w:val="single"/>
           <w:lang w:val="es-SV" w:eastAsia="es-SV"/>
         </w:rPr>
-        <w:t>Aprobar y dar seguimiento a los casos que se trasladarán al cobro prejudicial, notificando por escrito al Consejo de Administración para su ratificación Una vez ratificado el traslado a la vía judicial, dará seguimiento a los casos aprobados. Si se logra un arreglo de pago antes de que fuere asignado a un apoderado judicial, el Comité deberá notificar por escrito al Consejo de Administración, solicitando revocar el acuerdo de traslado.</w:t>
+        <w:t xml:space="preserve">Aprobar y dar seguimiento a los casos que se trasladarán al cobro prejudicial, notificando por escrito al Consejo de Administración para su ratificación Una vez ratificado el traslado a la vía judicial, dará seguimiento a los casos aprobados. Si se logra un arreglo de pago antes de que fuere asignado a un apoderado judicial, el Comité deberá notificar por escrito al Consejo de Administración, solicitando revocar el acuerdo de traslado.</w:t>
       </w:r>
     </w:p>
     <w:p>
@@ -7747,7 +7747,7 @@
           <w:u w:val="single"/>
           <w:lang w:val="es-SV" w:eastAsia="es-SV"/>
         </w:rPr>
-        <w:t>Elaborar el Plan de trabajo anual y su respectivo presupuesto, a solicitud del Consejo de Administración para su aprobación.</w:t>
+        <w:t xml:space="preserve">Elaborar el Plan de trabajo anual y su respectivo presupuesto, a solicitud del Consejo de Administración para su aprobación.</w:t>
       </w:r>
     </w:p>
     <w:p>
@@ -7779,7 +7779,7 @@
           <w:u w:val="single"/>
           <w:lang w:val="es-SV" w:eastAsia="es-SV"/>
         </w:rPr>
-        <w:t>Cuando lo considere necesario, podrá programar y participar en reuniones conjuntas con el Comité de Créditos.</w:t>
+        <w:t xml:space="preserve">Cuando lo considere necesario, podrá programar y participar en reuniones conjuntas con el Comité de Créditos.</w:t>
       </w:r>
     </w:p>
     <w:p>
@@ -7811,7 +7811,7 @@
           <w:u w:val="single"/>
           <w:lang w:val="es-SV" w:eastAsia="es-SV"/>
         </w:rPr>
-        <w:t>Solicitar al Departamento de Soluciones Financieras, reportes con relación al estado de la cartera, saldos en mora o cualquier otra información que considere necesaria.</w:t>
+        <w:t xml:space="preserve">Solicitar al Departamento de Soluciones Financieras, reportes con relación al estado de la cartera, saldos en mora o cualquier otra información que considere necesaria.</w:t>
       </w:r>
     </w:p>
     <w:p>
@@ -7843,7 +7843,7 @@
           <w:u w:val="single"/>
           <w:lang w:val="es-SV" w:eastAsia="es-SV"/>
         </w:rPr>
-        <w:t>Dar seguimiento a los casos presentados por el Departamento de Soluciones Financieras al Comité, cuando así se ha programado en sesiones previas del Comité.</w:t>
+        <w:t xml:space="preserve">Dar seguimiento a los casos presentados por el Departamento de Soluciones Financieras al Comité, cuando así se ha programado en sesiones previas del Comité.</w:t>
       </w:r>
     </w:p>
     <w:p>
@@ -7935,7 +7935,7 @@
           <w:u w:val="single"/>
           <w:lang w:val="es-ES_tradnl"/>
         </w:rPr>
-        <w:t>Director</w:t>
+        <w:t xml:space="preserve">Director</w:t>
       </w:r>
       <w:r>
         <w:rPr>
@@ -7983,7 +7983,7 @@
           <w:u w:val="single"/>
           <w:lang w:val="es-ES_tradnl"/>
         </w:rPr>
-        <w:t>Los requisitos para ser miembro del Comité de Cobros y Recuperación se detallan en Anexo 6 y que forma parte integrante de este Código.</w:t>
+        <w:t xml:space="preserve">Los requisitos para ser miembro del Comité de Cobros y Recuperación se detallan en Anexo 6 y que forma parte integrante de este Código.</w:t>
       </w:r>
     </w:p>
     <w:p>
@@ -8011,7 +8011,7 @@
           <w:szCs w:val="24"/>
           <w:u w:val="none"/>
         </w:rPr>
-        <w:t>Frecuencia de Reuniones</w:t>
+        <w:t xml:space="preserve">Frecuencia de Reuniones</w:t>
       </w:r>
     </w:p>
     <w:p>
@@ -8055,7 +8055,7 @@
           <w:u w:val="single"/>
           <w:lang w:val="es-SV" w:eastAsia="es-SV"/>
         </w:rPr>
-        <w:t>El Comité se reunirá ordinariamente una vez por semana a fin de analizar los casos presentados por el Departamento de Soluciones Financieras de la cartera de préstamos y tarjeta de crédito en donde se han agotado los esfuerzos de la gestión administrativa, sin resultados concretos y que presentan un estado de difícil recuperación o irrecuperables; podrán sesionar de forma extraordinaria cuando las circunstancias lo ameriten.</w:t>
+        <w:t xml:space="preserve">El Comité se reunirá ordinariamente una vez por semana a fin de analizar los casos presentados por el Departamento de Soluciones Financieras de la cartera de préstamos y tarjeta de crédito en donde se han agotado los esfuerzos de la gestión administrativa, sin resultados concretos y que presentan un estado de difícil recuperación o irrecuperables; podrán sesionar de forma extraordinaria cuando las circunstancias lo ameriten.</w:t>
       </w:r>
     </w:p>
     <w:p>
@@ -8086,7 +8086,7 @@
           <w:u w:val="single"/>
           <w:lang w:val="es-SV" w:eastAsia="es-SV"/>
         </w:rPr>
-        <w:t>La presencia de tres de sus miembros, propietarios o suplentes harán quórum, salvo causa justificada, todos deberán asistir a las reuniones.</w:t>
+        <w:t xml:space="preserve">La presencia de tres de sus miembros, propietarios o suplentes harán quórum, salvo causa justificada, todos deberán asistir a las reuniones.</w:t>
       </w:r>
     </w:p>
     <w:p>
@@ -8117,7 +8117,7 @@
           <w:u w:val="single"/>
           <w:lang w:val="es-SV" w:eastAsia="es-SV"/>
         </w:rPr>
-        <w:t>El jefe del Departamento de Soluciones Financieras es el responsable de presentar ante el Comité, los informes preparados por los ejecutivos con sus observaciones y recomendaciones. El Comité deberá tomar un acuerdo al respecto.</w:t>
+        <w:t xml:space="preserve">El jefe del Departamento de Soluciones Financieras es el responsable de presentar ante el Comité, los informes preparados por los ejecutivos con sus observaciones y recomendaciones. El Comité deberá tomar un acuerdo al respecto.</w:t>
       </w:r>
     </w:p>
     <w:p>
@@ -8148,7 +8148,7 @@
           <w:u w:val="single"/>
           <w:lang w:val="es-SV" w:eastAsia="es-SV"/>
         </w:rPr>
-        <w:t>Las resoluciones tomadas por el Comité deberán ser firmadas por todos los miembros titulares (presidente, secretario y vocal) presentes en la sesión, o por el suplente cuando faltare alguno de ellos. En caso de que un miembro no esté de acuerdo en alguna resolución tomada por la mayoría, deberá dejarlo consignado en el acta respectiva, dando sus razonamientos.</w:t>
+        <w:t xml:space="preserve">Las resoluciones tomadas por el Comité deberán ser firmadas por todos los miembros titulares (presidente, secretario y vocal) presentes en la sesión, o por el suplente cuando faltare alguno de ellos. En caso de que un miembro no esté de acuerdo en alguna resolución tomada por la mayoría, deberá dejarlo consignado en el acta respectiva, dando sus razonamientos.</w:t>
       </w:r>
     </w:p>
     <w:p>
@@ -8179,7 +8179,7 @@
           <w:u w:val="single"/>
           <w:lang w:val="es-SV" w:eastAsia="es-SV"/>
         </w:rPr>
-        <w:t>El Comité tendrá la facultad de convocar a los deudores y codeudores, para que asistan a exponer su situación y proponer alternativas de solución.</w:t>
+        <w:t xml:space="preserve">El Comité tendrá la facultad de convocar a los deudores y codeudores, para que asistan a exponer su situación y proponer alternativas de solución.</w:t>
       </w:r>
     </w:p>
     <w:p>
@@ -8210,7 +8210,7 @@
           <w:u w:val="single"/>
           <w:lang w:val="es-SV" w:eastAsia="es-SV"/>
         </w:rPr>
-        <w:t>La comunicación de los acuerdos del Comité se hará por escrito y serán firmados por el secretario, colocando el sello del Comité, se comunicarán al deudor y a sus codeudores, si hubiere. En los casos que sea necesario se comunicará a otros cuerpos directivos y entes relacionados.</w:t>
+        <w:t xml:space="preserve">La comunicación de los acuerdos del Comité se hará por escrito y serán firmados por el secretario, colocando el sello del Comité, se comunicarán al deudor y a sus codeudores, si hubiere. En los casos que sea necesario se comunicará a otros cuerpos directivos y entes relacionados.</w:t>
       </w:r>
     </w:p>
     <w:p>
@@ -8241,7 +8241,7 @@
           <w:u w:val="single"/>
           <w:lang w:val="es-SV" w:eastAsia="es-SV"/>
         </w:rPr>
-        <w:t>Las certificaciones de acuerdos que se soliciten serán expedidas por el Secretario del Comité.</w:t>
+        <w:t xml:space="preserve">Las certificaciones de acuerdos que se soliciten serán expedidas por el Secretario del Comité.</w:t>
       </w:r>
     </w:p>
     <w:p>
@@ -8284,7 +8284,7 @@
           <w:shd w:val="clear" w:color="auto" w:fill="FFFEFF"/>
           <w:lang w:val="es-ES_tradnl"/>
         </w:rPr>
-        <w:t>COMITÉ DE FINANZAS</w:t>
+        <w:t xml:space="preserve">COMITÉ DE FINANZAS</w:t>
       </w:r>
       <w:bookmarkEnd w:id="31"/>
       <w:bookmarkEnd w:id="32"/>
@@ -8338,7 +8338,7 @@
           <w:szCs w:val="24"/>
           <w:u w:val="none"/>
         </w:rPr>
-        <w:t>Objetivo</w:t>
+        <w:t xml:space="preserve">Objetivo</w:t>
       </w:r>
       <w:bookmarkEnd w:id="34"/>
       <w:r>
@@ -8351,7 +8351,7 @@
           <w:szCs w:val="24"/>
           <w:u w:val="none"/>
         </w:rPr>
-        <w:t>s</w:t>
+        <w:t xml:space="preserve">s</w:t>
       </w:r>
       <w:bookmarkEnd w:id="35"/>
     </w:p>
@@ -8389,7 +8389,7 @@
           <w:szCs w:val="24"/>
           <w:u w:val="single"/>
         </w:rPr>
-        <w:t>Es responsable de lograr la efectiva y eficiente administración de los recursos financieros, y de evaluar el impacto financiero de las medidas de recuperación y la información utilizada para la toma de decisiones.</w:t>
+        <w:t xml:space="preserve">Es responsable de lograr la efectiva y eficiente administración de los recursos financieros, y de evaluar el impacto financiero de las medidas de recuperación y la información utilizada para la toma de decisiones.</w:t>
       </w:r>
     </w:p>
     <w:p>
@@ -8423,7 +8423,7 @@
           <w:szCs w:val="24"/>
           <w:u w:val="none"/>
         </w:rPr>
-        <w:t>Responsabilidades</w:t>
+        <w:t xml:space="preserve">Responsabilidades</w:t>
       </w:r>
       <w:bookmarkEnd w:id="36"/>
       <w:bookmarkEnd w:id="37"/>
@@ -8462,7 +8462,7 @@
           <w:szCs w:val="24"/>
           <w:u w:val="none"/>
         </w:rPr>
-        <w:t>El Comité de Finanzas, tiene las siguientes atribuciones y responsabilidades:</w:t>
+        <w:t xml:space="preserve">El Comité de Finanzas, tiene las siguientes atribuciones y responsabilidades:</w:t>
       </w:r>
     </w:p>
     <w:p>
@@ -8514,7 +8514,7 @@
           <w:szCs w:val="24"/>
           <w:u w:val="none"/>
         </w:rPr>
-        <w:t>Analizar tasas de interés para instrumentos de colocación y captación.</w:t>
+        <w:t xml:space="preserve">Analizar tasas de interés para instrumentos de colocación y captación.</w:t>
       </w:r>
     </w:p>
     <w:p>
@@ -8556,7 +8556,7 @@
           <w:szCs w:val="24"/>
           <w:u w:val="none"/>
         </w:rPr>
-        <w:t>Analizar las Tablas de Cobro de Comisiones y otros cargos sobre servicios relacionados con las Carteras Activas, Pasivas y otros servicios de la Cooperativa.</w:t>
+        <w:t xml:space="preserve">Analizar las Tablas de Cobro de Comisiones y otros cargos sobre servicios relacionados con las Carteras Activas, Pasivas y otros servicios de la Cooperativa.</w:t>
       </w:r>
     </w:p>
     <w:p>
@@ -8598,7 +8598,7 @@
           <w:szCs w:val="24"/>
           <w:u w:val="none"/>
         </w:rPr>
-        <w:t>Revisar las Políticas de Crédito e Inversión de la Cooperativa.</w:t>
+        <w:t xml:space="preserve">Revisar las Políticas de Crédito e Inversión de la Cooperativa.</w:t>
       </w:r>
     </w:p>
     <w:p>
@@ -8640,7 +8640,7 @@
           <w:szCs w:val="24"/>
           <w:u w:val="none"/>
         </w:rPr>
-        <w:t>Analizar proyectos de nuevos instrumentos financieros, de captación, colocación.</w:t>
+        <w:t xml:space="preserve">Analizar proyectos de nuevos instrumentos financieros, de captación, colocación.</w:t>
       </w:r>
     </w:p>
     <w:p>
@@ -8724,7 +8724,7 @@
           <w:szCs w:val="24"/>
           <w:u w:val="none"/>
         </w:rPr>
-        <w:t>Evaluar y recomendar instituciones financieras para efectuar depósitos, inversiones y gestiones de crédito.</w:t>
+        <w:t xml:space="preserve">Evaluar y recomendar instituciones financieras para efectuar depósitos, inversiones y gestiones de crédito.</w:t>
       </w:r>
     </w:p>
     <w:p>
@@ -8766,7 +8766,7 @@
           <w:szCs w:val="24"/>
           <w:u w:val="none"/>
         </w:rPr>
-        <w:t>Conocer y dar seguimiento a Estados Financieros mensuales y sus Indicadores Financieros.</w:t>
+        <w:t xml:space="preserve">Conocer y dar seguimiento a Estados Financieros mensuales y sus Indicadores Financieros.</w:t>
       </w:r>
     </w:p>
     <w:p>
@@ -8808,7 +8808,7 @@
           <w:szCs w:val="24"/>
           <w:u w:val="none"/>
         </w:rPr>
-        <w:t>Evaluar el comportamiento y estructuras de las Carteras Activas y Pasivas.</w:t>
+        <w:t xml:space="preserve">Evaluar el comportamiento y estructuras de las Carteras Activas y Pasivas.</w:t>
       </w:r>
     </w:p>
     <w:p>
@@ -8850,7 +8850,7 @@
           <w:szCs w:val="24"/>
           <w:u w:val="none"/>
         </w:rPr>
-        <w:t>Evaluar las Tasas Activas y Pasivas, y proponer cambios de acuerdo a los objetivos y metas de la Cooperativa.</w:t>
+        <w:t xml:space="preserve">Evaluar las Tasas Activas y Pasivas, y proponer cambios de acuerdo a los objetivos y metas de la Cooperativa.</w:t>
       </w:r>
     </w:p>
     <w:p>
@@ -8892,7 +8892,7 @@
           <w:szCs w:val="24"/>
           <w:u w:val="none"/>
         </w:rPr>
-        <w:t>Evaluar políticas relacionadas con los seguros de la Cooperativa y pólizas de asociados.</w:t>
+        <w:t xml:space="preserve">Evaluar políticas relacionadas con los seguros de la Cooperativa y pólizas de asociados.</w:t>
       </w:r>
     </w:p>
     <w:p>
@@ -8934,7 +8934,7 @@
           <w:szCs w:val="24"/>
           <w:u w:val="none"/>
         </w:rPr>
-        <w:t>Analizar ofertas, negociar precios, términos y condiciones de Pólizas de Seguros Institucionales y de Asociados, y hacer recomendaciones al Consejo de Administración.</w:t>
+        <w:t xml:space="preserve">Analizar ofertas, negociar precios, términos y condiciones de Pólizas de Seguros Institucionales y de Asociados, y hacer recomendaciones al Consejo de Administración.</w:t>
       </w:r>
     </w:p>
     <w:p>
@@ -8978,7 +8978,7 @@
           <w:szCs w:val="24"/>
           <w:u w:val="none"/>
         </w:rPr>
-        <w:t>Recomendar Líneas específicas de Crédito, para Saneamiento y Salvatajes.</w:t>
+        <w:t xml:space="preserve">Recomendar Líneas específicas de Crédito, para Saneamiento y Salvatajes.</w:t>
       </w:r>
     </w:p>
     <w:p>
@@ -9019,7 +9019,7 @@
           <w:szCs w:val="24"/>
           <w:u w:val="none"/>
         </w:rPr>
-        <w:t>Definir políticas para el cumplimiento de las reservas de Liquidez.</w:t>
+        <w:t xml:space="preserve">Definir políticas para el cumplimiento de las reservas de Liquidez.</w:t>
       </w:r>
     </w:p>
     <w:p>
@@ -9061,7 +9061,7 @@
           <w:szCs w:val="24"/>
           <w:u w:val="none"/>
         </w:rPr>
-        <w:t>Evaluar Estudios de Factibilidad para crear Agencias, ampliar servicios financieros o de inversiones.</w:t>
+        <w:t xml:space="preserve">Evaluar Estudios de Factibilidad para crear Agencias, ampliar servicios financieros o de inversiones.</w:t>
       </w:r>
     </w:p>
     <w:p>
@@ -9103,7 +9103,7 @@
           <w:szCs w:val="24"/>
           <w:u w:val="none"/>
         </w:rPr>
-        <w:t>Proponer planes contingentes por liquidez o rentabilidad.</w:t>
+        <w:t xml:space="preserve">Proponer planes contingentes por liquidez o rentabilidad.</w:t>
       </w:r>
     </w:p>
     <w:p>
@@ -9145,7 +9145,7 @@
           <w:szCs w:val="24"/>
           <w:u w:val="none"/>
         </w:rPr>
-        <w:t>Evaluar Planes Contingentes para prevenir Fraudes en la Cooperativa.</w:t>
+        <w:t xml:space="preserve">Evaluar Planes Contingentes para prevenir Fraudes en la Cooperativa.</w:t>
       </w:r>
     </w:p>
     <w:p>
@@ -9187,7 +9187,7 @@
           <w:szCs w:val="24"/>
           <w:u w:val="none"/>
         </w:rPr>
-        <w:t>Verificar cumplimiento de límites de los niveles de concentración por tipos de fondeo y/o proveedores individuales.</w:t>
+        <w:t xml:space="preserve">Verificar cumplimiento de límites de los niveles de concentración por tipos de fondeo y/o proveedores individuales.</w:t>
       </w:r>
     </w:p>
     <w:p>
@@ -9229,7 +9229,7 @@
           <w:szCs w:val="24"/>
           <w:u w:val="none"/>
         </w:rPr>
-        <w:t>Evaluar políticas para minimizar los riesgos de la Cooperativa.</w:t>
+        <w:t xml:space="preserve">Evaluar políticas para minimizar los riesgos de la Cooperativa.</w:t>
       </w:r>
     </w:p>
     <w:p>
@@ -9271,7 +9271,7 @@
           <w:szCs w:val="24"/>
           <w:u w:val="none"/>
         </w:rPr>
-        <w:t>Informar al Consejo de Administración de los puntos tratados y Acuerdos en cada reunión.</w:t>
+        <w:t xml:space="preserve">Informar al Consejo de Administración de los puntos tratados y Acuerdos en cada reunión.</w:t>
       </w:r>
     </w:p>
     <w:p>
@@ -9313,7 +9313,7 @@
           <w:szCs w:val="24"/>
           <w:u w:val="single"/>
         </w:rPr>
-        <w:t>Evaluar, revisar y proponer al Consejo de Administración, el Plan de Recuperación y sus mejoras futuras;</w:t>
+        <w:t xml:space="preserve">Evaluar, revisar y proponer al Consejo de Administración, el Plan de Recuperación y sus mejoras futuras;</w:t>
       </w:r>
     </w:p>
     <w:p>
@@ -9341,7 +9341,7 @@
           <w:szCs w:val="24"/>
           <w:u w:val="single"/>
         </w:rPr>
-        <w:t>Proponer con fundamento razonado los ajustes necesarios al Plan de Recuperación o a los planes estratégicos y de negocio, según corresponda, a efecto de adecuarlos a la real situación económica y financiera y al perfil de riesgos de la Cooperativa;</w:t>
+        <w:t xml:space="preserve">Proponer con fundamento razonado los ajustes necesarios al Plan de Recuperación o a los planes estratégicos y de negocio, según corresponda, a efecto de adecuarlos a la real situación económica y financiera y al perfil de riesgos de la Cooperativa;</w:t>
       </w:r>
     </w:p>
     <w:p>
@@ -9369,7 +9369,7 @@
           <w:szCs w:val="24"/>
           <w:u w:val="single"/>
         </w:rPr>
-        <w:t>Definir los indicadores cuantitativos y cualitativos objeto de seguimiento del Plan de Recuperación;</w:t>
+        <w:t xml:space="preserve">Definir los indicadores cuantitativos y cualitativos objeto de seguimiento del Plan de Recuperación;</w:t>
       </w:r>
     </w:p>
     <w:p>
@@ -9397,7 +9397,7 @@
           <w:szCs w:val="24"/>
           <w:u w:val="single"/>
         </w:rPr>
-        <w:t>Asegurar que se implementen las acciones correctivas requeridas en caso de que exista incumplimiento a los límites establecidos, con respecto al nivel de tolerancia al riesgo de liquidez asumido.</w:t>
+        <w:t xml:space="preserve">Asegurar que se implementen las acciones correctivas requeridas en caso de que exista incumplimiento a los límites establecidos, con respecto al nivel de tolerancia al riesgo de liquidez asumido.</w:t>
       </w:r>
     </w:p>
     <w:p>
@@ -9425,7 +9425,7 @@
           <w:szCs w:val="24"/>
           <w:u w:val="single"/>
         </w:rPr>
-        <w:t>Velar por el cumplimiento de los requerimientos regulatorios en materia de planes de recuperación y atender los requerimientos de información por parte de la Superintendencia;</w:t>
+        <w:t xml:space="preserve">Velar por el cumplimiento de los requerimientos regulatorios en materia de planes de recuperación y atender los requerimientos de información por parte de la Superintendencia;</w:t>
       </w:r>
     </w:p>
     <w:p>
@@ -9453,7 +9453,7 @@
           <w:szCs w:val="24"/>
           <w:u w:val="single"/>
         </w:rPr>
-        <w:t>Evaluar la crisis de liquidez que se está implementando, decidir las acciones a seguir y monitorear los cambios en los escenarios para tomar acciones correctivas cuando sea necesario</w:t>
+        <w:t xml:space="preserve">Evaluar la crisis de liquidez que se está implementando, decidir las acciones a seguir y monitorear los cambios en los escenarios para tomar acciones correctivas cuando sea necesario</w:t>
       </w:r>
     </w:p>
     <w:p>
@@ -9481,7 +9481,7 @@
           <w:szCs w:val="24"/>
           <w:u w:val="single"/>
         </w:rPr>
-        <w:t>Dar seguimiento al cumplimiento de algunas de las medidas del Plan de Recuperación de acuerdo al requerimiento de la Superintendencia;</w:t>
+        <w:t xml:space="preserve">Dar seguimiento al cumplimiento de algunas de las medidas del Plan de Recuperación de acuerdo al requerimiento de la Superintendencia;</w:t>
       </w:r>
     </w:p>
     <w:p>
@@ -9509,7 +9509,7 @@
           <w:szCs w:val="24"/>
           <w:u w:val="single"/>
         </w:rPr>
-        <w:t>Recomendar al Consejo de Administración, la activación o modificación de los mecanismos de atención de la contingencia de liquidez;</w:t>
+        <w:t xml:space="preserve">Recomendar al Consejo de Administración, la activación o modificación de los mecanismos de atención de la contingencia de liquidez;</w:t>
       </w:r>
     </w:p>
     <w:p>
@@ -9537,7 +9537,7 @@
           <w:szCs w:val="24"/>
           <w:u w:val="none"/>
         </w:rPr>
-        <w:t>Otras funciones y responsabilidad que le sean delegadas por el Consejo de Administración.</w:t>
+        <w:t xml:space="preserve">Otras funciones y responsabilidad que le sean delegadas por el Consejo de Administración.</w:t>
       </w:r>
     </w:p>
     <w:p>
@@ -9619,7 +9619,7 @@
           <w:szCs w:val="24"/>
           <w:u w:val="single"/>
         </w:rPr>
-        <w:t>El Comité estará integrado por los siguientes cargos: del Consejo de Administración, Presidente, Tesorero, Vocal y Director que se desempeñe como Presidente del Comité de Créditos; de la Junta de Vigilancia, Presidente y Secretario; Gerente General o su delegado, el Gerente de Finanzas y Planificación, Gerente de Negocios y el Gerente de Operaciones.</w:t>
+        <w:t xml:space="preserve">El Comité estará integrado por los siguientes cargos: del Consejo de Administración, Presidente, Tesorero, Vocal y Director que se desempeñe como Presidente del Comité de Créditos; de la Junta de Vigilancia, Presidente y Secretario; Gerente General o su delegado, el Gerente de Finanzas y Planificación, Gerente de Negocios y el Gerente de Operaciones.</w:t>
       </w:r>
     </w:p>
     <w:p>
@@ -9643,7 +9643,7 @@
           <w:szCs w:val="24"/>
           <w:u w:val="single"/>
         </w:rPr>
-        <w:t>El Comité será presidido por el Presidente del Consejo de Administración y en su ausencia por el Tesorero, las actas serán levantadas por el Gerente de Finanzas y Planificación. El plazo del ejercicio para miembros directivos será de tres años, o por el período que se encuentren desempeñando dichos cargos en los respectivos Cuerpos Directivos y para miembros del personal administrativo el periodo que se encuentren fungiendo como responsables de los puestos señalados.</w:t>
+        <w:t xml:space="preserve">El Comité será presidido por el Presidente del Consejo de Administración y en su ausencia por el Tesorero, las actas serán levantadas por el Gerente de Finanzas y Planificación. El plazo del ejercicio para miembros directivos será de tres años, o por el período que se encuentren desempeñando dichos cargos en los respectivos Cuerpos Directivos y para miembros del personal administrativo el periodo que se encuentren fungiendo como responsables de los puestos señalados.</w:t>
       </w:r>
     </w:p>
     <w:p>
@@ -9667,7 +9667,7 @@
           <w:szCs w:val="24"/>
           <w:u w:val="single"/>
         </w:rPr>
-        <w:t>Los requisitos para ser miembro del Comité de Finanzas y de Recuperación Financiera se detallan en Anexo 6 y que forma parte integrante de este Código.</w:t>
+        <w:t xml:space="preserve">Los requisitos para ser miembro del Comité de Finanzas y de Recuperación Financiera se detallan en Anexo 6 y que forma parte integrante de este Código.</w:t>
       </w:r>
     </w:p>
     <w:p>
@@ -9701,7 +9701,7 @@
           <w:szCs w:val="24"/>
           <w:u w:val="none"/>
         </w:rPr>
-        <w:t>Frecuencia de Reuniones</w:t>
+        <w:t xml:space="preserve">Frecuencia de Reuniones</w:t>
       </w:r>
       <w:bookmarkEnd w:id="40"/>
       <w:bookmarkEnd w:id="41"/>
@@ -9747,7 +9747,7 @@
           <w:szCs w:val="24"/>
           <w:u w:val="single"/>
         </w:rPr>
-        <w:t>El Comité de Finanzas y de Recuperación Financiera, se reunirá una vez al mes o por lo menos una vez cada trimestre para dar seguimiento a las actividades relacionadas con la gestión financiera. Reportará directamente al Consejo de Administración, con copia a la Junta de Vigilancia y Gerente General.</w:t>
+        <w:t xml:space="preserve">El Comité de Finanzas y de Recuperación Financiera, se reunirá una vez al mes o por lo menos una vez cada trimestre para dar seguimiento a las actividades relacionadas con la gestión financiera. Reportará directamente al Consejo de Administración, con copia a la Junta de Vigilancia y Gerente General.</w:t>
       </w:r>
     </w:p>
     <w:p>
@@ -9775,7 +9775,7 @@
           <w:szCs w:val="24"/>
           <w:u w:val="single"/>
         </w:rPr>
-        <w:t>Para las reuniones ordinarias, el Gerente de Finanzas y Planificación a requerimiento del Presidente del Consejo de Administración o en su defecto por el Tesorero, convocará por medio escrito, electrónico o llamada telefónica a cada uno de los miembros del Comité con al menos dos días hábiles de anticipación, salvo excepciones que ameriten reunión de carácter urgente.</w:t>
+        <w:t xml:space="preserve">Para las reuniones ordinarias, el Gerente de Finanzas y Planificación a requerimiento del Presidente del Consejo de Administración o en su defecto por el Tesorero, convocará por medio escrito, electrónico o llamada telefónica a cada uno de los miembros del Comité con al menos dos días hábiles de anticipación, salvo excepciones que ameriten reunión de carácter urgente.</w:t>
       </w:r>
     </w:p>
     <w:p>
@@ -9803,7 +9803,7 @@
           <w:szCs w:val="24"/>
           <w:u w:val="single"/>
         </w:rPr>
-        <w:t>Los Acuerdos que se tomen serán presentados por el Tesorero al Consejo de Administración, para su aprobación; y el Gerente General comunicará a Gerentes de Área los acuerdos aprobados para su conocimiento y/o cumplimiento.</w:t>
+        <w:t xml:space="preserve">Los Acuerdos que se tomen serán presentados por el Tesorero al Consejo de Administración, para su aprobación; y el Gerente General comunicará a Gerentes de Área los acuerdos aprobados para su conocimiento y/o cumplimiento.</w:t>
       </w:r>
     </w:p>
     <w:p>
@@ -9831,7 +9831,7 @@
           <w:szCs w:val="24"/>
           <w:u w:val="single"/>
         </w:rPr>
-        <w:t>El día, hora y lugar de la reunión se establecerá por el Presidente del Consejo de Administración y en su ausencia por el Tesorero del mismo cuerpo directivo.</w:t>
+        <w:t xml:space="preserve">El día, hora y lugar de la reunión se establecerá por el Presidente del Consejo de Administración y en su ausencia por el Tesorero del mismo cuerpo directivo.</w:t>
       </w:r>
     </w:p>
     <w:p>
@@ -9859,7 +9859,7 @@
           <w:szCs w:val="24"/>
           <w:u w:val="single"/>
         </w:rPr>
-        <w:t>La agenda será propuesta por el Gerente de Finanzas y Planificación, Gerente General o a quien éste delegue; la cual será aprobada por el Comité de Finanzas y de Recuperación Financiera.</w:t>
+        <w:t xml:space="preserve">La agenda será propuesta por el Gerente de Finanzas y Planificación, Gerente General o a quien éste delegue; la cual será aprobada por el Comité de Finanzas y de Recuperación Financiera.</w:t>
       </w:r>
     </w:p>
     <w:p>
@@ -9887,7 +9887,7 @@
           <w:szCs w:val="24"/>
           <w:u w:val="single"/>
         </w:rPr>
-        <w:t>Los informes de las reuniones realizadas deberán ser firmados por los miembros que participaron en la reunión, dejando constancia de las razones de sus desacuerdos en caso que los haya.</w:t>
+        <w:t xml:space="preserve">Los informes de las reuniones realizadas deberán ser firmados por los miembros que participaron en la reunión, dejando constancia de las razones de sus desacuerdos en caso que los haya.</w:t>
       </w:r>
     </w:p>
     <w:p>
@@ -9915,7 +9915,7 @@
           <w:szCs w:val="24"/>
           <w:u w:val="single"/>
         </w:rPr>
-        <w:t>Para las reuniones del Comité, se establecerá quórum con la presencia del Presidente o Tesorero del Consejo de Administración, tres miembros directivos más Gerente de Finanzas y Planificación y el Gerente General o su delegado. Los acuerdos se tomarán por consenso o mayoría.</w:t>
+        <w:t xml:space="preserve">Para las reuniones del Comité, se establecerá quórum con la presencia del Presidente o Tesorero del Consejo de Administración, tres miembros directivos más Gerente de Finanzas y Planificación y el Gerente General o su delegado. Los acuerdos se tomarán por consenso o mayoría.</w:t>
       </w:r>
     </w:p>
     <w:p>
@@ -9959,7 +9959,7 @@
           <w:shd w:val="clear" w:color="auto" w:fill="FFFEFF"/>
           <w:lang w:val="es-ES_tradnl"/>
         </w:rPr>
-        <w:t>COMITÉ DE AUDITORÍA</w:t>
+        <w:t xml:space="preserve">COMITÉ DE AUDITORÍA</w:t>
       </w:r>
       <w:bookmarkEnd w:id="42"/>
       <w:bookmarkEnd w:id="43"/>
@@ -10021,7 +10021,7 @@
           <w:szCs w:val="24"/>
           <w:u w:val="none"/>
         </w:rPr>
-        <w:t>Objetivos</w:t>
+        <w:t xml:space="preserve">Objetivos</w:t>
       </w:r>
       <w:bookmarkEnd w:id="45"/>
       <w:bookmarkEnd w:id="46"/>
@@ -10059,7 +10059,7 @@
           <w:szCs w:val="24"/>
           <w:u w:val="none"/>
         </w:rPr>
-        <w:t>Servir de apoyo al Consejo de Administración en el cumplimiento de sus responsabilidades con respecto a la gestión de la información financiera y contable de la Cooperativa; en validar la efectividad de las políticas, sistemas y procedimientos que aseguren la identificación y adecuada gestión de los riesgos que enfrenta la organización; evaluar el fiel cumplimiento de las normas, leyes y regulaciones que apliquen a las actividades de la Cooperativa.</w:t>
+        <w:t xml:space="preserve">Servir de apoyo al Consejo de Administración en el cumplimiento de sus responsabilidades con respecto a la gestión de la información financiera y contable de la Cooperativa; en validar la efectividad de las políticas, sistemas y procedimientos que aseguren la identificación y adecuada gestión de los riesgos que enfrenta la organización; evaluar el fiel cumplimiento de las normas, leyes y regulaciones que apliquen a las actividades de la Cooperativa.</w:t>
       </w:r>
     </w:p>
     <w:p>
@@ -10104,7 +10104,7 @@
           <w:szCs w:val="24"/>
           <w:u w:val="none"/>
         </w:rPr>
-        <w:t>Responsabilidades</w:t>
+        <w:t xml:space="preserve">Responsabilidades</w:t>
       </w:r>
       <w:bookmarkEnd w:id="47"/>
       <w:bookmarkEnd w:id="48"/>
@@ -10142,7 +10142,7 @@
           <w:szCs w:val="24"/>
           <w:u w:val="none"/>
         </w:rPr>
-        <w:t>El Comité de Auditoría tendrá las siguientes funciones:</w:t>
+        <w:t xml:space="preserve">El Comité de Auditoría tendrá las siguientes funciones:</w:t>
       </w:r>
     </w:p>
     <w:p>
@@ -10278,7 +10278,7 @@
           <w:u w:val="none"/>
           <w:lang w:val="es-SV" w:eastAsia="es-SV"/>
         </w:rPr>
-        <w:t>Evaluar la labor de Auditoría Interna, así como el cumplimiento de su plan anual de trabajo y demás obligaciones contenidas en las “Normas Técnicas de Auditoría Interna para los Integrantes del Sistema Financiero”.</w:t>
+        <w:t xml:space="preserve">Evaluar la labor de Auditoría Interna, así como el cumplimiento de su plan anual de trabajo y demás obligaciones contenidas en las “Normas Técnicas de Auditoría Interna para los Integrantes del Sistema Financiero”.</w:t>
       </w:r>
     </w:p>
     <w:p>
@@ -10327,7 +10327,7 @@
           <w:u w:val="none"/>
           <w:lang w:val="es-SV" w:eastAsia="es-SV"/>
         </w:rPr>
-        <w:t>Conocer y evaluar los procesos relacionados con información financiera de la Cooperativa y los sistemas de control interno de la entidad.</w:t>
+        <w:t xml:space="preserve">Conocer y evaluar los procesos relacionados con información financiera de la Cooperativa y los sistemas de control interno de la entidad.</w:t>
       </w:r>
     </w:p>
     <w:p>
@@ -10387,7 +10387,7 @@
           <w:u w:val="single"/>
           <w:lang w:val="es-SV" w:eastAsia="es-SV"/>
         </w:rPr>
-        <w:t>prevención del</w:t>
+        <w:t xml:space="preserve">prevención del</w:t>
       </w:r>
       <w:r>
         <w:rPr>
@@ -10420,7 +10420,7 @@
           <w:u w:val="single"/>
           <w:lang w:val="es-SV" w:eastAsia="es-SV"/>
         </w:rPr>
-        <w:t>dinero y</w:t>
+        <w:t xml:space="preserve">dinero y</w:t>
       </w:r>
       <w:r>
         <w:rPr>
@@ -10453,7 +10453,7 @@
           <w:u w:val="single"/>
           <w:lang w:val="es-SV" w:eastAsia="es-SV"/>
         </w:rPr>
-        <w:t>y la Financiación de la Proliferación de Armas de Destrucción Masiva,</w:t>
+        <w:t xml:space="preserve">y la Financiación de la Proliferación de Armas de Destrucción Masiva,</w:t>
       </w:r>
       <w:r>
         <w:rPr>
@@ -10475,7 +10475,7 @@
           <w:u w:val="single"/>
           <w:lang w:val="es-SV" w:eastAsia="es-SV"/>
         </w:rPr>
-        <w:t>PLDA/FT/FPADM</w:t>
+        <w:t xml:space="preserve">PLDA/FT/FPADM</w:t>
       </w:r>
       <w:r>
         <w:rPr>
@@ -10556,7 +10556,7 @@
           <w:u w:val="none"/>
           <w:lang w:val="es-SV" w:eastAsia="es-SV"/>
         </w:rPr>
-        <w:t>Velar por el cumplimiento de los acuerdos de la Asamblea General de Asociados y del Consejo de Administración, y de las disposiciones de la Superintendencia, del Banco Central y de otras instituciones públicas cuando corresponda.</w:t>
+        <w:t xml:space="preserve">Velar por el cumplimiento de los acuerdos de la Asamblea General de Asociados y del Consejo de Administración, y de las disposiciones de la Superintendencia, del Banco Central y de otras instituciones públicas cuando corresponda.</w:t>
       </w:r>
     </w:p>
     <w:p>
@@ -10605,7 +10605,7 @@
           <w:u w:val="none"/>
           <w:lang w:val="es-SV" w:eastAsia="es-SV"/>
         </w:rPr>
-        <w:t>Dar seguimiento a las observaciones que se formulen en los informes del Auditor Interno, del Auditor Externo, de la Superintendencia y de otras instituciones públicas, para corregirlas o para contribuir a su desvanecimiento, lo cual deberá ser informado oportunamente a la Superintendencia.</w:t>
+        <w:t xml:space="preserve">Dar seguimiento a las observaciones que se formulen en los informes del Auditor Interno, del Auditor Externo, de la Superintendencia y de otras instituciones públicas, para corregirlas o para contribuir a su desvanecimiento, lo cual deberá ser informado oportunamente a la Superintendencia.</w:t>
       </w:r>
     </w:p>
     <w:p>
@@ -10654,7 +10654,7 @@
           <w:u w:val="none"/>
           <w:lang w:val="es-SV" w:eastAsia="es-SV"/>
         </w:rPr>
-        <w:t>Informar con regularidad al Consejo de Administración del seguimiento a las observaciones de los informes del Auditor Interno, del Auditor Externo, de la Superintendencia y de otras instituciones públicas.</w:t>
+        <w:t xml:space="preserve">Informar con regularidad al Consejo de Administración del seguimiento a las observaciones de los informes del Auditor Interno, del Auditor Externo, de la Superintendencia y de otras instituciones públicas.</w:t>
       </w:r>
     </w:p>
     <w:p>
@@ -10700,7 +10700,7 @@
           <w:u w:val="none"/>
           <w:lang w:val="es-SV" w:eastAsia="es-SV"/>
         </w:rPr>
-        <w:t>Cerciorarse que los estados financieros intermedios y de cierre de ejercicio sean elaborados cumpliendo los lineamientos normativos.</w:t>
+        <w:t xml:space="preserve">Cerciorarse que los estados financieros intermedios y de cierre de ejercicio sean elaborados cumpliendo los lineamientos normativos.</w:t>
       </w:r>
     </w:p>
     <w:p>
@@ -10745,7 +10745,7 @@
           <w:u w:val="none"/>
           <w:lang w:val="es-SV" w:eastAsia="es-SV"/>
         </w:rPr>
-        <w:t>Conocer y analizar el plan anual de auditoria interna basado en riesgos, así como aquellos planes adicionales de carácter ocasional o específico que debieran ponerse en práctica por razones de cambios regulatorios o por necesidades de la organización, y proponer la aprobación al Consejo de Administración.</w:t>
+        <w:t xml:space="preserve">Conocer y analizar el plan anual de auditoria interna basado en riesgos, así como aquellos planes adicionales de carácter ocasional o específico que debieran ponerse en práctica por razones de cambios regulatorios o por necesidades de la organización, y proponer la aprobación al Consejo de Administración.</w:t>
       </w:r>
     </w:p>
     <w:p>
@@ -10905,7 +10905,7 @@
           <w:u w:val="none"/>
           <w:lang w:val="es-SV" w:eastAsia="es-SV"/>
         </w:rPr>
-        <w:t>El análisis realizado desde el punto de vista técnico para contratar al mismo auditor externo para el período siguiente o de sustituirlo en su caso.</w:t>
+        <w:t xml:space="preserve">El análisis realizado desde el punto de vista técnico para contratar al mismo auditor externo para el período siguiente o de sustituirlo en su caso.</w:t>
       </w:r>
     </w:p>
     <w:p>
@@ -10963,7 +10963,7 @@
           <w:u w:val="none"/>
           <w:lang w:val="es-SV" w:eastAsia="es-SV"/>
         </w:rPr>
-        <w:t>Proponer al Consejo de Administración y ésta a su vez a la Asamblea General de Asociados el nombramiento de los Auditores Externos y del Auditor Fiscal. En la contratación de los Auditores Externos deberá considerarse su independencia respecto de otros servicios profesionales proporcionados, tal como lo establece el artículo relativo a la incompatibilidad con otros servicios profesionales establecido en las “Normas Técnicas para la Prestación de Servicios de Auditoría Externa”.</w:t>
+        <w:t xml:space="preserve">Proponer al Consejo de Administración y ésta a su vez a la Asamblea General de Asociados el nombramiento de los Auditores Externos y del Auditor Fiscal. En la contratación de los Auditores Externos deberá considerarse su independencia respecto de otros servicios profesionales proporcionados, tal como lo establece el artículo relativo a la incompatibilidad con otros servicios profesionales establecido en las “Normas Técnicas para la Prestación de Servicios de Auditoría Externa”.</w:t>
       </w:r>
     </w:p>
     <w:p>
@@ -11056,7 +11056,7 @@
           <w:u w:val="single"/>
           <w:lang w:val="es-SV" w:eastAsia="es-SV"/>
         </w:rPr>
-        <w:t>Evaluar de forma independiente la efectividad de los controles implementados con el Plan de Recuperación.</w:t>
+        <w:t xml:space="preserve">Evaluar de forma independiente la efectividad de los controles implementados con el Plan de Recuperación.</w:t>
       </w:r>
     </w:p>
     <w:p>
@@ -11088,7 +11088,7 @@
           <w:u w:val="single"/>
           <w:lang w:val="es-SV" w:eastAsia="es-SV"/>
         </w:rPr>
-        <w:t>Emitir recomendaciones al Consejo de Administración para fortalecer el proceso de recuperación.</w:t>
+        <w:t xml:space="preserve">Emitir recomendaciones al Consejo de Administración para fortalecer el proceso de recuperación.</w:t>
       </w:r>
     </w:p>
     <w:p>
@@ -11120,7 +11120,7 @@
           <w:u w:val="single"/>
           <w:lang w:val="es-SV" w:eastAsia="es-SV"/>
         </w:rPr>
-        <w:t>Informar al Consejo de Administración y al Comité de Auditoría y Finanzas sobre hallazgos relevantes.</w:t>
+        <w:t xml:space="preserve">Informar al Consejo de Administración y al Comité de Auditoría y Finanzas sobre hallazgos relevantes.</w:t>
       </w:r>
     </w:p>
     <w:p>
@@ -11195,7 +11195,7 @@
           <w:u w:val="none"/>
           <w:lang w:val="es-SV" w:eastAsia="es-SV"/>
         </w:rPr>
-        <w:t>El Comité está integrado por los siguientes miembros: por tres miembros independientes: El presidente del Consejo de Administración, quien preside el comité, un segundo Directivo del Consejo de Administración y un miembro de la Junta de Vigilancia; Gerente General, Gerente de Finanzas y Planificación y Auditor Interno. Este último tendrá el cargo de Secretario.</w:t>
+        <w:t xml:space="preserve">El Comité está integrado por los siguientes miembros: por tres miembros independientes: El presidente del Consejo de Administración, quien preside el comité, un segundo Directivo del Consejo de Administración y un miembro de la Junta de Vigilancia; Gerente General, Gerente de Finanzas y Planificación y Auditor Interno. Este último tendrá el cargo de Secretario.</w:t>
       </w:r>
     </w:p>
     <w:p>
@@ -11249,7 +11249,7 @@
           <w:u w:val="single"/>
           <w:lang w:val="es-SV" w:eastAsia="es-SV"/>
         </w:rPr>
-        <w:t>Los Miembros del Comité, podrán delegar sustituto en caso de que ocurra ausencia justificada.</w:t>
+        <w:t xml:space="preserve">Los Miembros del Comité, podrán delegar sustituto en caso de que ocurra ausencia justificada.</w:t>
       </w:r>
     </w:p>
     <w:p>
@@ -11276,7 +11276,7 @@
           <w:u w:val="single"/>
           <w:lang w:val="es-SV" w:eastAsia="es-SV"/>
         </w:rPr>
-        <w:t>Los requisitos para ser miembro del Comité de Auditoría se detallan en Anexo 4 y que forma parte integrante de éste Código.</w:t>
+        <w:t xml:space="preserve">Los requisitos para ser miembro del Comité de Auditoría se detallan en Anexo 4 y que forma parte integrante de éste Código.</w:t>
       </w:r>
     </w:p>
     <w:p>
@@ -11308,7 +11308,7 @@
           <w:szCs w:val="24"/>
           <w:u w:val="none"/>
         </w:rPr>
-        <w:t>Frecuencia de Reuniones</w:t>
+        <w:t xml:space="preserve">Frecuencia de Reuniones</w:t>
       </w:r>
       <w:bookmarkEnd w:id="51"/>
       <w:bookmarkEnd w:id="52"/>
@@ -11403,7 +11403,7 @@
           <w:u w:val="single"/>
           <w:lang w:val="es-SV" w:eastAsia="es-SV"/>
         </w:rPr>
-        <w:t>El Auditor Interno será el Secretario del Comité, y levantará el acta de cada una de las sesiones mantenidas, que será aprobada en la sesión inmediatamente posterior. Las actas del Comité deberán estar a disposición de todos los Directores del Consejo de Administración.</w:t>
+        <w:t xml:space="preserve">El Auditor Interno será el Secretario del Comité, y levantará el acta de cada una de las sesiones mantenidas, que será aprobada en la sesión inmediatamente posterior. Las actas del Comité deberán estar a disposición de todos los Directores del Consejo de Administración.</w:t>
       </w:r>
     </w:p>
     <w:p>
@@ -11434,7 +11434,7 @@
           <w:u w:val="single"/>
           <w:lang w:val="es-SV" w:eastAsia="es-SV"/>
         </w:rPr>
-        <w:t>A las reuniones del Comité pueden ser citados con la frecuencia necesaria y con el fin de requerir explicaciones pertinentes acerca de asuntos de control interno, Gerentes de Área, Jefes de Departamentos, Auditor Externo, Auditor Fiscal, así como cualquier otro funcionario que el Comité considere conveniente.</w:t>
+        <w:t xml:space="preserve">A las reuniones del Comité pueden ser citados con la frecuencia necesaria y con el fin de requerir explicaciones pertinentes acerca de asuntos de control interno, Gerentes de Área, Jefes de Departamentos, Auditor Externo, Auditor Fiscal, así como cualquier otro funcionario que el Comité considere conveniente.</w:t>
       </w:r>
     </w:p>
     <w:p>
@@ -11465,7 +11465,7 @@
           <w:u w:val="single"/>
           <w:lang w:val="es-SV" w:eastAsia="es-SV"/>
         </w:rPr>
-        <w:t>Cuando algún miembro del Comité tuviese interés personal en cualquier asunto que debe discutirse en el Comité, deberá ausentarse de la reunión hasta que la decisión se adopte.</w:t>
+        <w:t xml:space="preserve">Cuando algún miembro del Comité tuviese interés personal en cualquier asunto que debe discutirse en el Comité, deberá ausentarse de la reunión hasta que la decisión se adopte.</w:t>
       </w:r>
     </w:p>
     <w:p>
@@ -11496,7 +11496,7 @@
           <w:u w:val="single"/>
           <w:lang w:val="es-SV" w:eastAsia="es-SV"/>
         </w:rPr>
-        <w:t>Los miembros del Comité que tengan conocimiento de algún potencial conflicto de interés (directo o indirecto), de cualquiera que los otros miembros, deberán manifestarlo a fin de que se delibere si procede o no el retiro del miembro de la sesión. Dicha deliberación quedará asentada en el acta de la mencionada Sesión.</w:t>
+        <w:t xml:space="preserve">Los miembros del Comité que tengan conocimiento de algún potencial conflicto de interés (directo o indirecto), de cualquiera que los otros miembros, deberán manifestarlo a fin de que se delibere si procede o no el retiro del miembro de la sesión. Dicha deliberación quedará asentada en el acta de la mencionada Sesión.</w:t>
       </w:r>
     </w:p>
     <w:p>
@@ -11598,7 +11598,7 @@
           <w:szCs w:val="24"/>
           <w:u w:val="none"/>
         </w:rPr>
-        <w:t>Objetivo</w:t>
+        <w:t xml:space="preserve">Objetivo</w:t>
       </w:r>
       <w:bookmarkEnd w:id="56"/>
       <w:r>
@@ -11611,7 +11611,7 @@
           <w:szCs w:val="24"/>
           <w:u w:val="none"/>
         </w:rPr>
-        <w:t>s</w:t>
+        <w:t xml:space="preserve">s</w:t>
       </w:r>
       <w:bookmarkEnd w:id="57"/>
     </w:p>
@@ -11649,7 +11649,7 @@
           <w:szCs w:val="24"/>
           <w:u w:val="single"/>
         </w:rPr>
-        <w:t>El Comité de Riesgos es una instancia asesora y de apoyo al Consejo de Administración, actuará con criterio de independencia, confidencialidad y objetividad en el cumplimiento de sus responsabilidades de seguimiento de la gestión de riesgos, asimismo es el enlance con el Consejo de Administración.</w:t>
+        <w:t xml:space="preserve">El Comité de Riesgos es una instancia asesora y de apoyo al Consejo de Administración, actuará con criterio de independencia, confidencialidad y objetividad en el cumplimiento de sus responsabilidades de seguimiento de la gestión de riesgos, asimismo es el enlance con el Consejo de Administración.</w:t>
       </w:r>
     </w:p>
     <w:p>
@@ -11683,7 +11683,7 @@
           <w:szCs w:val="24"/>
           <w:u w:val="none"/>
         </w:rPr>
-        <w:t>Responsabilidades</w:t>
+        <w:t xml:space="preserve">Responsabilidades</w:t>
       </w:r>
       <w:bookmarkEnd w:id="58"/>
       <w:bookmarkEnd w:id="59"/>
@@ -11779,7 +11779,7 @@
           <w:u w:val="single"/>
           <w:lang w:val="es-SV" w:eastAsia="es-SV"/>
         </w:rPr>
-        <w:t>Evaluar, revisar y proponer para aprobación del</w:t>
+        <w:t xml:space="preserve">Evaluar, revisar y proponer para aprobación del</w:t>
       </w:r>
       <w:r>
         <w:rPr>
@@ -11812,7 +11812,7 @@
           <w:u w:val="single"/>
           <w:lang w:val="es-SV" w:eastAsia="es-SV"/>
         </w:rPr>
-        <w:t>, estrategias, políticas y manuales para la</w:t>
+        <w:t xml:space="preserve">, estrategias, políticas y manuales para la</w:t>
       </w:r>
       <w:r>
         <w:rPr>
@@ -11845,7 +11845,7 @@
           <w:u w:val="single"/>
           <w:lang w:val="es-SV" w:eastAsia="es-SV"/>
         </w:rPr>
-        <w:t>integral</w:t>
+        <w:t xml:space="preserve">integral</w:t>
       </w:r>
       <w:r>
         <w:rPr>
@@ -11878,7 +11878,7 @@
           <w:u w:val="single"/>
           <w:lang w:val="es-SV" w:eastAsia="es-SV"/>
         </w:rPr>
-        <w:t>y continuidad del negocio.</w:t>
+        <w:t xml:space="preserve">y continuidad del negocio.</w:t>
       </w:r>
     </w:p>
     <w:p>
@@ -11937,7 +11937,7 @@
           <w:u w:val="single"/>
           <w:lang w:val="es-SV" w:eastAsia="es-SV"/>
         </w:rPr>
-        <w:t>en especial en los niveles patrimoniales</w:t>
+        <w:t xml:space="preserve">en especial en los niveles patrimoniales</w:t>
       </w:r>
       <w:r>
         <w:rPr>
@@ -11959,7 +11959,7 @@
           <w:u w:val="single"/>
           <w:lang w:val="es-SV" w:eastAsia="es-SV"/>
         </w:rPr>
-        <w:t>, así como sus acciones correctivas</w:t>
+        <w:t xml:space="preserve">, así como sus acciones correctivas</w:t>
       </w:r>
       <w:r>
         <w:rPr>
@@ -12018,7 +12018,7 @@
           <w:u w:val="single"/>
           <w:lang w:val="es-SV" w:eastAsia="es-SV"/>
         </w:rPr>
-        <w:t>Informar al Consejo de Administración sobre las exposiciones, desviaciones y excepciones de los riesgos que son gestionados en la Cooperativa.</w:t>
+        <w:t xml:space="preserve">Informar al Consejo de Administración sobre las exposiciones, desviaciones y excepciones de los riesgos que son gestionados en la Cooperativa.</w:t>
       </w:r>
     </w:p>
     <w:p>
@@ -12153,7 +12153,7 @@
           <w:u w:val="none"/>
           <w:lang w:val="es-SV" w:eastAsia="es-SV"/>
         </w:rPr>
-        <w:t>Proponer al Consejo de Administración los límites de tolerancia a la exposición para cada tipo de riesgo</w:t>
+        <w:t xml:space="preserve">Proponer al Consejo de Administración los límites de tolerancia a la exposición para cada tipo de riesgo</w:t>
       </w:r>
       <w:r>
         <w:rPr>
@@ -12164,7 +12164,7 @@
           <w:u w:val="single"/>
           <w:lang w:val="es-SV" w:eastAsia="es-SV"/>
         </w:rPr>
-        <w:t>, los casos o circunstancias especiales en los cuales se puedan exceder los límites de exposición, así como los controles especiales sobre dichas circunstancias</w:t>
+        <w:t xml:space="preserve">, los casos o circunstancias especiales en los cuales se puedan exceder los límites de exposición, así como los controles especiales sobre dichas circunstancias</w:t>
       </w:r>
       <w:r>
         <w:rPr>
@@ -12223,7 +12223,7 @@
           <w:u w:val="single"/>
           <w:lang w:val="es-SV" w:eastAsia="es-SV"/>
         </w:rPr>
-        <w:t>Aprobar las acciones correctivas propuestas por el Departamento de Administración de Riesgos y las áreas involucradas, así como los mecanismos para la implementación de las mismas, en el caso que exista desviación con respecto a los niveles o límites de exposición asumidos.</w:t>
+        <w:t xml:space="preserve">Aprobar las acciones correctivas propuestas por el Departamento de Administración de Riesgos y las áreas involucradas, así como los mecanismos para la implementación de las mismas, en el caso que exista desviación con respecto a los niveles o límites de exposición asumidos.</w:t>
       </w:r>
     </w:p>
     <w:p>
@@ -12407,7 +12407,7 @@
           <w:u w:val="single"/>
           <w:lang w:val="es-SV" w:eastAsia="es-SV"/>
         </w:rPr>
-        <w:t>Informar al Consejo de Administración sobre el resultado de los informes elaborados por el Departamento de Administración de Riesgos</w:t>
+        <w:t xml:space="preserve">Informar al Consejo de Administración sobre el resultado de los informes elaborados por el Departamento de Administración de Riesgos</w:t>
       </w:r>
     </w:p>
     <w:p>
@@ -12466,7 +12466,7 @@
           <w:u w:val="single"/>
           <w:lang w:val="es-SV" w:eastAsia="es-SV"/>
         </w:rPr>
-        <w:t>relacionadas a la Gestión Integral</w:t>
+        <w:t xml:space="preserve">relacionadas a la Gestión Integral</w:t>
       </w:r>
       <w:r>
         <w:rPr>
@@ -12488,7 +12488,7 @@
           <w:u w:val="single"/>
           <w:lang w:val="es-SV" w:eastAsia="es-SV"/>
         </w:rPr>
-        <w:t>s</w:t>
+        <w:t xml:space="preserve">s</w:t>
       </w:r>
       <w:r>
         <w:rPr>
@@ -12510,7 +12510,7 @@
           <w:u w:val="single"/>
           <w:lang w:val="es-SV" w:eastAsia="es-SV"/>
         </w:rPr>
-        <w:t>Continuidad del Negocio y Seguridad de la Información</w:t>
+        <w:t xml:space="preserve">Continuidad del Negocio y Seguridad de la Información</w:t>
       </w:r>
       <w:r>
         <w:rPr>
@@ -12569,7 +12569,7 @@
           <w:u w:val="single"/>
           <w:lang w:val="es-SV" w:eastAsia="es-SV"/>
         </w:rPr>
-        <w:t>Validar el Plan de Continuidad del Negocio, planes de contingencia, programa de pruebas de Continuidad del Negocio, para aprobación del Consejo de Administración.</w:t>
+        <w:t xml:space="preserve">Validar el Plan de Continuidad del Negocio, planes de contingencia, programa de pruebas de Continuidad del Negocio, para aprobación del Consejo de Administración.</w:t>
       </w:r>
     </w:p>
     <w:p>
@@ -12613,7 +12613,7 @@
           <w:u w:val="single"/>
           <w:lang w:val="es-SV" w:eastAsia="es-SV"/>
         </w:rPr>
-        <w:t>Dar seguimiento a la ejecución de los programas de prueba de continuidad del negocio y a los planes de acción o mejora que resulten, recomendando acciones o mecanismos adicionales para la planificación y ejecución de las mismas.</w:t>
+        <w:t xml:space="preserve">Dar seguimiento a la ejecución de los programas de prueba de continuidad del negocio y a los planes de acción o mejora que resulten, recomendando acciones o mecanismos adicionales para la planificación y ejecución de las mismas.</w:t>
       </w:r>
     </w:p>
     <w:p>
@@ -12657,7 +12657,7 @@
           <w:u w:val="single"/>
           <w:lang w:val="es-SV" w:eastAsia="es-SV"/>
         </w:rPr>
-        <w:t>Supervisar que la gestión de continuidad del negocio sea efectiva y que se realice el análisis de impacto al negocio, identificando y priorizando los procesos críticos de la entidad.</w:t>
+        <w:t xml:space="preserve">Supervisar que la gestión de continuidad del negocio sea efectiva y que se realice el análisis de impacto al negocio, identificando y priorizando los procesos críticos de la entidad.</w:t>
       </w:r>
     </w:p>
     <w:p>
@@ -12701,7 +12701,7 @@
           <w:u w:val="single"/>
           <w:lang w:val="es-SV" w:eastAsia="es-SV"/>
         </w:rPr>
-        <w:t>Apoyar en la implementación de la Gestión de Continuidad del Negocio</w:t>
+        <w:t xml:space="preserve">Apoyar en la implementación de la Gestión de Continuidad del Negocio</w:t>
       </w:r>
     </w:p>
     <w:p>
@@ -12745,7 +12745,7 @@
           <w:u w:val="single"/>
           <w:lang w:val="es-SV" w:eastAsia="es-SV"/>
         </w:rPr>
-        <w:t>Proponer al Consejo de Administración la estructura del Sistema de Gestión de la Seguridad de la Información.</w:t>
+        <w:t xml:space="preserve">Proponer al Consejo de Administración la estructura del Sistema de Gestión de la Seguridad de la Información.</w:t>
       </w:r>
     </w:p>
     <w:p>
@@ -12789,7 +12789,7 @@
           <w:u w:val="single"/>
           <w:lang w:val="es-SV" w:eastAsia="es-SV"/>
         </w:rPr>
-        <w:t>Revisar, evaluar y proponer para aprobación del Consejo de Administración el programa y recursos de seguridad de la información.</w:t>
+        <w:t xml:space="preserve">Revisar, evaluar y proponer para aprobación del Consejo de Administración el programa y recursos de seguridad de la información.</w:t>
       </w:r>
     </w:p>
     <w:p>
@@ -12833,7 +12833,7 @@
           <w:u w:val="single"/>
           <w:lang w:val="es-SV" w:eastAsia="es-SV"/>
         </w:rPr>
-        <w:t>Validar las políticas, metodologías, manual de controles y métricas que permitan revisar y monitorear la seguridad de la información y posteriormente someterlo a aprobación del Consejo de Administración.</w:t>
+        <w:t xml:space="preserve">Validar las políticas, metodologías, manual de controles y métricas que permitan revisar y monitorear la seguridad de la información y posteriormente someterlo a aprobación del Consejo de Administración.</w:t>
       </w:r>
     </w:p>
     <w:p>
@@ -12877,7 +12877,7 @@
           <w:u w:val="single"/>
           <w:lang w:val="es-SV" w:eastAsia="es-SV"/>
         </w:rPr>
-        <w:t>Dar seguimiento de la Gestión de la Seguridad de la Información y Continuidad del Negocio.</w:t>
+        <w:t xml:space="preserve">Dar seguimiento de la Gestión de la Seguridad de la Información y Continuidad del Negocio.</w:t>
       </w:r>
     </w:p>
     <w:p>
@@ -12927,7 +12927,7 @@
           <w:u w:val="single"/>
           <w:lang w:val="es-SV" w:eastAsia="es-SV"/>
         </w:rPr>
-        <w:t>Evaluar los riesgos que puedan afectar la capacidad financiera y operativa de la Cooperativa y contribuir a la definición de Planes de Acción para mitigarlos o prevenirlos.</w:t>
+        <w:t xml:space="preserve">Evaluar los riesgos que puedan afectar la capacidad financiera y operativa de la Cooperativa y contribuir a la definición de Planes de Acción para mitigarlos o prevenirlos.</w:t>
       </w:r>
     </w:p>
     <w:p>
@@ -12959,7 +12959,7 @@
           <w:u w:val="single"/>
           <w:lang w:val="es-SV" w:eastAsia="es-SV"/>
         </w:rPr>
-        <w:t>Analizar los riesgos que puedan derivar en la activación del Plan de Recuperación de la Cooperativa.</w:t>
+        <w:t xml:space="preserve">Analizar los riesgos que puedan derivar en la activación del Plan de Recuperación de la Cooperativa.</w:t>
       </w:r>
     </w:p>
     <w:p>
@@ -12991,7 +12991,7 @@
           <w:u w:val="single"/>
           <w:lang w:val="es-SV" w:eastAsia="es-SV"/>
         </w:rPr>
-        <w:t>Evaluar los indicadores definidos para el seguimiento del Plan de Recuperación de la Cooperativa.</w:t>
+        <w:t xml:space="preserve">Evaluar los indicadores definidos para el seguimiento del Plan de Recuperación de la Cooperativa.</w:t>
       </w:r>
     </w:p>
     <w:p>
@@ -13023,7 +13023,7 @@
           <w:u w:val="single"/>
           <w:lang w:val="es-SV" w:eastAsia="es-SV"/>
         </w:rPr>
-        <w:t>Apoyar la actualización de escenarios de estrés y medidas de recuperación.</w:t>
+        <w:t xml:space="preserve">Apoyar la actualización de escenarios de estrés y medidas de recuperación.</w:t>
       </w:r>
     </w:p>
     <w:p>
@@ -13055,7 +13055,7 @@
           <w:u w:val="single"/>
           <w:lang w:val="es-SV" w:eastAsia="es-SV"/>
         </w:rPr>
-        <w:t>Emitir recomendaciones al Consejo de Administración;</w:t>
+        <w:t xml:space="preserve">Emitir recomendaciones al Consejo de Administración;</w:t>
       </w:r>
     </w:p>
     <w:p>
@@ -13119,7 +13119,7 @@
           <w:szCs w:val="24"/>
           <w:u w:val="none"/>
         </w:rPr>
-        <w:t>Conformación del Comité</w:t>
+        <w:t xml:space="preserve">Conformación del Comité</w:t>
       </w:r>
       <w:bookmarkEnd w:id="60"/>
       <w:bookmarkEnd w:id="61"/>
@@ -13163,7 +13163,7 @@
           <w:szCs w:val="24"/>
           <w:u w:val="single"/>
         </w:rPr>
-        <w:t>El Comité de Riesgos está integrado por un número impar de Miembros con los siguientes cargos: Directivos del Consejo de Administración: Presidente o su delegado, quien presidirá como Presidente del Comité, Tesorero y Vocal; Presidente de la Junta de Vigilancia o su delegado, Gerente General o su delegado, Auditor Interno, Gerente Legal y de Cumplimiento Normativo, Jefe Departamento de Seguridad de la Información y Ciberseguridad y Jefe Administración de Riesgos quien ocupará el cargo de Secretario del Comité.</w:t>
+        <w:t xml:space="preserve">El Comité de Riesgos está integrado por un número impar de Miembros con los siguientes cargos: Directivos del Consejo de Administración: Presidente o su delegado, quien presidirá como Presidente del Comité, Tesorero y Vocal; Presidente de la Junta de Vigilancia o su delegado, Gerente General o su delegado, Auditor Interno, Gerente Legal y de Cumplimiento Normativo, Jefe Departamento de Seguridad de la Información y Ciberseguridad y Jefe Administración de Riesgos quien ocupará el cargo de Secretario del Comité.</w:t>
       </w:r>
     </w:p>
     <w:p>
@@ -13190,7 +13190,7 @@
           <w:szCs w:val="24"/>
           <w:u w:val="single"/>
         </w:rPr>
-        <w:t>El Comité de Riesgos será presidido por un Director del Consejo de Administración con conocimiento en finanzas y en gestión de riesgos.</w:t>
+        <w:t xml:space="preserve">El Comité de Riesgos será presidido por un Director del Consejo de Administración con conocimiento en finanzas y en gestión de riesgos.</w:t>
       </w:r>
     </w:p>
     <w:p>
@@ -13217,7 +13217,7 @@
           <w:szCs w:val="24"/>
           <w:u w:val="single"/>
         </w:rPr>
-        <w:t>Adicionalmente el Comité podrá extender la invitación con derecho a voz, pero sin derecho a voto, a otros Directores del Consejo de Administración, Equipo Gerencial y Empleados de la Cooperativa que considere conveniente, que por su conocimiento y experiencia en los diferentes puntos que conocerá el Comité en sus sesiones, aportarán información relevante o apoyarán la gestión.</w:t>
+        <w:t xml:space="preserve">Adicionalmente el Comité podrá extender la invitación con derecho a voz, pero sin derecho a voto, a otros Directores del Consejo de Administración, Equipo Gerencial y Empleados de la Cooperativa que considere conveniente, que por su conocimiento y experiencia en los diferentes puntos que conocerá el Comité en sus sesiones, aportarán información relevante o apoyarán la gestión.</w:t>
       </w:r>
     </w:p>
     <w:p>
@@ -13244,7 +13244,7 @@
           <w:szCs w:val="24"/>
           <w:u w:val="single"/>
         </w:rPr>
-        <w:t>Los requisitos para ser miembro del Comité de Riesgos se detallan en Anexo 5 y que forma parte integrante de este Código.</w:t>
+        <w:t xml:space="preserve">Los requisitos para ser miembro del Comité de Riesgos se detallan en Anexo 5 y que forma parte integrante de este Código.</w:t>
       </w:r>
     </w:p>
     <w:p>
@@ -13276,7 +13276,7 @@
           <w:szCs w:val="24"/>
           <w:u w:val="none"/>
         </w:rPr>
-        <w:t>Frecuencia de Reuniones</w:t>
+        <w:t xml:space="preserve">Frecuencia de Reuniones</w:t>
       </w:r>
       <w:bookmarkEnd w:id="62"/>
       <w:bookmarkEnd w:id="63"/>
@@ -13321,7 +13321,7 @@
           <w:szCs w:val="24"/>
           <w:u w:val="none"/>
         </w:rPr>
-        <w:t>El Comité de Administración Riesgos, se reunirá con la frecuencia necesaria para desempeñar de forma eficaz sus funciones, al menos una vez cada mes.</w:t>
+        <w:t xml:space="preserve">El Comité de Administración Riesgos, se reunirá con la frecuencia necesaria para desempeñar de forma eficaz sus funciones, al menos una vez cada mes.</w:t>
       </w:r>
     </w:p>
     <w:p>
@@ -13363,7 +13363,7 @@
           <w:szCs w:val="24"/>
           <w:u w:val="single"/>
         </w:rPr>
-        <w:t>El Comité de Riesgos podrá reunirse, de acuerdo a como lo convengan de la siguiente forma:</w:t>
+        <w:t xml:space="preserve">El Comité de Riesgos podrá reunirse, de acuerdo a como lo convengan de la siguiente forma:</w:t>
       </w:r>
     </w:p>
     <w:p>
@@ -13394,7 +13394,7 @@
           <w:szCs w:val="24"/>
           <w:u w:val="single"/>
         </w:rPr>
-        <w:t>En reuniones presenciales en las instalaciones del Centro Financiero de la Cooperativa, en la hora y día designado por el Consejo de Administración.</w:t>
+        <w:t xml:space="preserve">En reuniones presenciales en las instalaciones del Centro Financiero de la Cooperativa, en la hora y día designado por el Consejo de Administración.</w:t>
       </w:r>
     </w:p>
     <w:p>
@@ -13425,7 +13425,7 @@
           <w:szCs w:val="24"/>
           <w:u w:val="single"/>
         </w:rPr>
-        <w:t>Reuniones a través de videoconferencias por diferentes medios tecnológicos que permitan la identificación y participación del miembro en la sesión, no obstante, los acuerdos y resoluciones que sean tomados deberán documentarse, de conformidad a lo establecido en el Art. 13 del Reglamento.</w:t>
+        <w:t xml:space="preserve">Reuniones a través de videoconferencias por diferentes medios tecnológicos que permitan la identificación y participación del miembro en la sesión, no obstante, los acuerdos y resoluciones que sean tomados deberán documentarse, de conformidad a lo establecido en el Art. 13 del Reglamento.</w:t>
       </w:r>
     </w:p>
     <w:p>
@@ -13456,7 +13456,7 @@
           <w:szCs w:val="24"/>
           <w:u w:val="single"/>
         </w:rPr>
-        <w:t>No obstante, en las reuniones presenciales cuando alguno de los miembros del Comité se encontraren en lugares distintos o en situaciones que le imposibiliten reunirse en las instalaciones del Centro Financiero de la Cooperativa, podrá sesionar a través de videoconferencia con los medios tecnológicos disponibles.</w:t>
+        <w:t xml:space="preserve">No obstante, en las reuniones presenciales cuando alguno de los miembros del Comité se encontraren en lugares distintos o en situaciones que le imposibiliten reunirse en las instalaciones del Centro Financiero de la Cooperativa, podrá sesionar a través de videoconferencia con los medios tecnológicos disponibles.</w:t>
       </w:r>
     </w:p>
     <w:p>
@@ -13487,7 +13487,7 @@
           <w:szCs w:val="24"/>
           <w:u w:val="single"/>
         </w:rPr>
-        <w:t>El Gerente General gestionará ante el Consejo de Administración la convocatoria a reunión ordinaria y extraordinaria del Comité de Riesgos.</w:t>
+        <w:t xml:space="preserve">El Gerente General gestionará ante el Consejo de Administración la convocatoria a reunión ordinaria y extraordinaria del Comité de Riesgos.</w:t>
       </w:r>
     </w:p>
     <w:p>
@@ -13518,7 +13518,7 @@
           <w:szCs w:val="24"/>
           <w:u w:val="single"/>
         </w:rPr>
-        <w:t>Para las reuniones del Comité se establecerá quórum con la asistenciá minima de tres de sus miembros, pero siempre deberá contar con la presencia de un Miembro del Consejo de Administración, Junta de Vigilancia, Gerente General o sus delegados.</w:t>
+        <w:t xml:space="preserve">Para las reuniones del Comité se establecerá quórum con la asistenciá minima de tres de sus miembros, pero siempre deberá contar con la presencia de un Miembro del Consejo de Administración, Junta de Vigilancia, Gerente General o sus delegados.</w:t>
       </w:r>
     </w:p>
     <w:p>
@@ -13549,7 +13549,7 @@
           <w:szCs w:val="24"/>
           <w:u w:val="single"/>
         </w:rPr>
-        <w:t>El Presidente del Consejo de Administración, Presidente de Junta de Vigilancia o el Gerente General en caso de imposibilidad de asistencia, pueden informar por escrito o mediante correo electrónico a sus delegados, comunicando la designación al Gerente General o Secretario del Comité.</w:t>
+        <w:t xml:space="preserve">El Presidente del Consejo de Administración, Presidente de Junta de Vigilancia o el Gerente General en caso de imposibilidad de asistencia, pueden informar por escrito o mediante correo electrónico a sus delegados, comunicando la designación al Gerente General o Secretario del Comité.</w:t>
       </w:r>
     </w:p>
     <w:p>
@@ -13580,7 +13580,7 @@
           <w:szCs w:val="24"/>
           <w:u w:val="single"/>
         </w:rPr>
-        <w:t>Los temas a tratar en el Comité de Riesgos deberán quedar asentados en una agenda propuesta por el Jefe de Administración de Riesgos, la cual será aprobada por el Comité.</w:t>
+        <w:t xml:space="preserve">Los temas a tratar en el Comité de Riesgos deberán quedar asentados en una agenda propuesta por el Jefe de Administración de Riesgos, la cual será aprobada por el Comité.</w:t>
       </w:r>
     </w:p>
     <w:p>
@@ -13611,7 +13611,7 @@
           <w:szCs w:val="24"/>
           <w:u w:val="single"/>
         </w:rPr>
-        <w:t>De las sesiones que celebre el Comité, se levantará acta y estará a disposición de los Directores del Consejo de Administración.</w:t>
+        <w:t xml:space="preserve">De las sesiones que celebre el Comité, se levantará acta y estará a disposición de los Directores del Consejo de Administración.</w:t>
       </w:r>
     </w:p>
     <w:p>
@@ -13642,7 +13642,7 @@
           <w:szCs w:val="24"/>
           <w:u w:val="single"/>
         </w:rPr>
-        <w:t>Las actas serán suscritas por los miembros asistentes, las cuales deberán ser numeradas de forma secuencial y redactadas en forma clara y detallada para comprender los fundamentos de los acuerdos tomados y de los temas conocidos.</w:t>
+        <w:t xml:space="preserve">Las actas serán suscritas por los miembros asistentes, las cuales deberán ser numeradas de forma secuencial y redactadas en forma clara y detallada para comprender los fundamentos de los acuerdos tomados y de los temas conocidos.</w:t>
       </w:r>
     </w:p>
     <w:p>
@@ -13673,7 +13673,7 @@
           <w:szCs w:val="24"/>
           <w:u w:val="single"/>
         </w:rPr>
-        <w:t>La elaboración, difusión y resguardo de las actas será llevada a cabo por el Jefe de Administración de Riesgos.</w:t>
+        <w:t xml:space="preserve">La elaboración, difusión y resguardo de las actas será llevada a cabo por el Jefe de Administración de Riesgos.</w:t>
       </w:r>
     </w:p>
     <w:p>
@@ -13704,7 +13704,7 @@
           <w:szCs w:val="24"/>
           <w:u w:val="single"/>
         </w:rPr>
-        <w:t>El contenido del Acta debe ser aprobado en la sesión del Comité de Riesgos inmediata posterior.</w:t>
+        <w:t xml:space="preserve">El contenido del Acta debe ser aprobado en la sesión del Comité de Riesgos inmediata posterior.</w:t>
       </w:r>
     </w:p>
     <w:p>
@@ -13735,7 +13735,7 @@
           <w:szCs w:val="24"/>
           <w:u w:val="single"/>
         </w:rPr>
-        <w:t>Los acuerdos se tomarán por consenso o mayoría</w:t>
+        <w:t xml:space="preserve">Los acuerdos se tomarán por consenso o mayoría</w:t>
       </w:r>
     </w:p>
     <w:p>
@@ -13766,7 +13766,7 @@
           <w:szCs w:val="24"/>
           <w:u w:val="single"/>
         </w:rPr>
-        <w:t>El Presidente del Consejo de Administración, tendrá doble voto en caso de empate.</w:t>
+        <w:t xml:space="preserve">El Presidente del Consejo de Administración, tendrá doble voto en caso de empate.</w:t>
       </w:r>
     </w:p>
     <w:p>
@@ -13797,7 +13797,7 @@
           <w:szCs w:val="24"/>
           <w:u w:val="single"/>
         </w:rPr>
-        <w:t>El Jefe de Administración de Riesgos llevará un control de los acuerdos adoptados por el Comité de Riesgos con las siguientes especificaciones: fecha y numero de sesión, acuerdo adoptado, responsables de su cumplimiento, gestión, fecha de gestión y estado.</w:t>
+        <w:t xml:space="preserve">El Jefe de Administración de Riesgos llevará un control de los acuerdos adoptados por el Comité de Riesgos con las siguientes especificaciones: fecha y numero de sesión, acuerdo adoptado, responsables de su cumplimiento, gestión, fecha de gestión y estado.</w:t>
       </w:r>
     </w:p>
     <w:p>
@@ -13828,7 +13828,7 @@
           <w:szCs w:val="24"/>
           <w:u w:val="single"/>
         </w:rPr>
-        <w:t>En cada sesión se dará a conocer los avances que presenten los acuerdos pendientes.</w:t>
+        <w:t xml:space="preserve">En cada sesión se dará a conocer los avances que presenten los acuerdos pendientes.</w:t>
       </w:r>
     </w:p>
     <w:p>
@@ -13859,7 +13859,7 @@
           <w:szCs w:val="24"/>
           <w:u w:val="single"/>
         </w:rPr>
-        <w:t>Se informará semestralmente al Consejo de Administración un resumen de los aspectos más importantes sobre los cuales ha conocido y tomado decisión el Comité y deberá quedar asentado en el acta de la sesión que celebre el Consejo de Administración.</w:t>
+        <w:t xml:space="preserve">Se informará semestralmente al Consejo de Administración un resumen de los aspectos más importantes sobre los cuales ha conocido y tomado decisión el Comité y deberá quedar asentado en el acta de la sesión que celebre el Consejo de Administración.</w:t>
       </w:r>
     </w:p>
     <w:p>
@@ -13908,7 +13908,7 @@
           <w:szCs w:val="24"/>
           <w:u w:val="single"/>
         </w:rPr>
-        <w:t>JUNTA DE</w:t>
+        <w:t xml:space="preserve">JUNTA DE</w:t>
       </w:r>
       <w:r>
         <w:rPr>
@@ -13930,7 +13930,7 @@
           <w:szCs w:val="24"/>
           <w:u w:val="single"/>
         </w:rPr>
-        <w:t>LDA/FT/FPADM</w:t>
+        <w:t xml:space="preserve">LDA/FT/FPADM</w:t>
       </w:r>
       <w:r>
         <w:rPr>
@@ -13994,7 +13994,7 @@
           <w:szCs w:val="24"/>
           <w:u w:val="none"/>
         </w:rPr>
-        <w:t>Objetivo</w:t>
+        <w:t xml:space="preserve">Objetivo</w:t>
       </w:r>
       <w:bookmarkEnd w:id="67"/>
       <w:r>
@@ -14006,7 +14006,7 @@
           <w:szCs w:val="24"/>
           <w:u w:val="none"/>
         </w:rPr>
-        <w:t>s</w:t>
+        <w:t xml:space="preserve">s</w:t>
       </w:r>
       <w:bookmarkEnd w:id="68"/>
     </w:p>
@@ -14057,7 +14057,7 @@
           <w:szCs w:val="24"/>
           <w:u w:val="single"/>
         </w:rPr>
-        <w:t>apoyo a la Gerencia de Oficialía de Cumplimiento, en materia de prevención del Lavado de Dinero y Activos, Financiamiento del Terrorismo y la Financiación de la Proliferación de Armas de Destrucción Masiva, y servir de</w:t>
+        <w:t xml:space="preserve">apoyo a la Gerencia de Oficialía de Cumplimiento, en materia de prevención del Lavado de Dinero y Activos, Financiamiento del Terrorismo y la Financiación de la Proliferación de Armas de Destrucción Masiva, y servir de</w:t>
       </w:r>
       <w:r>
         <w:rPr>
@@ -14077,7 +14077,7 @@
           <w:szCs w:val="24"/>
           <w:u w:val="single"/>
         </w:rPr>
-        <w:t>la Gerencia de</w:t>
+        <w:t xml:space="preserve">la Gerencia de</w:t>
       </w:r>
       <w:r>
         <w:rPr>
@@ -14127,7 +14127,7 @@
           <w:szCs w:val="24"/>
           <w:u w:val="single"/>
         </w:rPr>
-        <w:t>Función Principal: Apoyar y vigilar la labor de la Gerencia de Oficialía de Cumplimiento, para el control y seguimiento de las políticas y procedimientos establecidos para el cumplimiento del marco regulatorio de lavado de dinero y activos, financiamiento del terrorismo y la financiación de la proliferación de armas de destrucción masiva.</w:t>
+        <w:t xml:space="preserve">Función Principal: Apoyar y vigilar la labor de la Gerencia de Oficialía de Cumplimiento, para el control y seguimiento de las políticas y procedimientos establecidos para el cumplimiento del marco regulatorio de lavado de dinero y activos, financiamiento del terrorismo y la financiación de la proliferación de armas de destrucción masiva.</w:t>
       </w:r>
     </w:p>
     <w:p>
@@ -14162,7 +14162,7 @@
           <w:szCs w:val="24"/>
           <w:u w:val="none"/>
         </w:rPr>
-        <w:t>Responsabilidades</w:t>
+        <w:t xml:space="preserve">Responsabilidades</w:t>
       </w:r>
       <w:bookmarkEnd w:id="69"/>
       <w:bookmarkEnd w:id="70"/>
@@ -14205,7 +14205,7 @@
           <w:szCs w:val="24"/>
           <w:u w:val="none"/>
         </w:rPr>
-        <w:t>Entre sus funciones están:</w:t>
+        <w:t xml:space="preserve">Entre sus funciones están:</w:t>
       </w:r>
     </w:p>
     <w:p>
@@ -14261,7 +14261,7 @@
           <w:szCs w:val="24"/>
           <w:u w:val="single"/>
         </w:rPr>
-        <w:t>Instruir</w:t>
+        <w:t xml:space="preserve">Instruir</w:t>
       </w:r>
       <w:r>
         <w:rPr>
@@ -14291,7 +14291,7 @@
           <w:szCs w:val="24"/>
           <w:u w:val="single"/>
         </w:rPr>
-        <w:t>de la Cooperativa</w:t>
+        <w:t xml:space="preserve">de la Cooperativa</w:t>
       </w:r>
       <w:r>
         <w:rPr>
@@ -14321,7 +14321,7 @@
           <w:szCs w:val="24"/>
           <w:u w:val="single"/>
         </w:rPr>
-        <w:t>en materia</w:t>
+        <w:t xml:space="preserve">en materia</w:t>
       </w:r>
       <w:r>
         <w:rPr>
@@ -14341,7 +14341,7 @@
           <w:szCs w:val="24"/>
           <w:u w:val="single"/>
         </w:rPr>
-        <w:t>LDA/FT/FPADM, mediante acuerdos o modificaciones</w:t>
+        <w:t xml:space="preserve">LDA/FT/FPADM, mediante acuerdos o modificaciones</w:t>
       </w:r>
       <w:r>
         <w:rPr>
@@ -14418,7 +14418,7 @@
           <w:szCs w:val="24"/>
           <w:u w:val="single"/>
         </w:rPr>
-        <w:t>Dar seguimiento a la gestión que realiza la Gerencia</w:t>
+        <w:t xml:space="preserve">Dar seguimiento a la gestión que realiza la Gerencia</w:t>
       </w:r>
       <w:r>
         <w:rPr>
@@ -14494,7 +14494,7 @@
           <w:szCs w:val="24"/>
           <w:u w:val="single"/>
         </w:rPr>
-        <w:t>Conocer las deficiencias al programa de prevención, detectadas por la Gerencia de Oficialía de Cumplimiento; así como las acciones o medidas correctivas que se hayan implementado para tales efectos.</w:t>
+        <w:t xml:space="preserve">Conocer las deficiencias al programa de prevención, detectadas por la Gerencia de Oficialía de Cumplimiento; así como las acciones o medidas correctivas que se hayan implementado para tales efectos.</w:t>
       </w:r>
     </w:p>
     <w:p>
@@ -14551,7 +14551,7 @@
           <w:szCs w:val="24"/>
           <w:u w:val="single"/>
         </w:rPr>
-        <w:t>Revisar la ejecución del Plan Anual de Capacitación, que involucre a todo el personal de la Cooperativa y que, además, incluya la capacitación especializada para el personal de la Oficialía de Cumplimiento en temas de LDA/FT/FPADM.</w:t>
+        <w:t xml:space="preserve">Revisar la ejecución del Plan Anual de Capacitación, que involucre a todo el personal de la Cooperativa y que, además, incluya la capacitación especializada para el personal de la Oficialía de Cumplimiento en temas de LDA/FT/FPADM.</w:t>
       </w:r>
     </w:p>
     <w:p>
@@ -14654,7 +14654,7 @@
           <w:szCs w:val="24"/>
           <w:u w:val="single"/>
         </w:rPr>
-        <w:t>Revisar por lo menos cada tres años, la estructura organizativa de la Gerencia de Oficialía de Cumplimiento, en cuanto a recurso humano, en relación proporcional al tamaño de la Cooperativa, cantidad de clientes, productos y servicios, así como la operatividad que tenga la misma, para determinar la necesidad de mayores recursos a fin de mitigar los riesgos derivados de LDA/FT/FPADM.</w:t>
+        <w:t xml:space="preserve">Revisar por lo menos cada tres años, la estructura organizativa de la Gerencia de Oficialía de Cumplimiento, en cuanto a recurso humano, en relación proporcional al tamaño de la Cooperativa, cantidad de clientes, productos y servicios, así como la operatividad que tenga la misma, para determinar la necesidad de mayores recursos a fin de mitigar los riesgos derivados de LDA/FT/FPADM.</w:t>
       </w:r>
     </w:p>
     <w:p>
@@ -14695,7 +14695,7 @@
           <w:szCs w:val="24"/>
           <w:u w:val="single"/>
         </w:rPr>
-        <w:t>Promover y garantizar la independencia y autonomía de la Gerencia de Oficialía de Cumplimiento dentro de la Cooperativa.</w:t>
+        <w:t xml:space="preserve">Promover y garantizar la independencia y autonomía de la Gerencia de Oficialía de Cumplimiento dentro de la Cooperativa.</w:t>
       </w:r>
     </w:p>
     <w:p>
@@ -14818,7 +14818,7 @@
           <w:szCs w:val="24"/>
           <w:u w:val="single"/>
         </w:rPr>
-        <w:t>Conocer las revisiones de auditoría interna, externa y entes reguladores realizadas a la Gerencia de Oficialía de Cumplimiento, así como de los hallazgos señalados para su debida atención y seguimiento hasta su finalización.</w:t>
+        <w:t xml:space="preserve">Conocer las revisiones de auditoría interna, externa y entes reguladores realizadas a la Gerencia de Oficialía de Cumplimiento, así como de los hallazgos señalados para su debida atención y seguimiento hasta su finalización.</w:t>
       </w:r>
     </w:p>
     <w:p>
@@ -14859,7 +14859,7 @@
           <w:szCs w:val="24"/>
           <w:u w:val="single"/>
         </w:rPr>
-        <w:t>Las funciones específicas que le sean delegadas por el Consejo de Administración en el Código de Gobierno Corporativo.</w:t>
+        <w:t xml:space="preserve">Las funciones específicas que le sean delegadas por el Consejo de Administración en el Código de Gobierno Corporativo.</w:t>
       </w:r>
     </w:p>
     <w:p>
@@ -14900,7 +14900,7 @@
           <w:szCs w:val="24"/>
           <w:u w:val="single"/>
         </w:rPr>
-        <w:t>El presidente del Comité de PLDA/FT/FPADM tendrá las siguientes funciones:</w:t>
+        <w:t xml:space="preserve">El presidente del Comité de PLDA/FT/FPADM tendrá las siguientes funciones:</w:t>
       </w:r>
     </w:p>
     <w:p>
@@ -14930,7 +14930,7 @@
           <w:szCs w:val="24"/>
           <w:u w:val="single"/>
         </w:rPr>
-        <w:t>Dar por abierta la sesión y dirigir las presentaciones y deliberaciones.</w:t>
+        <w:t xml:space="preserve">Dar por abierta la sesión y dirigir las presentaciones y deliberaciones.</w:t>
       </w:r>
     </w:p>
     <w:p>
@@ -14960,7 +14960,7 @@
           <w:szCs w:val="24"/>
           <w:u w:val="single"/>
         </w:rPr>
-        <w:t>Solicitar cambiar el orden de la agenda cuando sea requerido.</w:t>
+        <w:t xml:space="preserve">Solicitar cambiar el orden de la agenda cuando sea requerido.</w:t>
       </w:r>
     </w:p>
     <w:p>
@@ -14990,7 +14990,7 @@
           <w:szCs w:val="24"/>
           <w:u w:val="single"/>
         </w:rPr>
-        <w:t>Coordinar el Comité para desarrollar sus actividades de una manera armónica con la participación de los miembros.</w:t>
+        <w:t xml:space="preserve">Coordinar el Comité para desarrollar sus actividades de una manera armónica con la participación de los miembros.</w:t>
       </w:r>
     </w:p>
     <w:p>
@@ -15020,7 +15020,7 @@
           <w:szCs w:val="24"/>
           <w:u w:val="single"/>
         </w:rPr>
-        <w:t>Procurar que los miembros cuenten con la información y los elementos necesarios para el mejor desempeño de sus funciones.</w:t>
+        <w:t xml:space="preserve">Procurar que los miembros cuenten con la información y los elementos necesarios para el mejor desempeño de sus funciones.</w:t>
       </w:r>
     </w:p>
     <w:p>
@@ -15050,7 +15050,7 @@
           <w:szCs w:val="24"/>
           <w:u w:val="single"/>
         </w:rPr>
-        <w:t>Velar por que, en el desarrollo de cada punto, se destine el tiempo suficiente para el análisis detallado de cada uno de ellos.</w:t>
+        <w:t xml:space="preserve">Velar por que, en el desarrollo de cada punto, se destine el tiempo suficiente para el análisis detallado de cada uno de ellos.</w:t>
       </w:r>
     </w:p>
     <w:p>
@@ -15076,7 +15076,7 @@
           <w:szCs w:val="24"/>
           <w:u w:val="single"/>
         </w:rPr>
-        <w:t>Las funciones del presidente podrán ser ampliadas a solicitud del Consejo de Administración.</w:t>
+        <w:t xml:space="preserve">Las funciones del presidente podrán ser ampliadas a solicitud del Consejo de Administración.</w:t>
       </w:r>
     </w:p>
     <w:p>
@@ -15102,7 +15102,7 @@
           <w:szCs w:val="24"/>
           <w:u w:val="single"/>
         </w:rPr>
-        <w:t>El Gerente de Oficialía de Cumplimiento será el secretario del Comité de PLDA/FT/FPADM, y tendrá al menos las siguientes funciones:</w:t>
+        <w:t xml:space="preserve">El Gerente de Oficialía de Cumplimiento será el secretario del Comité de PLDA/FT/FPADM, y tendrá al menos las siguientes funciones:</w:t>
       </w:r>
     </w:p>
     <w:p>
@@ -15132,7 +15132,7 @@
           <w:szCs w:val="24"/>
           <w:u w:val="single"/>
         </w:rPr>
-        <w:t>Convocar a sesión de Comité de PLDA/FT/FPADM;</w:t>
+        <w:t xml:space="preserve">Convocar a sesión de Comité de PLDA/FT/FPADM;</w:t>
       </w:r>
     </w:p>
     <w:p>
@@ -15162,7 +15162,7 @@
           <w:szCs w:val="24"/>
           <w:u w:val="single"/>
         </w:rPr>
-        <w:t>Elaborar la agenda de cada sesión de Comité y respaldarla con la información y documentos que sean necesarios para desarrollarla;</w:t>
+        <w:t xml:space="preserve">Elaborar la agenda de cada sesión de Comité y respaldarla con la información y documentos que sean necesarios para desarrollarla;</w:t>
       </w:r>
     </w:p>
     <w:p>
@@ -15192,7 +15192,7 @@
           <w:szCs w:val="24"/>
           <w:u w:val="single"/>
         </w:rPr>
-        <w:t>Verificar el quórum de asistencia a cada sesión;</w:t>
+        <w:t xml:space="preserve">Verificar el quórum de asistencia a cada sesión;</w:t>
       </w:r>
     </w:p>
     <w:p>
@@ -15222,7 +15222,7 @@
           <w:szCs w:val="24"/>
           <w:u w:val="single"/>
         </w:rPr>
-        <w:t>Documentar formalmente en las actas que el Comité de PLDA/FT/FPADM, lleve para tal fin, el desarrollo de las sesiones, seguimiento de los acuerdos girados, documentos anexos, así como resguardar el archivo digital y físico de las sesiones y de los documentos e información que respaldará la agenda vista en cada sesión.</w:t>
+        <w:t xml:space="preserve">Documentar formalmente en las actas que el Comité de PLDA/FT/FPADM, lleve para tal fin, el desarrollo de las sesiones, seguimiento de los acuerdos girados, documentos anexos, así como resguardar el archivo digital y físico de las sesiones y de los documentos e información que respaldará la agenda vista en cada sesión.</w:t>
       </w:r>
     </w:p>
     <w:p>
@@ -15252,7 +15252,7 @@
           <w:szCs w:val="24"/>
           <w:u w:val="single"/>
         </w:rPr>
-        <w:t>Imprimir las actas y gestionar las firmas correspondientes;</w:t>
+        <w:t xml:space="preserve">Imprimir las actas y gestionar las firmas correspondientes;</w:t>
       </w:r>
     </w:p>
     <w:p>
@@ -15282,7 +15282,7 @@
           <w:szCs w:val="24"/>
           <w:u w:val="single"/>
         </w:rPr>
-        <w:t>Emitir certificaciones de puntos de acta.</w:t>
+        <w:t xml:space="preserve">Emitir certificaciones de puntos de acta.</w:t>
       </w:r>
     </w:p>
     <w:p>
@@ -15308,7 +15308,7 @@
           <w:szCs w:val="24"/>
           <w:u w:val="single"/>
         </w:rPr>
-        <w:t>Cada miembro del Comité de PLDA/FT/FPADM, tendrá los siguientes deberes y obligaciones:</w:t>
+        <w:t xml:space="preserve">Cada miembro del Comité de PLDA/FT/FPADM, tendrá los siguientes deberes y obligaciones:</w:t>
       </w:r>
     </w:p>
     <w:p>
@@ -15338,7 +15338,7 @@
           <w:szCs w:val="24"/>
           <w:u w:val="single"/>
         </w:rPr>
-        <w:t>Abstenerse de opinar sobre temas en lo que considere que existe conflicto de interés.</w:t>
+        <w:t xml:space="preserve">Abstenerse de opinar sobre temas en lo que considere que existe conflicto de interés.</w:t>
       </w:r>
     </w:p>
     <w:p>
@@ -15368,7 +15368,7 @@
           <w:szCs w:val="24"/>
           <w:u w:val="single"/>
         </w:rPr>
-        <w:t>Mantenerse debidamente informado respecto a las regulaciones vigentes que rigen los mercados financieros, bancarios y en materia de prevención de lavado de dinero y de activos, financiación del terrorismo y la financiación de la proliferación de armas de destrucción masiva.</w:t>
+        <w:t xml:space="preserve">Mantenerse debidamente informado respecto a las regulaciones vigentes que rigen los mercados financieros, bancarios y en materia de prevención de lavado de dinero y de activos, financiación del terrorismo y la financiación de la proliferación de armas de destrucción masiva.</w:t>
       </w:r>
     </w:p>
     <w:p>
@@ -15398,7 +15398,7 @@
           <w:szCs w:val="24"/>
           <w:u w:val="single"/>
         </w:rPr>
-        <w:t>Abstenerse de utilizar la información que conociera en el ejercicio de sus funciones como miembro del Comité, para obtener beneficio personal o de terceros.</w:t>
+        <w:t xml:space="preserve">Abstenerse de utilizar la información que conociera en el ejercicio de sus funciones como miembro del Comité, para obtener beneficio personal o de terceros.</w:t>
       </w:r>
     </w:p>
     <w:p>
@@ -15428,7 +15428,7 @@
           <w:szCs w:val="24"/>
           <w:u w:val="single"/>
         </w:rPr>
-        <w:t>Velar por el estricto cumplimiento de los procedimientos establecidos en este reglamento.</w:t>
+        <w:t xml:space="preserve">Velar por el estricto cumplimiento de los procedimientos establecidos en este reglamento.</w:t>
       </w:r>
     </w:p>
     <w:p>
@@ -15458,7 +15458,7 @@
           <w:szCs w:val="24"/>
           <w:u w:val="single"/>
         </w:rPr>
-        <w:t>Emitir sus puntos de vista, sugerencias y hacer las advertencias necesarias en cada caso, pudiendo solicitar que éstos queden asentados en las actas, para dar cumplimiento a las responsabilidades que le impone el marco normativo legal en prevención de LDA/FT/FPADM.</w:t>
+        <w:t xml:space="preserve">Emitir sus puntos de vista, sugerencias y hacer las advertencias necesarias en cada caso, pudiendo solicitar que éstos queden asentados en las actas, para dar cumplimiento a las responsabilidades que le impone el marco normativo legal en prevención de LDA/FT/FPADM.</w:t>
       </w:r>
     </w:p>
     <w:p>
@@ -15536,7 +15536,7 @@
           <w:szCs w:val="24"/>
           <w:u w:val="single"/>
         </w:rPr>
-        <w:t>El Comité estará conformado por los siguientes miembros propietarios: el Director presidente del Consejo de Administración, el Tesorero del Consejo de Administración, un Representante de la Junta de Vigilancia, Gerente General, Gerente Legal y Cumplimiento Normativo, Gerente de Operaciones, Gerente de Negocios, Jefe de Administración de Riesgos, Gerente de Oficialía de Cumplimiento y Auditor Interno.</w:t>
+        <w:t xml:space="preserve">El Comité estará conformado por los siguientes miembros propietarios: el Director presidente del Consejo de Administración, el Tesorero del Consejo de Administración, un Representante de la Junta de Vigilancia, Gerente General, Gerente Legal y Cumplimiento Normativo, Gerente de Operaciones, Gerente de Negocios, Jefe de Administración de Riesgos, Gerente de Oficialía de Cumplimiento y Auditor Interno.</w:t>
       </w:r>
     </w:p>
     <w:p>
@@ -15561,7 +15561,7 @@
           <w:szCs w:val="24"/>
           <w:u w:val="single"/>
         </w:rPr>
-        <w:t>Se designa como presidente del Comité, al Director presidente del Consejo de Administración y con el rol de Secretario al Oficial de Cumplimiento.</w:t>
+        <w:t xml:space="preserve">Se designa como presidente del Comité, al Director presidente del Consejo de Administración y con el rol de Secretario al Oficial de Cumplimiento.</w:t>
       </w:r>
     </w:p>
     <w:p>
@@ -15586,7 +15586,7 @@
           <w:szCs w:val="24"/>
           <w:u w:val="single"/>
         </w:rPr>
-        <w:t>Los requisitos para ser miembro del Comité de Junta de Prevención del LDA/FT/FPADM se detallan en Anexo 6 y que forma parte integrante de este Código.</w:t>
+        <w:t xml:space="preserve">Los requisitos para ser miembro del Comité de Junta de Prevención del LDA/FT/FPADM se detallan en Anexo 6 y que forma parte integrante de este Código.</w:t>
       </w:r>
     </w:p>
     <w:p>
@@ -15621,7 +15621,7 @@
           <w:szCs w:val="24"/>
           <w:u w:val="none"/>
         </w:rPr>
-        <w:t>Frecuencia de Reuniones</w:t>
+        <w:t xml:space="preserve">Frecuencia de Reuniones</w:t>
       </w:r>
       <w:bookmarkEnd w:id="73"/>
       <w:bookmarkEnd w:id="74"/>
@@ -15668,7 +15668,7 @@
           <w:szCs w:val="24"/>
           <w:u w:val="single"/>
         </w:rPr>
-        <w:t>El Comité de PLDA/FT/FPADM, se reunirá ordinariamente al menos de manera trimestral y extraordinariamente cuando sea requerido por cualquier miembro del referido Comité, en ambos casos, puede sesionar de forma presencial o virtual.</w:t>
+        <w:t xml:space="preserve">El Comité de PLDA/FT/FPADM, se reunirá ordinariamente al menos de manera trimestral y extraordinariamente cuando sea requerido por cualquier miembro del referido Comité, en ambos casos, puede sesionar de forma presencial o virtual.</w:t>
       </w:r>
     </w:p>
     <w:p>
@@ -15701,7 +15701,7 @@
           <w:szCs w:val="24"/>
           <w:u w:val="none"/>
         </w:rPr>
-        <w:t>COMITÉ DEL FONDO DE SOLIDARIDAD</w:t>
+        <w:t xml:space="preserve">COMITÉ DEL FONDO DE SOLIDARIDAD</w:t>
       </w:r>
       <w:bookmarkEnd w:id="75"/>
       <w:bookmarkEnd w:id="76"/>
@@ -15754,7 +15754,7 @@
           <w:szCs w:val="24"/>
           <w:u w:val="none"/>
         </w:rPr>
-        <w:t>Objetivo</w:t>
+        <w:t xml:space="preserve">Objetivo</w:t>
       </w:r>
       <w:bookmarkEnd w:id="78"/>
       <w:r>
@@ -15766,7 +15766,7 @@
           <w:szCs w:val="24"/>
           <w:u w:val="none"/>
         </w:rPr>
-        <w:t>s</w:t>
+        <w:t xml:space="preserve">s</w:t>
       </w:r>
       <w:bookmarkEnd w:id="79"/>
     </w:p>
@@ -15807,7 +15807,7 @@
           <w:szCs w:val="24"/>
           <w:u w:val="none"/>
         </w:rPr>
-        <w:t>Ser el órgano administrativo del Fondo y le corresponde la dirección y administración superior del mismo.</w:t>
+        <w:t xml:space="preserve">Ser el órgano administrativo del Fondo y le corresponde la dirección y administración superior del mismo.</w:t>
       </w:r>
     </w:p>
     <w:p>
@@ -15857,7 +15857,7 @@
           <w:szCs w:val="24"/>
           <w:u w:val="none"/>
         </w:rPr>
-        <w:t>Responsabilidades</w:t>
+        <w:t xml:space="preserve">Responsabilidades</w:t>
       </w:r>
       <w:bookmarkEnd w:id="80"/>
       <w:bookmarkEnd w:id="81"/>
@@ -15988,7 +15988,7 @@
           <w:szCs w:val="24"/>
           <w:u w:val="none"/>
         </w:rPr>
-        <w:t>Preservar y acrecentar los recursos del Fondo.</w:t>
+        <w:t xml:space="preserve">Preservar y acrecentar los recursos del Fondo.</w:t>
       </w:r>
     </w:p>
     <w:p>
@@ -16164,7 +16164,7 @@
           <w:szCs w:val="24"/>
           <w:u w:val="none"/>
         </w:rPr>
-        <w:t>Presentar al Consejo de Administración informes trimestrales sobre la gestión del Fondo.</w:t>
+        <w:t xml:space="preserve">Presentar al Consejo de Administración informes trimestrales sobre la gestión del Fondo.</w:t>
       </w:r>
     </w:p>
     <w:p>
@@ -16340,7 +16340,7 @@
           <w:szCs w:val="24"/>
           <w:u w:val="none"/>
         </w:rPr>
-        <w:t>Velar porque se preste a los miembros del Fondo un servicio eficiente y oportuno.</w:t>
+        <w:t xml:space="preserve">Velar porque se preste a los miembros del Fondo un servicio eficiente y oportuno.</w:t>
       </w:r>
     </w:p>
     <w:p>
@@ -16526,7 +16526,7 @@
           <w:szCs w:val="24"/>
           <w:u w:val="single"/>
         </w:rPr>
-        <w:t>reúnen los requisitos establecidos en el Art. 6 de este reglamento, y que</w:t>
+        <w:t xml:space="preserve">reúnen los requisitos establecidos en el Art. 6 de este reglamento, y que</w:t>
       </w:r>
       <w:r>
         <w:rPr>
@@ -16556,7 +16556,7 @@
           <w:szCs w:val="24"/>
           <w:u w:val="single"/>
         </w:rPr>
-        <w:t>;</w:t>
+        <w:t xml:space="preserve">;</w:t>
       </w:r>
       <w:r>
         <w:rPr>
@@ -16576,7 +16576,7 @@
           <w:szCs w:val="24"/>
           <w:u w:val="single"/>
         </w:rPr>
-        <w:t>en el Art. 6</w:t>
+        <w:t xml:space="preserve">en el Art. 6</w:t>
       </w:r>
       <w:r>
         <w:rPr>
@@ -16630,7 +16630,7 @@
           <w:szCs w:val="24"/>
           <w:u w:val="none"/>
         </w:rPr>
-        <w:t>Realizar las demás funciones que sean necesarias para el buen funcionamiento del Fondo y para el cumplimiento de sus obligaciones.</w:t>
+        <w:t xml:space="preserve">Realizar las demás funciones que sean necesarias para el buen funcionamiento del Fondo y para el cumplimiento de sus obligaciones.</w:t>
       </w:r>
     </w:p>
     <w:p>
@@ -16670,7 +16670,7 @@
           <w:color w:val="000000" w:themeColor="text1"/>
           <w:u w:val="none"/>
         </w:rPr>
-        <w:t>Conformación del Comité</w:t>
+        <w:t xml:space="preserve">Conformación del Comité</w:t>
       </w:r>
       <w:bookmarkEnd w:id="82"/>
       <w:bookmarkEnd w:id="83"/>
@@ -16709,7 +16709,7 @@
           <w:szCs w:val="24"/>
           <w:u w:val="single"/>
         </w:rPr>
-        <w:t>Los cargos de presidente y secretario de dicho Comité, serán desempeñados por el Presidente y Secretario del Consejo de Administración, en vigencia respectivamente; el cargo de vocal será desempeñado por el Presidente de la Junta de Vigilancia en vigencia. Asimismo, el Consejo de Administración nombrará a un Primer Suplente, para un período de tres años, para llenar las vacantes que ocurran; y como asesor administrativo, el Jefe de Atención al Asociado y Clientes.</w:t>
+        <w:t xml:space="preserve">Los cargos de presidente y secretario de dicho Comité, serán desempeñados por el Presidente y Secretario del Consejo de Administración, en vigencia respectivamente; el cargo de vocal será desempeñado por el Presidente de la Junta de Vigilancia en vigencia. Asimismo, el Consejo de Administración nombrará a un Primer Suplente, para un período de tres años, para llenar las vacantes que ocurran; y como asesor administrativo, el Jefe de Atención al Asociado y Clientes.</w:t>
       </w:r>
     </w:p>
     <w:p>
@@ -16735,7 +16735,7 @@
           <w:szCs w:val="24"/>
           <w:u w:val="single"/>
         </w:rPr>
-        <w:t>Los suplentes concurrirán a las sesiones del Comité únicamente con voz, excepto cuando suplan a los propietarios en cuyo caso tendrán voto.</w:t>
+        <w:t xml:space="preserve">Los suplentes concurrirán a las sesiones del Comité únicamente con voz, excepto cuando suplan a los propietarios en cuyo caso tendrán voto.</w:t>
       </w:r>
     </w:p>
     <w:p>
@@ -16761,7 +16761,7 @@
           <w:szCs w:val="24"/>
           <w:u w:val="single"/>
         </w:rPr>
-        <w:t>Los requisitos para ser miembro del Comité de Fondo de Solidaridad se detallan en Anexo 6 y que forma parte integrante de éste Código.</w:t>
+        <w:t xml:space="preserve">Los requisitos para ser miembro del Comité de Fondo de Solidaridad se detallan en Anexo 6 y que forma parte integrante de éste Código.</w:t>
       </w:r>
     </w:p>
     <w:p>
@@ -16790,7 +16790,7 @@
           <w:color w:val="000000" w:themeColor="text1"/>
           <w:u w:val="none"/>
         </w:rPr>
-        <w:t>Frecuencia de Reuniones</w:t>
+        <w:t xml:space="preserve">Frecuencia de Reuniones</w:t>
       </w:r>
       <w:bookmarkEnd w:id="84"/>
       <w:bookmarkEnd w:id="85"/>
@@ -16857,7 +16857,7 @@
           <w:color w:val="000000" w:themeColor="text1"/>
           <w:u w:val="single"/>
         </w:rPr>
-        <w:t>Sus resoluciones se tomarán por mayoría de votos.</w:t>
+        <w:t xml:space="preserve">Sus resoluciones se tomarán por mayoría de votos.</w:t>
       </w:r>
     </w:p>
     <w:p>
@@ -16880,7 +16880,7 @@
           <w:color w:val="000000" w:themeColor="text1"/>
           <w:u w:val="single"/>
         </w:rPr>
-        <w:t>En caso de empate el presidente o quien haga sus veces tendrá voto de calidad.</w:t>
+        <w:t xml:space="preserve">En caso de empate el presidente o quien haga sus veces tendrá voto de calidad.</w:t>
       </w:r>
     </w:p>
     <w:p>
@@ -16903,7 +16903,7 @@
           <w:color w:val="000000" w:themeColor="text1"/>
           <w:u w:val="single"/>
         </w:rPr>
-        <w:t>La presencia de dos de sus miembros constituirá quórum, ya sean propietarios o suplentes.</w:t>
+        <w:t xml:space="preserve">La presencia de dos de sus miembros constituirá quórum, ya sean propietarios o suplentes.</w:t>
       </w:r>
     </w:p>
     <w:p>
@@ -16926,7 +16926,7 @@
           <w:color w:val="000000" w:themeColor="text1"/>
           <w:u w:val="single"/>
         </w:rPr>
-        <w:t>El Secretario del Comité o quien haga sus veces, llevará el libro de Actas respectivo.</w:t>
+        <w:t xml:space="preserve">El Secretario del Comité o quien haga sus veces, llevará el libro de Actas respectivo.</w:t>
       </w:r>
     </w:p>
     <w:p>
@@ -16958,7 +16958,7 @@
           <w:szCs w:val="24"/>
           <w:u w:val="single"/>
         </w:rPr>
-        <w:t>NORMAS GENERALES DE APLICACIÓN PARA TODOS LOS COMITÉS</w:t>
+        <w:t xml:space="preserve">NORMAS GENERALES DE APLICACIÓN PARA TODOS LOS COMITÉS</w:t>
       </w:r>
     </w:p>
     <w:p>
@@ -16987,7 +16987,7 @@
           <w:szCs w:val="24"/>
           <w:u w:val="single"/>
         </w:rPr>
-        <w:t>La convocatoria a participar en los Comités se comunicará al menos con un día de anticipación, ya sea vía escrita, correo electrónico o cualquier otro medio que la tecnología lo permita.</w:t>
+        <w:t xml:space="preserve">La convocatoria a participar en los Comités se comunicará al menos con un día de anticipación, ya sea vía escrita, correo electrónico o cualquier otro medio que la tecnología lo permita.</w:t>
       </w:r>
     </w:p>
     <w:p>
@@ -17016,7 +17016,7 @@
           <w:szCs w:val="24"/>
           <w:u w:val="single"/>
         </w:rPr>
-        <w:t>Confirmar vía telefónica, por escrito, correo electrónico o cualquier otro medio que la tecnología permita, la confirmación de asistencia o ausencia a la sesión de comité.</w:t>
+        <w:t xml:space="preserve">Confirmar vía telefónica, por escrito, correo electrónico o cualquier otro medio que la tecnología permita, la confirmación de asistencia o ausencia a la sesión de comité.</w:t>
       </w:r>
     </w:p>
     <w:p>
@@ -17045,7 +17045,7 @@
           <w:szCs w:val="24"/>
           <w:u w:val="single"/>
         </w:rPr>
-        <w:t>Al inicio de la reunión, la agenda será leída obligatoriamente y sometida a aprobación del Comité con el quórum obligatorio para llevar a cabo la sesión.</w:t>
+        <w:t xml:space="preserve">Al inicio de la reunión, la agenda será leída obligatoriamente y sometida a aprobación del Comité con el quórum obligatorio para llevar a cabo la sesión.</w:t>
       </w:r>
     </w:p>
     <w:p>
@@ -17074,7 +17074,7 @@
           <w:szCs w:val="24"/>
           <w:u w:val="single"/>
         </w:rPr>
-        <w:t>El Secretario del Comité dará lectura al acta anterior para su ratificación y aprobación.</w:t>
+        <w:t xml:space="preserve">El Secretario del Comité dará lectura al acta anterior para su ratificación y aprobación.</w:t>
       </w:r>
     </w:p>
     <w:p>
@@ -17103,7 +17103,7 @@
           <w:szCs w:val="24"/>
           <w:u w:val="single"/>
         </w:rPr>
-        <w:t>Las actas deberán ser redactadas en forma clara y detallada para comprender los fundamentos de los acuerdos tomados y de los temas conocidos, debiendo implementar un sistema de numeración secuencial de las actas de las reuniones.</w:t>
+        <w:t xml:space="preserve">Las actas deberán ser redactadas en forma clara y detallada para comprender los fundamentos de los acuerdos tomados y de los temas conocidos, debiendo implementar un sistema de numeración secuencial de las actas de las reuniones.</w:t>
       </w:r>
     </w:p>
     <w:p>
@@ -17132,7 +17132,7 @@
           <w:szCs w:val="24"/>
           <w:u w:val="single"/>
         </w:rPr>
-        <w:t>Las actas de los comités estarán a disposición de los Directores del Consejo de Administración.</w:t>
+        <w:t xml:space="preserve">Las actas de los comités estarán a disposición de los Directores del Consejo de Administración.</w:t>
       </w:r>
     </w:p>
     <w:p>
@@ -17161,7 +17161,7 @@
           <w:szCs w:val="24"/>
           <w:u w:val="single"/>
         </w:rPr>
-        <w:t>Un resumen de los aspectos más importantes sobre los cuales ha conocido y tomado decisión cada Comité deberá quedar asentado en el acta de la sesión que celebre el Consejo de Administración en el semestre posterior.</w:t>
+        <w:t xml:space="preserve">Un resumen de los aspectos más importantes sobre los cuales ha conocido y tomado decisión cada Comité deberá quedar asentado en el acta de la sesión que celebre el Consejo de Administración en el semestre posterior.</w:t>
       </w:r>
     </w:p>
     <w:p>
@@ -17190,7 +17190,7 @@
           <w:szCs w:val="24"/>
           <w:u w:val="single"/>
         </w:rPr>
-        <w:t>De existir hechos relevantes que el Consejo de Administración debe conocer, éste deberá ser presentado por los referidos Comités en la sesión más próxima que celebre el Consejo de Administración.</w:t>
+        <w:t xml:space="preserve">De existir hechos relevantes que el Consejo de Administración debe conocer, éste deberá ser presentado por los referidos Comités en la sesión más próxima que celebre el Consejo de Administración.</w:t>
       </w:r>
     </w:p>
     <w:p>
@@ -17219,7 +17219,7 @@
           <w:szCs w:val="24"/>
           <w:u w:val="single"/>
         </w:rPr>
-        <w:t>El Secretario del Comité deberá verificar y dar seguimiento al cumplimiento de los acuerdos adoptados por el Comité.</w:t>
+        <w:t xml:space="preserve">El Secretario del Comité deberá verificar y dar seguimiento al cumplimiento de los acuerdos adoptados por el Comité.</w:t>
       </w:r>
     </w:p>
     <w:p>

</xml_diff>

<commit_message>
Informe Relativo a Comités versión final: COMEDICA de R.L.
Co-Authored-By: Claude Opus 5.5 <noreply@anthropic.com>
Claude-Session: https://claude.ai/code/session_01TjsTNehkj163qWYSaVVmAn
</commit_message>
<xml_diff>
--- a/Informe_Relativo_a_Comites_2024_Version_Final.docx
+++ b/Informe_Relativo_a_Comites_2024_Version_Final.docx
@@ -3437,7 +3437,7 @@
           <w:szCs w:val="24"/>
           <w:u w:val="single"/>
         </w:rPr>
-        <w:t xml:space="preserve">DE R.L.</w:t>
+        <w:t xml:space="preserve">de R.L.</w:t>
       </w:r>
       <w:r>
         <w:rPr>
@@ -3461,7 +3461,7 @@
           <w:szCs w:val="24"/>
           <w:u w:val="single"/>
         </w:rPr>
-        <w:t xml:space="preserve">DE R.L.</w:t>
+        <w:t xml:space="preserve">de R.L.</w:t>
       </w:r>
       <w:r>
         <w:rPr>
@@ -5891,7 +5891,7 @@
           <w:szCs w:val="24"/>
           <w:u w:val="single"/>
         </w:rPr>
-        <w:t xml:space="preserve">DE R.L</w:t>
+        <w:t xml:space="preserve">de R.L</w:t>
       </w:r>
       <w:r>
         <w:rPr>
@@ -6569,7 +6569,7 @@
           <w:u w:val="single"/>
           <w:lang w:val="es-ES_tradnl"/>
         </w:rPr>
-        <w:t xml:space="preserve">DE R.L.</w:t>
+        <w:t xml:space="preserve">de R.L.</w:t>
       </w:r>
       <w:r>
         <w:rPr>
@@ -6591,7 +6591,7 @@
           <w:u w:val="single"/>
           <w:lang w:val="es-ES_tradnl"/>
         </w:rPr>
-        <w:t xml:space="preserve">DE R.L.</w:t>
+        <w:t xml:space="preserve">de R.L.</w:t>
       </w:r>
     </w:p>
     <w:p>
@@ -16546,7 +16546,7 @@
           <w:szCs w:val="24"/>
           <w:u w:val="single"/>
         </w:rPr>
-        <w:t xml:space="preserve">DE R.L.</w:t>
+        <w:t xml:space="preserve">de R.L.</w:t>
       </w:r>
       <w:r>
         <w:rPr>

</xml_diff>